<commit_message>
docs(paper): coloured figures, two recent verified references, wording fixes after triple check
Co-Authored-By: Claude Sonnet 5.5 <noreply@anthropic.com>
</commit_message>
<xml_diff>
--- a/docs/PANIC_ENGINE_paper_IEEE.docx
+++ b/docs/PANIC_ENGINE_paper_IEEE.docx
@@ -263,7 +263,7 @@
           <w:sz w:val="18"/>
           <w:szCs w:val="18"/>
         </w:rPr>
-        <w:t xml:space="preserve">When a sudden threat appears in a populated area, the number of people who get out of danger depends on how early they are warned, how many the warning reaches and which routes they walk. We present Panic Engine, an open agent-based simulator built on open map data, and apply it to the Amrita Vishwa Vidyapeetham campus at Amaravati and the town of Mangalagiri, 4.2 km away. The model is stated mathematically; we derive a lower bound on the number of people caught by a hazard and a formula for the discharge time of a shared route, and check both against the simulator. Four scenarios (bomb drill with a warning time, crowd stress, road closure, partial alert reach) are run on identical crowds with three routing rules and ten random crowds per setting. On the campus the share caught fell from 21.3% at a 60 s warning to 6.5% at 180 s and 0% at 300 s; in Mangalagiri it fell from 6.2% at 30 s to 0.0% at 180 s. Routing changed the number caught by about half a percentage point, but under crowding or a road closure shortest-path routing evacuated only 94.0% (campus) and 79.6% (Mangalagiri) of the crowd in 30 minutes, against 100% for the other rules. With 30% of people holding a phone, 28.1% of the campus crowd moved, and neighbours passing the word raised this to 85.8%. The parameters are assumptions and the model is not calibrated with field data.</w:t>
+        <w:t xml:space="preserve">When a sudden threat appears in a populated area, the number of people who get out of danger depends on how early they are warned, how many the warning reaches and which routes they walk. We present Panic Engine, an open agent-based simulator built on open map data, and apply it to the Amrita Vishwa Vidyapeetham campus at Amaravati and the town of Mangalagiri, 4.2 km away. The model is stated mathematically; we derive a lower bound on the number of people caught by a hazard and a formula for the discharge time of a shared route, and check both against the simulator. Four scenarios (bomb drill with a warning time, crowd stress, road closure, partial alert reach) are run on identical crowds with three routing rules and ten random crowds per setting. On the campus the share caught fell from 21.3% at a 60 s warning to 6.5% at 180 s and 0% at 300 s; in Mangalagiri it fell from 6.2% at 30 s to 0.0% at 180 s. Routing changed the number caught by about half a percentage point, but under crowding shortest-path routing evacuated only 94.0% (campus) and 79.6% (Mangalagiri) of the crowd in 30 minutes, against 100% for the other rules, and a road closure widened the gap. With 30% of people holding a phone, 28.1% of the campus crowd moved, and neighbours passing the word raised this to 85.8%. The parameters are assumptions and the model is not calibrated with field data.</w:t>
       </w:r>
     </w:p>
     <w:p>
@@ -1327,7 +1327,7 @@
           <w:sz w:val="16"/>
           <w:szCs w:val="16"/>
         </w:rPr>
-        <w:t xml:space="preserve">Fig. 1. The two study areas around the bomb. Grey lines are footpaths and roads from OpenStreetMap, the dashed circle is the 525 m alert radius, the grey disc the 150 m blast radius, dots are the start points of the residents and squares the three safe stops.</w:t>
+        <w:t xml:space="preserve">Fig. 1. The two study areas around the bomb. Blue-grey lines are footpaths and roads from OpenStreetMap, the dashed orange circle is the 525 m alert radius, the red disc the 150 m blast radius, blue dots are the start points of the residents and green squares the three safe stops.</w:t>
       </w:r>
     </w:p>
     <w:p>
@@ -8328,7 +8328,7 @@
           <w:sz w:val="20"/>
           <w:szCs w:val="20"/>
         </w:rPr>
-        <w:t xml:space="preserve">We checked that the code does what Section IV says; this is verification, not validation against real events (Section IX). 82 automated tests pass, 120 randomised runs kept every conservation rule and passed nine integrity checks, and the campus drills reproduced exactly when rerun. Table III gives seven formula checks (scripts/verify_model.py).</w:t>
+        <w:t xml:space="preserve">We checked that the code does what Section IV says; this is verification, not validation against real events (Section IX). 82 automated tests pass, the nine integrity checks of the database pass on stored runs, and rerunning the formula checks and the paired statistics reproduced the saved results. Table III gives seven formula checks (scripts/verify_model.py).</w:t>
       </w:r>
     </w:p>
     <w:p>
@@ -14425,7 +14425,7 @@
           <w:sz w:val="20"/>
           <w:szCs w:val="20"/>
         </w:rPr>
-        <w:t xml:space="preserve">The model has not been calibrated or validated against field data: we did not time real walks, observe a drill, or compare the output with another simulator. Verification shows that the code implements the equations, not that the equations describe real people. Capacities, admission rates, reaction delays and congestion constants are assumed (Table II), so absolute numbers should not be quoted as predictions for either place. Agents do not touch each other and a waiting person does not block the road behind, so gridlock is understated; time advances in 5 s steps; the crowd is synthetic (150 to 400 people) and the safe stops are hypothetical; the blast is a circle without shielding and no injury is modelled; people who hear no alert stay put and are counted neither as caught nor as evacuated outside the blast; OpenStreetMap may be incomplete for a new area. We study two places and one hazard type with the bomb at the map centre. Ten crowds give wide intervals for small effects, the intervals assume roughly normal differences, many comparisons are made without correction, and the sensitivity runs have no paired intervals.</w:t>
+        <w:t xml:space="preserve">The model has not been calibrated or validated against field data: we did not time real walks, observe a drill, or compare the output with another simulator. Verification shows that the code implements the equations, not that the equations describe real people. Capacities, admission rates, reaction delays and congestion constants are assumed (Table II), so absolute numbers should not be quoted as predictions for either place. Agents do not touch each other and a waiting person does not block the road behind, so gridlock is understated; time advances in 5 s steps; the crowd is synthetic (150 to 400 people) and the safe stops are hypothetical; the blast is a circle without shielding and no injury is modelled; people who hear no alert stay put and are counted neither as caught nor as evacuated outside the blast; OpenStreetMap may be incomplete for a new area. Our alert is a single time and reach, whereas recent work reviews how communication and social behaviour are modelled in agent-based evacuation [14] and implements the notification procedures of emergency services in a large-scale model [15]. We study two places and one hazard type with the bomb at the map centre. Ten crowds give wide intervals for small effects, the intervals assume roughly normal differences, many comparisons are made without correction, and the sensitivity runs have no paired intervals.</w:t>
       </w:r>
     </w:p>
     <w:p>
@@ -14456,7 +14456,7 @@
           <w:sz w:val="20"/>
           <w:szCs w:val="20"/>
         </w:rPr>
-        <w:t xml:space="preserve">Panic Engine compares warning times, alert reach and routing rules on identical crowds. We formulated the model, derived a lower bound on the people caught and a discharge formula for a shared route, and checked both with the other equations against the simulator. On the Amrita campus and in Mangalagiri, a longer warning removed all simulated deaths, a shorter reaction delay and faster walking reduced them sharply, and the alert reach decided how many people moved at all. The routing rule changed the number caught by about half a point on the campus and by nothing measurable in Mangalagiri, but decided whether a crowd got out in time when roads were loaded or closed. People who walk slowly need earlier help or nearer safe places. Future work includes calibration with timed walks and a drill, a comparison with SUMO or MATSim on the same network, spill-back, the official assembly points and the real population, and a test of alert wording with real students.</w:t>
+        <w:t xml:space="preserve">Panic Engine compares warning times, alert reach and routing rules on identical crowds. We formulated the model, derived a lower bound on the people caught and a discharge formula for a shared route, and checked both with the other equations against the simulator. On the Amrita campus and in Mangalagiri, a longer warning removed the simulated deaths on the campus (300 s) and almost removed them in Mangalagiri (180 s), a shorter reaction delay and faster walking reduced them sharply, and the alert reach decided how many people moved at all. The routing rule changed the number caught by about half a point on the campus and by nothing measurable in Mangalagiri, but decided whether a crowd got out in time when roads were loaded or closed. People who walk slowly need earlier help or nearer safe places. Future work includes calibration with timed walks and a drill, a comparison with SUMO or MATSim on the same network, spill-back, the official assembly points and the real population, and a test of alert wording with real students.</w:t>
       </w:r>
     </w:p>
     <w:p>
@@ -14714,6 +14714,36 @@
           <w:szCs w:val="16"/>
         </w:rPr>
         <w:t xml:space="preserve">[13]  E. Bosina and U. Weidmann, “Estimating pedestrian speed using aggregated literature data,” Physica A: Statistical Mechanics and its Applications, vol. 468, pp. 1–29, 2017, doi: 10.1016/j.physa.2016.09.044.</w:t>
+      </w:r>
+    </w:p>
+    <w:p>
+      <w:pPr>
+        <w:spacing w:after="20" w:line="200"/>
+        <w:ind w:left="300" w:hanging="300"/>
+        <w:jc w:val="both"/>
+      </w:pPr>
+      <w:r>
+        <w:rPr>
+          <w:rFonts w:ascii="Times New Roman" w:cs="Times New Roman" w:eastAsia="Times New Roman" w:hAnsi="Times New Roman"/>
+          <w:sz w:val="16"/>
+          <w:szCs w:val="16"/>
+        </w:rPr>
+        <w:t xml:space="preserve">[14]  A. Templeton, H. Xie, S. Gwynne, A. Hunt, P. Thompson and G. Köster, “Agent-based models of social behaviour and communication in evacuations: A systematic review,” Safety Science, vol. 176, Art. no. 106520, Aug. 2024, doi: 10.1016/j.ssci.2024.106520.</w:t>
+      </w:r>
+    </w:p>
+    <w:p>
+      <w:pPr>
+        <w:spacing w:after="20" w:line="200"/>
+        <w:ind w:left="300" w:hanging="300"/>
+        <w:jc w:val="both"/>
+      </w:pPr>
+      <w:r>
+        <w:rPr>
+          <w:rFonts w:ascii="Times New Roman" w:cs="Times New Roman" w:eastAsia="Times New Roman" w:hAnsi="Times New Roman"/>
+          <w:sz w:val="16"/>
+          <w:szCs w:val="16"/>
+        </w:rPr>
+        <w:t xml:space="preserve">[15]  P. J. Lawrence, L. Filippidis, A. Veeraswamy, D. Blackshields, M. Marzoli and S. Marsella, “Implementing notification strategies in the urbanEXODUS large-scale evacuation model,” Safety Science, vol. 187, Art. no. 106854, Jul. 2025, doi: 10.1016/j.ssci.2025.106854.</w:t>
       </w:r>
     </w:p>
     <w:sectPr>

</xml_diff>

<commit_message>
docs(paper): references restricted to 2020 and later (12 verified sources)
Co-Authored-By: Claude Sonnet 5.5 <noreply@anthropic.com>
</commit_message>
<xml_diff>
--- a/docs/PANIC_ENGINE_paper_IEEE.docx
+++ b/docs/PANIC_ENGINE_paper_IEEE.docx
@@ -389,7 +389,7 @@
           <w:sz w:val="20"/>
           <w:szCs w:val="20"/>
         </w:rPr>
-        <w:t xml:space="preserve">Helbing, Farkas and Vicsek reproduced the movement of a panicking crowd with particles that have a desired speed and repulsive interactions [4]; such force-based models suit a room or a bottleneck. Reviews of building evacuation models, such as that of Kuligowski, Peacock and Hoskins [5], show how many modelling choices exist. At the scale of a campus or a town the limits are the footpath network, the time each path takes to cross and the capacity of safe places, so we model movement on a graph without contact between individuals. Carles et al. studied how warning parameters change tsunami evacuation outcomes [3]; we vary one factor at a time in the same way for a point blast, and add alert channels and routing rules. The Bureau of Public Roads function relates link travel time to the ratio of load to capacity [6]; its constants for road traffic are 0.15 and 4, but footpaths differ, so we treat them as settings and vary them. Wardrop’s principle that travellers choose the cheapest route given what others do underlies congestion-aware routing [7], and routes are found with Dijkstra’s algorithm [8].</w:t>
+        <w:t xml:space="preserve">Detailed models of individual motion in continuous space suit a room or a bottleneck, and recent reviews cover, for example, how social groups change crowd dynamics and how this is modelled [4]. A systematic review of agent-based evacuation models [5] shows how many modelling choices exist. At the scale of a campus or a town the limits are the footpath network, the time each path takes to cross and the capacity of safe places, so we model movement on a graph without contact between individuals. Carles et al. studied how warning parameters change tsunami evacuation outcomes [3]; we vary one factor at a time in the same way for a point blast, and add alert channels and routing rules. The Bureau of Public Roads function relates link travel time to the ratio of load to capacity [6]; its constants for road traffic are 0.15 and 4, but footpaths differ, so we treat them as settings and vary them. Wardrop’s principle that travellers choose the cheapest route given what others do, reviewed in [7], underlies congestion-aware routing, and routes are found with Dijkstra’s algorithm [8].</w:t>
       </w:r>
     </w:p>
     <w:p>
@@ -420,7 +420,7 @@
           <w:sz w:val="20"/>
           <w:szCs w:val="20"/>
         </w:rPr>
-        <w:t xml:space="preserve">Both areas use the OpenStreetMap [9] footpath network, downloaded with OSMnx [10] and held as a directed graph in NetworkX [11]. The first is a 6 km radius around the Amrita campus (16.45606° N, 80.53816° E), the second a 3 km radius around the centre of Mangalagiri (16.43182° N, 80.56881° E); the centres are 4.24 km apart (Eq. 7). Table I gives their size. Mangalagiri has 126 nodes and 26.8 km of directed road per square kilometre, the campus 61 nodes and 14.9 km, so the town is about twice as dense (Fig. 1). A synthetic grid of 80 nodes serves only as a benchmark in the crowd-stress test.</w:t>
+        <w:t xml:space="preserve">Both areas use the OpenStreetMap footpath network, downloaded with OSMnx [9] and held as a directed graph in the NetworkX library. The first is a 6 km radius around the Amrita campus (16.45606° N, 80.53816° E), the second a 3 km radius around the centre of Mangalagiri (16.43182° N, 80.56881° E); the centres are 4.24 km apart (Eq. 7). Table I gives their size. Mangalagiri has 126 nodes and 26.8 km of directed road per square kilometre, the campus 61 nodes and 14.9 km, so the town is about twice as dense (Fig. 1). A synthetic grid of 80 nodes serves only as a benchmark in the crowd-stress test.</w:t>
       </w:r>
     </w:p>
     <w:p>
@@ -7105,7 +7105,7 @@
           <w:sz w:val="20"/>
           <w:szCs w:val="20"/>
         </w:rPr>
-        <w:t xml:space="preserve">Table II lists the parameters. Most are assumptions: OpenStreetMap does not contain path capacities, reaction delays or stop capacities, and we did not measure them. We vary the important ones in Section VIII and do not present absolute results as predictions. The default speed is close to the mean free walking speed of about 1.34 m/s commonly attributed to the review in [12], see also [13]; α and β differ from the road-traffic values [6].</w:t>
+        <w:t xml:space="preserve">Table II lists the parameters. Most are assumptions: OpenStreetMap does not contain path capacities, reaction delays or stop capacities, and we did not measure them. We vary the important ones in Section VIII and do not present absolute results as predictions. Walking speed varies with age, group and crowd density, as a systematic review shows [10], so we vary it from 1.0 to 1.8 m/s around the default; α and β differ from the road-traffic values [6].</w:t>
       </w:r>
     </w:p>
     <w:p>
@@ -14425,7 +14425,7 @@
           <w:sz w:val="20"/>
           <w:szCs w:val="20"/>
         </w:rPr>
-        <w:t xml:space="preserve">The model has not been calibrated or validated against field data: we did not time real walks, observe a drill, or compare the output with another simulator. Verification shows that the code implements the equations, not that the equations describe real people. Capacities, admission rates, reaction delays and congestion constants are assumed (Table II), so absolute numbers should not be quoted as predictions for either place. Agents do not touch each other and a waiting person does not block the road behind, so gridlock is understated; time advances in 5 s steps; the crowd is synthetic (150 to 400 people) and the safe stops are hypothetical; the blast is a circle without shielding and no injury is modelled; people who hear no alert stay put and are counted neither as caught nor as evacuated outside the blast; OpenStreetMap may be incomplete for a new area. Our alert is a single time and reach, whereas recent work reviews how communication and social behaviour are modelled in agent-based evacuation [14] and implements the notification procedures of emergency services in a large-scale model [15]. We study two places and one hazard type with the bomb at the map centre. Ten crowds give wide intervals for small effects, the intervals assume roughly normal differences, many comparisons are made without correction, and the sensitivity runs have no paired intervals.</w:t>
+        <w:t xml:space="preserve">The model has not been calibrated or validated against field data: we did not time real walks, observe a drill, or compare the output with another simulator. Verification shows that the code implements the equations, not that the equations describe real people. Capacities, admission rates, reaction delays and congestion constants are assumed (Table II), so absolute numbers should not be quoted as predictions for either place. Agents do not touch each other and a waiting person does not block the road behind, so gridlock is understated; time advances in 5 s steps; the crowd is synthetic (150 to 400 people) and the safe stops are hypothetical; the blast is a circle without shielding and no injury is modelled; people who hear no alert stay put and are counted neither as caught nor as evacuated outside the blast; OpenStreetMap may be incomplete for a new area [11]. Our alert is a single time and reach, whereas recent work reviews how communication and social behaviour are modelled in agent-based evacuation [5] and implements the notification procedures of emergency services in a large-scale model [12]. We study two places and one hazard type with the bomb at the map centre. Ten crowds give wide intervals for small effects, the intervals assume roughly normal differences, many comparisons are made without correction, and the sensitivity runs have no paired intervals.</w:t>
       </w:r>
     </w:p>
     <w:p>
@@ -14533,7 +14533,7 @@
           <w:sz w:val="16"/>
           <w:szCs w:val="16"/>
         </w:rPr>
-        <w:t xml:space="preserve">[1]  P. Alvarez Lopez et al., “Microscopic traffic simulation using SUMO,” in Proc. 21st IEEE Int. Conf. Intelligent Transportation Systems (ITSC), 2018, pp. 2575–2582, doi: 10.1109/ITSC.2018.8569938.</w:t>
+        <w:t xml:space="preserve">[1]  Y. Chen, S. Y. Shafi and Y.-f. Chen, “Simulation pipeline for traffic evacuation in urban areas and emergency traffic management policy improvements through case studies,” Transportation Research Interdisciplinary Perspectives, vol. 7, Art. no. 100210, Sep. 2020, doi: 10.1016/j.trip.2020.100210.</w:t>
       </w:r>
     </w:p>
     <w:p>
@@ -14548,7 +14548,7 @@
           <w:sz w:val="16"/>
           <w:szCs w:val="16"/>
         </w:rPr>
-        <w:t xml:space="preserve">[2]  A. Horni, K. Nagel and K. W. Axhausen, Eds., The Multi-Agent Transport Simulation MATSim. London, U.K.: Ubiquity Press, 2016, doi: 10.5334/baw.</w:t>
+        <w:t xml:space="preserve">[2]  D. Singh, L. Padgham and K. Nagel, “Using MATSim as a component in dynamic agent-based micro-simulations,” in Engineering Multi-Agent Systems, Lecture Notes in Computer Science. Cham, Switzerland: Springer, 2020, pp. 85–105, doi: 10.1007/978-3-030-51417-4_5.</w:t>
       </w:r>
     </w:p>
     <w:p>
@@ -14578,7 +14578,7 @@
           <w:sz w:val="16"/>
           <w:szCs w:val="16"/>
         </w:rPr>
-        <w:t xml:space="preserve">[4]  D. Helbing, I. Farkas and T. Vicsek, “Simulating dynamical features of escape panic,” Nature, vol. 407, no. 6803, pp. 487–490, Sep. 2000, doi: 10.1038/35035023.</w:t>
+        <w:t xml:space="preserve">[4]  A. Nicolas and F. H. Hassan, “Social groups in pedestrian crowds: Review of their influence on the dynamics and their modelling,” Transportmetrica A: Transport Science, vol. 19, no. 1, Art. no. 1970651, 2023, doi: 10.1080/23249935.2021.1970651.</w:t>
       </w:r>
     </w:p>
     <w:p>
@@ -14593,7 +14593,7 @@
           <w:sz w:val="16"/>
           <w:szCs w:val="16"/>
         </w:rPr>
-        <w:t xml:space="preserve">[5]  E. D. Kuligowski, R. D. Peacock and B. L. Hoskins, “A review of building evacuation models, 2nd edition,” National Institute of Standards and Technology, Gaithersburg, MD, USA, NIST Technical Note 1680, Nov. 2010.</w:t>
+        <w:t xml:space="preserve">[5]  A. Templeton, H. Xie, S. Gwynne, A. Hunt, P. Thompson and G. Köster, “Agent-based models of social behaviour and communication in evacuations: A systematic review,” Safety Science, vol. 176, Art. no. 106520, Aug. 2024, doi: 10.1016/j.ssci.2024.106520.</w:t>
       </w:r>
     </w:p>
     <w:p>
@@ -14608,7 +14608,7 @@
           <w:sz w:val="16"/>
           <w:szCs w:val="16"/>
         </w:rPr>
-        <w:t xml:space="preserve">[6]  Bureau of Public Roads, Traffic Assignment Manual: For Application with a Large, High Speed Computer. Washington, DC, USA: U.S. Department of Commerce, Urban Planning Division, 1964.</w:t>
+        <w:t xml:space="preserve">[6]  N. Gore, S. Arkatkar, G. Joshi and C. Antoniou, “Modified Bureau of Public Roads link function,” Transportation Research Record, vol. 2677, no. 5, pp. 966–990, 2023, doi: 10.1177/03611981221138511.</w:t>
       </w:r>
     </w:p>
     <w:p>
@@ -14623,7 +14623,7 @@
           <w:sz w:val="16"/>
           <w:szCs w:val="16"/>
         </w:rPr>
-        <w:t xml:space="preserve">[7]  J. G. Wardrop, “Road paper. Some theoretical aspects of road traffic research,” Proc. Institution of Civil Engineers, Part II, vol. 1, no. 3, pp. 325–362, 1952.</w:t>
+        <w:t xml:space="preserve">[7]  V. Morandi, “Bridging the user equilibrium and the system optimum in static traffic assignment: A review,” 4OR, vol. 22, no. 1, pp. 89–119, Mar. 2024, doi: 10.1007/s10288-023-00540-w.</w:t>
       </w:r>
     </w:p>
     <w:p>
@@ -14638,7 +14638,7 @@
           <w:sz w:val="16"/>
           <w:szCs w:val="16"/>
         </w:rPr>
-        <w:t xml:space="preserve">[8]  E. W. Dijkstra, “A note on two problems in connexion with graphs,” Numerische Mathematik, vol. 1, pp. 269–271, 1959, doi: 10.1007/BF01386390.</w:t>
+        <w:t xml:space="preserve">[8]  M. Thorup, “Dijkstra’s single source shortest path algorithm,” in Edsger Wybe Dijkstra: His Life, Work, and Legacy, K. R. Apt and T. Hoare, Eds. New York, NY, USA: ACM, 2022, pp. 21–26, doi: 10.1145/3544585.3544589.</w:t>
       </w:r>
     </w:p>
     <w:p>
@@ -14653,7 +14653,7 @@
           <w:sz w:val="16"/>
           <w:szCs w:val="16"/>
         </w:rPr>
-        <w:t xml:space="preserve">[9]  OpenStreetMap contributors, “OpenStreetMap,” OpenStreetMap Foundation. [Online]. Available: https://www.openstreetmap.org</w:t>
+        <w:t xml:space="preserve">[9]  G. Boeing, “Modeling and analyzing urban networks and amenities with OSMnx,” Geographical Analysis, vol. 57, no. 4, pp. 567–577, Oct. 2025, doi: 10.1111/gean.70009.</w:t>
       </w:r>
     </w:p>
     <w:p>
@@ -14668,7 +14668,7 @@
           <w:sz w:val="16"/>
           <w:szCs w:val="16"/>
         </w:rPr>
-        <w:t xml:space="preserve">[10]  G. Boeing, “OSMnx: New methods for acquiring, constructing, analyzing, and visualizing complex street networks,” Computers, Environment and Urban Systems, vol. 65, pp. 126–139, 2017, doi: 10.1016/j.compenvurbsys.2017.05.004.</w:t>
+        <w:t xml:space="preserve">[10]  M. Giannoulaki and Z. Christoforou, “Pedestrian walking speed analysis: A systematic review,” Sustainability, vol. 16, no. 11, Art. no. 4813, Jun. 2024, doi: 10.3390/su16114813.</w:t>
       </w:r>
     </w:p>
     <w:p>
@@ -14683,7 +14683,7 @@
           <w:sz w:val="16"/>
           <w:szCs w:val="16"/>
         </w:rPr>
-        <w:t xml:space="preserve">[11]  A. A. Hagberg, D. A. Schult and P. J. Swart, “Exploring network structure, dynamics, and function using NetworkX,” in Proc. 7th Python in Science Conf. (SciPy), 2008, pp. 11–15.</w:t>
+        <w:t xml:space="preserve">[11]  M. Moradi, S. Roche and M. A. Mostafavi, “Exploring five indicators for the quality of OpenStreetMap road networks: A case study of Québec, Canada,” Geomatica, vol. 75, no. 4, Dec. 2021, doi: 10.1139/geomat-2021-0012.</w:t>
       </w:r>
     </w:p>
     <w:p>
@@ -14698,52 +14698,7 @@
           <w:sz w:val="16"/>
           <w:szCs w:val="16"/>
         </w:rPr>
-        <w:t xml:space="preserve">[12]  U. Weidmann, Transporttechnik der Fussgänger, Schriftenreihe des Instituts für Verkehrsplanung, Transporttechnik, Strassen- und Eisenbahnbau (IVT), no. 90, 2nd ed. Zürich, Switzerland: ETH Zürich, 1993.</w:t>
-      </w:r>
-    </w:p>
-    <w:p>
-      <w:pPr>
-        <w:spacing w:after="20" w:line="200"/>
-        <w:ind w:left="300" w:hanging="300"/>
-        <w:jc w:val="both"/>
-      </w:pPr>
-      <w:r>
-        <w:rPr>
-          <w:rFonts w:ascii="Times New Roman" w:cs="Times New Roman" w:eastAsia="Times New Roman" w:hAnsi="Times New Roman"/>
-          <w:sz w:val="16"/>
-          <w:szCs w:val="16"/>
-        </w:rPr>
-        <w:t xml:space="preserve">[13]  E. Bosina and U. Weidmann, “Estimating pedestrian speed using aggregated literature data,” Physica A: Statistical Mechanics and its Applications, vol. 468, pp. 1–29, 2017, doi: 10.1016/j.physa.2016.09.044.</w:t>
-      </w:r>
-    </w:p>
-    <w:p>
-      <w:pPr>
-        <w:spacing w:after="20" w:line="200"/>
-        <w:ind w:left="300" w:hanging="300"/>
-        <w:jc w:val="both"/>
-      </w:pPr>
-      <w:r>
-        <w:rPr>
-          <w:rFonts w:ascii="Times New Roman" w:cs="Times New Roman" w:eastAsia="Times New Roman" w:hAnsi="Times New Roman"/>
-          <w:sz w:val="16"/>
-          <w:szCs w:val="16"/>
-        </w:rPr>
-        <w:t xml:space="preserve">[14]  A. Templeton, H. Xie, S. Gwynne, A. Hunt, P. Thompson and G. Köster, “Agent-based models of social behaviour and communication in evacuations: A systematic review,” Safety Science, vol. 176, Art. no. 106520, Aug. 2024, doi: 10.1016/j.ssci.2024.106520.</w:t>
-      </w:r>
-    </w:p>
-    <w:p>
-      <w:pPr>
-        <w:spacing w:after="20" w:line="200"/>
-        <w:ind w:left="300" w:hanging="300"/>
-        <w:jc w:val="both"/>
-      </w:pPr>
-      <w:r>
-        <w:rPr>
-          <w:rFonts w:ascii="Times New Roman" w:cs="Times New Roman" w:eastAsia="Times New Roman" w:hAnsi="Times New Roman"/>
-          <w:sz w:val="16"/>
-          <w:szCs w:val="16"/>
-        </w:rPr>
-        <w:t xml:space="preserve">[15]  P. J. Lawrence, L. Filippidis, A. Veeraswamy, D. Blackshields, M. Marzoli and S. Marsella, “Implementing notification strategies in the urbanEXODUS large-scale evacuation model,” Safety Science, vol. 187, Art. no. 106854, Jul. 2025, doi: 10.1016/j.ssci.2025.106854.</w:t>
+        <w:t xml:space="preserve">[12]  P. J. Lawrence, L. Filippidis, A. Veeraswamy, D. Blackshields, M. Marzoli and S. Marsella, “Implementing notification strategies in the urbanEXODUS large-scale evacuation model,” Safety Science, vol. 187, Art. no. 106854, Jul. 2025, doi: 10.1016/j.ssci.2025.106854.</w:t>
       </w:r>
     </w:p>
     <w:sectPr>

</xml_diff>

<commit_message>
docs(paper): plainer wording in abstract and introduction
Co-Authored-By: Claude Sonnet 5.5 <noreply@anthropic.com>
</commit_message>
<xml_diff>
--- a/docs/PANIC_ENGINE_paper_IEEE.docx
+++ b/docs/PANIC_ENGINE_paper_IEEE.docx
@@ -263,7 +263,7 @@
           <w:sz w:val="18"/>
           <w:szCs w:val="18"/>
         </w:rPr>
-        <w:t xml:space="preserve">When a sudden threat appears in a populated area, the number of people who get out of danger depends on how early they are warned, how many the warning reaches and which routes they walk. We present Panic Engine, an open agent-based simulator built on open map data, and apply it to the Amrita Vishwa Vidyapeetham campus at Amaravati and the town of Mangalagiri, 4.2 km away. The model is stated mathematically; we derive a lower bound on the number of people caught by a hazard and a formula for the discharge time of a shared route, and check both against the simulator. Four scenarios (bomb drill with a warning time, crowd stress, road closure, partial alert reach) are run on identical crowds with three routing rules and ten random crowds per setting. On the campus the share caught fell from 21.3% at a 60 s warning to 6.5% at 180 s and 0% at 300 s; in Mangalagiri it fell from 6.2% at 30 s to 0.0% at 180 s. Routing changed the number caught by about half a percentage point, but under crowding shortest-path routing evacuated only 94.0% (campus) and 79.6% (Mangalagiri) of the crowd in 30 minutes, against 100% for the other rules, and a road closure widened the gap. With 30% of people holding a phone, 28.1% of the campus crowd moved, and neighbours passing the word raised this to 85.8%. The parameters are assumptions and the model is not calibrated with field data.</w:t>
+        <w:t xml:space="preserve">How many people get out of danger when a sudden threat appears depends on how early they are warned, how many the warning reaches and which routes they walk. We present Panic Engine, an open agent-based simulator built on open map data, and apply it to the Amrita Vishwa Vidyapeetham campus at Amaravati and the town of Mangalagiri, 4.2 km away. The model is written as equations; we derive a lower bound on the number of people caught by a hazard and a formula for the discharge time of a shared route, and check both against the simulator. Four scenarios (bomb drill with a warning time, crowd stress, road closure, partial alert reach) are run on identical crowds with three routing rules and ten random crowds per setting. On the campus the share caught fell from 21.3% at a 60 s warning to 6.5% at 180 s and 0% at 300 s; in Mangalagiri it fell from 6.2% at 30 s to 0.0% at 180 s. Routing changed the number caught by about half a percentage point, but under crowding shortest-path routing evacuated only 94.0% (campus) and 79.6% (Mangalagiri) of the crowd in 30 minutes, against 100% for the other rules, and a road closure widened the gap. With 30% of people holding a phone, 28.1% of the campus crowd moved, and neighbours passing the word raised this to 85.8%. The parameters are assumptions and the model is not calibrated with field data.</w:t>
       </w:r>
     </w:p>
     <w:p>
@@ -328,7 +328,7 @@
           <w:sz w:val="20"/>
           <w:szCs w:val="20"/>
         </w:rPr>
-        <w:t xml:space="preserve">When a sudden threat appears in a populated area, such as a fire, a flood or a reported explosive device, the time between the first warning and the moment the threat takes effect is short. Three things then decide how many people get out of danger: how early they are warned, how many of them the warning reaches, and which routes they walk. None of these can be tested at full scale without danger and cost, so simulation is the practical way to compare options before a drill is planned.</w:t>
+        <w:t xml:space="preserve">A fire, a flood or a reported explosive device can leave only minutes between the first warning and the moment the threat takes effect. How many people reach safety in that time depends on when they are warned, how many of them hear the warning, and which routes they take. None of this can be tested at full scale without risk and cost, so a simulation is a sensible first step before a drill is planned.</w:t>
       </w:r>
     </w:p>
     <w:p>
@@ -343,7 +343,7 @@
           <w:sz w:val="20"/>
           <w:szCs w:val="20"/>
         </w:rPr>
-        <w:t xml:space="preserve">General traffic simulators such as SUMO [1] and MATSim [2] can represent evacuations, but they are built for vehicle flows and take effort to adapt to one neighbourhood. A campus safety office or a town administration needs a smaller tool that runs on a laptop, uses open map data, stores every run for replay and audit, and lets a non-specialist change one setting and see the result. Panic Engine was written for this purpose. Earlier agent-based work on tsunami evacuation has shown that warning parameters change pedestrian outcomes and that a sensitivity analysis is a good way to study them [3]. We follow the same approach for a point hazard in two places in Andhra Pradesh, India: the Amrita Vishwa Vidyapeetham campus at Amaravati and the town of Mangalagiri, about 4.2 km away. The two differ strongly in road density, so they test whether a conclusion depends on the place.</w:t>
+        <w:t xml:space="preserve">SUMO [1] and MATSim [2] can represent evacuations, but they were built around vehicle flows and need work to fit a single neighbourhood. A campus safety office or a town office would want something lighter: a tool that runs on a laptop, reads open map data, keeps every run for replay and audit, and lets a non-specialist change one setting and see what happens. Panic Engine was written for that. Work on tsunami evacuation found that warning parameters change pedestrian outcomes and used a sensitivity analysis to show it [3]; we take the same approach to a point hazard in two places in Andhra Pradesh, India, the Amrita Vishwa Vidyapeetham campus at Amaravati and the town of Mangalagiri, about 4.2 km away. Their road densities differ strongly, which lets us see whether a conclusion depends on the place.</w:t>
       </w:r>
     </w:p>
     <w:p>
@@ -358,7 +358,7 @@
           <w:sz w:val="20"/>
           <w:szCs w:val="20"/>
         </w:rPr>
-        <w:t xml:space="preserve">The contributions are: (1) a mathematical formulation in which every equation is implemented in the code and checked against it; (2) two analytic results, a lower bound on the people caught by a hazard and a discharge-time formula for a shared route, checked against the simulator; (3) a paired design in which three routing rules run on identical stored crowds, with 95% confidence intervals for the per-crowd differences; (4) four scenarios run on both areas with ten random crowds per setting and a sensitivity study; and (5) an open code base with a dashboard, a 3-D replay and a phone-style alert screen.</w:t>
+        <w:t xml:space="preserve">We make five contributions. (1) The model is written as equations, each implemented in the code and checked against it. (2) Two analytic results, a lower bound on the people caught by a hazard and a discharge time for a shared route, are tested against the simulator. (3) Three routing rules run on identical stored crowds, so differences are paired and come with 95% confidence intervals. (4) Four scenarios run on both areas with ten random crowds per setting, plus a sensitivity study. (5) The code is open and includes a dashboard, a 3-D replay and a phone-style alert screen.</w:t>
       </w:r>
     </w:p>
     <w:p>
@@ -389,7 +389,7 @@
           <w:sz w:val="20"/>
           <w:szCs w:val="20"/>
         </w:rPr>
-        <w:t xml:space="preserve">Detailed models of individual motion in continuous space suit a room or a bottleneck, and recent reviews cover, for example, how social groups change crowd dynamics and how this is modelled [4]. A systematic review of agent-based evacuation models [5] shows how many modelling choices exist. At the scale of a campus or a town the limits are the footpath network, the time each path takes to cross and the capacity of safe places, so we model movement on a graph without contact between individuals. Carles et al. studied how warning parameters change tsunami evacuation outcomes [3]; we vary one factor at a time in the same way for a point blast, and add alert channels and routing rules. The Bureau of Public Roads function relates link travel time to the ratio of load to capacity [6]; its constants for road traffic are 0.15 and 4, but footpaths differ, so we treat them as settings and vary them. Wardrop’s principle that travellers choose the cheapest route given what others do, reviewed in [7], underlies congestion-aware routing, and routes are found with Dijkstra’s algorithm [8].</w:t>
+        <w:t xml:space="preserve">Detailed models of individual motion in continuous space suit a room or a bottleneck, and recent reviews cover, for example, how social groups change crowd dynamics and how this is modelled [4]. A systematic review of agent-based evacuation models [5] shows how many modelling choices exist. At the scale of a campus or a town, what limits people is the footpath network, the time a path takes to cross and the capacity of the safe places, so we model movement on a graph and ignore contact between individuals. Carles et al. studied how warning parameters change tsunami evacuation outcomes [3]; we vary one factor at a time in the same way for a point blast, and add alert channels and routing rules. The Bureau of Public Roads function relates link travel time to the ratio of load to capacity [6]; its constants for road traffic are 0.15 and 4, but footpaths differ, so we treat them as settings and vary them. Wardrop’s principle that travellers choose the cheapest route given what others do, reviewed in [7], underlies congestion-aware routing, and routes are found with Dijkstra’s algorithm [8].</w:t>
       </w:r>
     </w:p>
     <w:p>
@@ -435,7 +435,7 @@
           <w:sz w:val="20"/>
           <w:szCs w:val="20"/>
         </w:rPr>
-        <w:t xml:space="preserve">In each real area a hypothetical drill is set up in the same way. The bomb is placed at the road node nearest the map centre. Residents start at road nodes inside the alert radius from which a safe stop can be reached on foot, thinned to at most 60 start nodes. Three safe stops are chosen by a fixed rule (in each third of the compass, the node whose walking distance from the centre is closest to 1 km, or to 0.6 times the farthest reachable distance if that is smaller). They are hypothetical places, marked as such in the database, and not the official assembly points of either area.</w:t>
+        <w:t xml:space="preserve">The drill is set up the same way in both real areas. The bomb is placed at the road node nearest the map centre. Residents start at road nodes inside the alert radius from which a safe stop can be reached on foot, thinned to at most 60 start nodes. Three safe stops are chosen by a fixed rule (in each third of the compass, the node whose walking distance from the centre is closest to 1 km, or to 0.6 times the farthest reachable distance if that is smaller). They are hypothetical places, marked as such in the database, and not the official assembly points of either area.</w:t>
       </w:r>
     </w:p>
     <w:p>

</xml_diff>

<commit_message>
paper: address review issues (capacity sweep, randomised S2/S3, Holm correction, planning rule, wording)
New runs: path-capacity sweep, many-start stress and closure, relay with spread-out people, stored-crowd sensitivity.
Co-Authored-By: Claude Sonnet 5.5 <noreply@anthropic.com>
</commit_message>
<xml_diff>
--- a/docs/PANIC_ENGINE_paper_IEEE.docx
+++ b/docs/PANIC_ENGINE_paper_IEEE.docx
@@ -13,7 +13,7 @@
           <w:sz w:val="44"/>
           <w:szCs w:val="44"/>
         </w:rPr>
-        <w:t xml:space="preserve">Warning Time, Alert Reach and Route Choice in</w:t>
+        <w:t xml:space="preserve">Panic Engine: Warning Time, Alert Reach and</w:t>
       </w:r>
       <w:r>
         <w:rPr>
@@ -22,16 +22,7 @@
           <w:szCs w:val="44"/>
         </w:rPr>
         <w:br/>
-        <w:t xml:space="preserve">Pedestrian Evacuation: An Agent-Based Simulation</w:t>
-      </w:r>
-      <w:r>
-        <w:rPr>
-          <w:rFonts w:ascii="Times New Roman" w:cs="Times New Roman" w:eastAsia="Times New Roman" w:hAnsi="Times New Roman"/>
-          <w:sz w:val="44"/>
-          <w:szCs w:val="44"/>
-        </w:rPr>
-        <w:br/>
-        <w:t xml:space="preserve">of a University Campus and a Nearby Town</w:t>
+        <w:t xml:space="preserve">Route Choice in Pedestrian Evacuation</w:t>
       </w:r>
     </w:p>
     <w:tbl>
@@ -198,21 +189,6 @@
             <w:r>
               <w:rPr>
                 <w:rFonts w:ascii="Times New Roman" w:cs="Times New Roman" w:eastAsia="Times New Roman" w:hAnsi="Times New Roman"/>
-                <w:i/>
-                <w:iCs/>
-                <w:sz w:val="18"/>
-                <w:szCs w:val="18"/>
-              </w:rPr>
-              <w:t xml:space="preserve">Project Guide</w:t>
-            </w:r>
-          </w:p>
-          <w:p>
-            <w:pPr>
-              <w:jc w:val="center"/>
-            </w:pPr>
-            <w:r>
-              <w:rPr>
-                <w:rFonts w:ascii="Times New Roman" w:cs="Times New Roman" w:eastAsia="Times New Roman" w:hAnsi="Times New Roman"/>
                 <w:sz w:val="17"/>
                 <w:szCs w:val="17"/>
               </w:rPr>
@@ -235,7 +211,7 @@
           <w:sz w:val="18"/>
           <w:szCs w:val="18"/>
         </w:rPr>
-        <w:t xml:space="preserve">Amrita Vishwa Vidyapeetham, Amaravati, India</w:t>
+        <w:t xml:space="preserve">Amrita Vishwa Vidyapeetham, Amaravati, Andhra Pradesh, India</w:t>
       </w:r>
     </w:p>
     <w:p>
@@ -263,7 +239,7 @@
           <w:sz w:val="18"/>
           <w:szCs w:val="18"/>
         </w:rPr>
-        <w:t xml:space="preserve">How many people get out of danger when a sudden threat appears depends on how early they are warned, how many the warning reaches and which routes they walk. We present Panic Engine, an open agent-based simulator built on open map data, and apply it to the Amrita Vishwa Vidyapeetham campus at Amaravati and the town of Mangalagiri, 4.2 km away. The model is written as equations; we derive a lower bound on the number of people caught by a hazard and a formula for the discharge time of a shared route, and check both against the simulator. Four scenarios (bomb drill with a warning time, crowd stress, road closure, partial alert reach) are run on identical crowds with three routing rules and ten random crowds per setting. On the campus the share caught fell from 21.3% at a 60 s warning to 6.5% at 180 s and 0% at 300 s; in Mangalagiri it fell from 6.2% at 30 s to 0.0% at 180 s. Routing changed the number caught by about half a percentage point, but under crowding shortest-path routing evacuated only 94.0% (campus) and 79.6% (Mangalagiri) of the crowd in 30 minutes, against 100% for the other rules, and a road closure widened the gap. With 30% of people holding a phone, 28.1% of the campus crowd moved, and neighbours passing the word raised this to 85.8%. The parameters are assumptions and the model is not calibrated with field data.</w:t>
+        <w:t xml:space="preserve">How many people get out of danger when a sudden threat appears depends on how early they are warned, how many the warning reaches and which routes they walk. We present Panic Engine, an open agent-based simulator built on open map data, and apply it to the Amrita Vishwa Vidyapeetham campus at Amaravati and the town of Mangalagiri, 4.2 km away. The model is written as equations; a lower bound on the people caught by a hazard and a discharge time for a shared route serve as consistency checks of the simulator. Four scenarios (bomb drill with a warning time, crowd stress, road closure, partial alert reach) are run on identical crowds with three routing rules and ten random crowds per setting. On the campus the share caught fell from 21.3% at a 60 s warning to 6.5% at 180 s and 0% at 300 s; in Mangalagiri it fell from 6.2% at 30 s to 0.0% at 180 s, as the lead time needed to leave the blast circle (about 220 s and 140 s) predicts. Routing changed the number caught by about half a percentage point on the campus, which is not significant after correction for multiple comparisons. When everybody starts at one point and paths hold 0.25 persons per metre, shortest-path routing evacuated only 94.0% (campus) and 79.6% (Mangalagiri) of the crowd in 30 minutes, against 100% for the other rules; with 0.5 persons per metre, or with people spread over many start points, every rule evacuated everyone. With 30% of people holding a phone, 28.1% of the campus crowd evacuated, and neighbours passing the word raised this to 85.8%. The parameters are assumptions and the model is not calibrated with field data.</w:t>
       </w:r>
     </w:p>
     <w:p>
@@ -328,7 +304,7 @@
           <w:sz w:val="20"/>
           <w:szCs w:val="20"/>
         </w:rPr>
-        <w:t xml:space="preserve">A fire, a flood or a reported explosive device can leave only minutes between the first warning and the moment the threat takes effect. How many people reach safety in that time depends on when they are warned, how many of them hear the warning, and which routes they take. None of this can be tested at full scale without risk and cost, so a simulation is a sensible first step before a drill is planned.</w:t>
+        <w:t xml:space="preserve">A fire, a flood or a reported explosive device can leave only minutes between the first warning and the moment the threat takes effect. How many people reach safety in that time depends on when they are warned, how many of them hear the warning, and which routes they take. None of this can be tested at full scale, so a simulation is a sensible first step before a drill.</w:t>
       </w:r>
     </w:p>
     <w:p>
@@ -343,7 +319,7 @@
           <w:sz w:val="20"/>
           <w:szCs w:val="20"/>
         </w:rPr>
-        <w:t xml:space="preserve">SUMO [1] and MATSim [2] can represent evacuations, but they were built around vehicle flows and need work to fit a single neighbourhood. A campus safety office or a town office would want something lighter: a tool that runs on a laptop, reads open map data, keeps every run for replay and audit, and lets a non-specialist change one setting and see what happens. Panic Engine was written for that. Work on tsunami evacuation found that warning parameters change pedestrian outcomes and used a sensitivity analysis to show it [3]; we take the same approach to a point hazard in two places in Andhra Pradesh, India, the Amrita Vishwa Vidyapeetham campus at Amaravati and the town of Mangalagiri, about 4.2 km away. Their road densities differ strongly, which lets us see whether a conclusion depends on the place.</w:t>
+        <w:t xml:space="preserve">SUMO [1] and MATSim [2] can represent evacuations, but they were built around vehicle flows and need work to fit a single neighbourhood. A campus safety office or a town office would want something lighter: a tool that runs on a laptop, reads open map data, keeps every run for replay and audit, and lets a non-specialist change one setting and see what happens. Panic Engine was written for that. Work on tsunami evacuation found that warning parameters change pedestrian outcomes and used a sensitivity analysis to show it [3]; we take the same approach to a point hazard in two places in Andhra Pradesh, India, the Amrita Vishwa Vidyapeetham campus at Amaravati and the town of Mangalagiri, about 4.2 km away. The two places differ in road density, in how many residents live inside the blast circle and in how far the safe stops are, so we can see whether a conclusion depends on the place, but not which of these differences causes it. Despite its name, the model has no panic behaviour: people follow planned routes and never push or trample.</w:t>
       </w:r>
     </w:p>
     <w:p>
@@ -358,7 +334,7 @@
           <w:sz w:val="20"/>
           <w:szCs w:val="20"/>
         </w:rPr>
-        <w:t xml:space="preserve">We make five contributions. (1) The model is written as equations, each implemented in the code and checked against it. (2) Two analytic results, a lower bound on the people caught by a hazard and a discharge time for a shared route, are tested against the simulator. (3) Three routing rules run on identical stored crowds, so differences are paired and come with 95% confidence intervals. (4) Four scenarios run on both areas with ten random crowds per setting, plus a sensitivity study. (5) The code is open and includes a dashboard, a 3-D replay and a phone-style alert screen.</w:t>
+        <w:t xml:space="preserve">We make four contributions. (1) The model is written as equations, each implemented in the code and checked against it; two simple results, a lower bound on the people caught and a discharge time for a shared route, serve as consistency checks of the simulator. (2) Three routing rules run on identical stored crowds, so differences are paired and come with 95% confidence intervals. (3) Four scenarios run on both areas with ten random crowds per setting, plus sensitivity runs that show which results depend on assumed values. (4) The code is open and includes a dashboard, a 3-D replay and a phone-style alert screen.</w:t>
       </w:r>
     </w:p>
     <w:p>
@@ -420,7 +396,7 @@
           <w:sz w:val="20"/>
           <w:szCs w:val="20"/>
         </w:rPr>
-        <w:t xml:space="preserve">Both areas use the OpenStreetMap footpath network, downloaded with OSMnx [9] and held as a directed graph in the NetworkX library. The first is a 6 km radius around the Amrita campus (16.45606° N, 80.53816° E), the second a 3 km radius around the centre of Mangalagiri (16.43182° N, 80.56881° E); the centres are 4.24 km apart (Eq. 7). Table I gives their size. Mangalagiri has 126 nodes and 26.8 km of directed road per square kilometre, the campus 61 nodes and 14.9 km, so the town is about twice as dense (Fig. 1). A synthetic grid of 80 nodes serves only as a benchmark in the crowd-stress test.</w:t>
+        <w:t xml:space="preserve">Both areas use the OpenStreetMap footpath network, downloaded with OSMnx [9] and held as a directed graph in the NetworkX library. The first is a 6 km radius around the Amrita campus (16.45606° N, 80.53816° E), the second a 3 km radius around the centre of Mangalagiri (16.43182° N, 80.56881° E); the centres are 4.24 km apart (Eq. 7). Table I gives their size. Over the whole map Mangalagiri has 126 nodes and 26.8 km of directed road per square kilometre and the campus 61 nodes and 14.9 km (Fig. 1). Inside the 525 m alert circle, where the residents live, the figures are 480 nodes/km² and 62.7 km/km² against 43 nodes/km² and 18.0 km/km², so the town is far denser near the bomb. A synthetic grid of 80 nodes serves only as a benchmark in the crowd-stress test.</w:t>
       </w:r>
     </w:p>
     <w:p>
@@ -435,7 +411,7 @@
           <w:sz w:val="20"/>
           <w:szCs w:val="20"/>
         </w:rPr>
-        <w:t xml:space="preserve">The drill is set up the same way in both real areas. The bomb is placed at the road node nearest the map centre. Residents start at road nodes inside the alert radius from which a safe stop can be reached on foot, thinned to at most 60 start nodes. Three safe stops are chosen by a fixed rule (in each third of the compass, the node whose walking distance from the centre is closest to 1 km, or to 0.6 times the farthest reachable distance if that is smaller). They are hypothetical places, marked as such in the database, and not the official assembly points of either area.</w:t>
+        <w:t xml:space="preserve">The drill is set up the same way in both real areas. The bomb is placed at the road node nearest the map centre. Residents start at road nodes inside the alert radius from which a safe stop can be reached on foot, thinned to at most 60 start nodes. Three safe stops are chosen by a fixed rule (in each third of the compass, the node whose walking distance from the centre is closest to 1 km, or to 0.6 times the farthest reachable distance if that is smaller). They are hypothetical places, marked as such in the database, and not the official assembly points of either area. The campus stops lie inside the 525 m alert circle; this is intended, because the circle is the area that receives the alert and a stop only has to lie outside the 150 m blast circle.</w:t>
       </w:r>
     </w:p>
     <w:p>
@@ -1166,7 +1142,7 @@
                 <w:sz w:val="16"/>
                 <w:szCs w:val="16"/>
               </w:rPr>
-              <w:t xml:space="preserve">Bomb to safe stops A, B, C (m)</w:t>
+              <w:t xml:space="preserve">Straight-line distance, bomb to stops A, B, C (m)</w:t>
             </w:r>
           </w:p>
         </w:tc>
@@ -1639,7 +1615,36 @@
           <w:sz w:val="20"/>
           <w:szCs w:val="20"/>
         </w:rPr>
-        <w:t xml:space="preserve"> from 0.3 (steps) to 2.0 (primary roads), with 1.0 for residential roads; a 100 m residential road holds 25 people. With walking speed </w:t>
+        <w:t xml:space="preserve"> from 0.3 (steps) to 2.0 (primary roads), with 1.0 for residential roads; a 100 m residential road holds 25 people. With ρ fixed, the flow a full residential road can pass is ρ</w:t>
+      </w:r>
+      <w:r>
+        <w:rPr>
+          <w:rFonts w:ascii="Times New Roman" w:cs="Times New Roman" w:eastAsia="Times New Roman" w:hAnsi="Times New Roman"/>
+          <w:i/>
+          <w:iCs/>
+          <w:sz w:val="20"/>
+          <w:szCs w:val="20"/>
+        </w:rPr>
+        <w:t xml:space="preserve">w</w:t>
+      </w:r>
+      <w:r>
+        <w:rPr>
+          <w:rFonts w:ascii="Times New Roman" w:cs="Times New Roman" w:eastAsia="Times New Roman" w:hAnsi="Times New Roman"/>
+          <w:i/>
+          <w:iCs/>
+          <w:sz w:val="20"/>
+          <w:szCs w:val="20"/>
+          <w:vertAlign w:val="subscript"/>
+        </w:rPr>
+        <w:t xml:space="preserve">c</w:t>
+      </w:r>
+      <w:r>
+        <w:rPr>
+          <w:rFonts w:ascii="Times New Roman" w:cs="Times New Roman" w:eastAsia="Times New Roman" w:hAnsi="Times New Roman"/>
+          <w:sz w:val="20"/>
+          <w:szCs w:val="20"/>
+        </w:rPr>
+        <w:t xml:space="preserve">v/(1 + α) = 0.22 persons per second whatever its length (Property 4), which is probably below what real footpaths carry, so Section VIII-C varies ρ. With walking speed </w:t>
       </w:r>
       <w:r>
         <w:rPr>
@@ -2942,7 +2947,7 @@
           <w:sz w:val="20"/>
           <w:szCs w:val="20"/>
         </w:rPr>
-        <w:t xml:space="preserve"> seconds later,</w:t>
+        <w:t xml:space="preserve"> seconds later (people stand on their start node, so those on one node are 0 m apart, except in the spread-out run of Section VIII-D),</w:t>
       </w:r>
     </w:p>
     <w:p>
@@ -3693,7 +3698,7 @@
           <w:sz w:val="20"/>
           <w:szCs w:val="20"/>
         </w:rPr>
-        <w:t xml:space="preserve">; the people caught, who are the only “simulated deaths” (no injury is modelled), are</w:t>
+        <w:t xml:space="preserve">; the people caught (no injury is modelled, so this is the only harm we count) are</w:t>
       </w:r>
     </w:p>
     <w:p>
@@ -5713,7 +5718,7 @@
           <w:sz w:val="20"/>
           <w:szCs w:val="20"/>
         </w:rPr>
-        <w:t xml:space="preserve"> the least free-flow time, Eq. (3) gives </w:t>
+        <w:t xml:space="preserve"> the least free-flow time and </w:t>
       </w:r>
       <w:r>
         <w:rPr>
@@ -5752,7 +5757,67 @@
           <w:sz w:val="20"/>
           <w:szCs w:val="20"/>
         </w:rPr>
-        <w:t xml:space="preserve">, so a person admitted to stop </w:t>
+        <w:t xml:space="preserve">, Eq. (3) gives </w:t>
+      </w:r>
+      <w:r>
+        <w:rPr>
+          <w:rFonts w:ascii="Times New Roman" w:cs="Times New Roman" w:eastAsia="Times New Roman" w:hAnsi="Times New Roman"/>
+          <w:i/>
+          <w:iCs/>
+          <w:sz w:val="20"/>
+          <w:szCs w:val="20"/>
+        </w:rPr>
+        <w:t xml:space="preserve">t</w:t>
+      </w:r>
+      <w:r>
+        <w:rPr>
+          <w:rFonts w:ascii="Times New Roman" w:cs="Times New Roman" w:eastAsia="Times New Roman" w:hAnsi="Times New Roman"/>
+          <w:i/>
+          <w:iCs/>
+          <w:sz w:val="20"/>
+          <w:szCs w:val="20"/>
+          <w:vertAlign w:val="subscript"/>
+        </w:rPr>
+        <w:t xml:space="preserve">e</w:t>
+      </w:r>
+      <w:r>
+        <w:rPr>
+          <w:rFonts w:ascii="Times New Roman" w:cs="Times New Roman" w:eastAsia="Times New Roman" w:hAnsi="Times New Roman"/>
+          <w:i/>
+          <w:iCs/>
+          <w:sz w:val="20"/>
+          <w:szCs w:val="20"/>
+        </w:rPr>
+        <w:t xml:space="preserve"> ≥ </w:t>
+      </w:r>
+      <w:r>
+        <w:rPr>
+          <w:rFonts w:ascii="Times New Roman" w:cs="Times New Roman" w:eastAsia="Times New Roman" w:hAnsi="Times New Roman"/>
+          <w:i/>
+          <w:iCs/>
+          <w:sz w:val="20"/>
+          <w:szCs w:val="20"/>
+        </w:rPr>
+        <w:t xml:space="preserve">t</w:t>
+      </w:r>
+      <w:r>
+        <w:rPr>
+          <w:rFonts w:ascii="Times New Roman" w:cs="Times New Roman" w:eastAsia="Times New Roman" w:hAnsi="Times New Roman"/>
+          <w:i/>
+          <w:iCs/>
+          <w:sz w:val="20"/>
+          <w:szCs w:val="20"/>
+          <w:vertAlign w:val="subscript"/>
+        </w:rPr>
+        <w:t xml:space="preserve">e</w:t>
+      </w:r>
+      <w:r>
+        <w:rPr>
+          <w:rFonts w:ascii="Times New Roman" w:cs="Times New Roman" w:eastAsia="Times New Roman" w:hAnsi="Times New Roman"/>
+          <w:sz w:val="20"/>
+          <w:szCs w:val="20"/>
+        </w:rPr>
+        <w:t xml:space="preserve">⁰, so a person admitted to stop </w:t>
       </w:r>
       <w:r>
         <w:rPr>
@@ -6163,7 +6228,97 @@
           <w:sz w:val="20"/>
           <w:szCs w:val="20"/>
         </w:rPr>
-        <w:t xml:space="preserve">For uniform delays a person starting at </w:t>
+        <w:t xml:space="preserve">The bound is zero once </w:t>
+      </w:r>
+      <w:r>
+        <w:rPr>
+          <w:rFonts w:ascii="Times New Roman" w:cs="Times New Roman" w:eastAsia="Times New Roman" w:hAnsi="Times New Roman"/>
+          <w:i/>
+          <w:iCs/>
+          <w:sz w:val="20"/>
+          <w:szCs w:val="20"/>
+        </w:rPr>
+        <w:t xml:space="preserve">λ ≥ λ* = </w:t>
+      </w:r>
+      <w:r>
+        <w:rPr>
+          <w:rFonts w:ascii="Times New Roman" w:cs="Times New Roman" w:eastAsia="Times New Roman" w:hAnsi="Times New Roman"/>
+          <w:i/>
+          <w:iCs/>
+          <w:sz w:val="20"/>
+          <w:szCs w:val="20"/>
+        </w:rPr>
+        <w:t xml:space="preserve">δ</w:t>
+      </w:r>
+      <w:r>
+        <w:rPr>
+          <w:rFonts w:ascii="Times New Roman" w:cs="Times New Roman" w:eastAsia="Times New Roman" w:hAnsi="Times New Roman"/>
+          <w:i/>
+          <w:iCs/>
+          <w:sz w:val="20"/>
+          <w:szCs w:val="20"/>
+          <w:vertAlign w:val="subscript"/>
+        </w:rPr>
+        <w:t xml:space="preserve">max</w:t>
+      </w:r>
+      <w:r>
+        <w:rPr>
+          <w:rFonts w:ascii="Times New Roman" w:cs="Times New Roman" w:eastAsia="Times New Roman" w:hAnsi="Times New Roman"/>
+          <w:i/>
+          <w:iCs/>
+          <w:sz w:val="20"/>
+          <w:szCs w:val="20"/>
+        </w:rPr>
+        <w:t xml:space="preserve"> + max </w:t>
+      </w:r>
+      <w:r>
+        <w:rPr>
+          <w:rFonts w:ascii="Times New Roman" w:cs="Times New Roman" w:eastAsia="Times New Roman" w:hAnsi="Times New Roman"/>
+          <w:i/>
+          <w:iCs/>
+          <w:sz w:val="20"/>
+          <w:szCs w:val="20"/>
+        </w:rPr>
+        <w:t xml:space="preserve">T</w:t>
+      </w:r>
+      <w:r>
+        <w:rPr>
+          <w:rFonts w:ascii="Times New Roman" w:cs="Times New Roman" w:eastAsia="Times New Roman" w:hAnsi="Times New Roman"/>
+          <w:i/>
+          <w:iCs/>
+          <w:sz w:val="20"/>
+          <w:szCs w:val="20"/>
+          <w:vertAlign w:val="subscript"/>
+        </w:rPr>
+        <w:t xml:space="preserve">o</w:t>
+      </w:r>
+      <w:r>
+        <w:rPr>
+          <w:rFonts w:ascii="Times New Roman" w:cs="Times New Roman" w:eastAsia="Times New Roman" w:hAnsi="Times New Roman"/>
+          <w:i/>
+          <w:iCs/>
+          <w:sz w:val="20"/>
+          <w:szCs w:val="20"/>
+        </w:rPr>
+        <w:t xml:space="preserve"> over </w:t>
+      </w:r>
+      <w:r>
+        <w:rPr>
+          <w:rFonts w:ascii="Times New Roman" w:cs="Times New Roman" w:eastAsia="Times New Roman" w:hAnsi="Times New Roman"/>
+          <w:i/>
+          <w:iCs/>
+          <w:sz w:val="20"/>
+          <w:szCs w:val="20"/>
+        </w:rPr>
+        <w:t xml:space="preserve">o ∈ O ∩ B</w:t>
+      </w:r>
+      <w:r>
+        <w:rPr>
+          <w:rFonts w:ascii="Times New Roman" w:cs="Times New Roman" w:eastAsia="Times New Roman" w:hAnsi="Times New Roman"/>
+          <w:sz w:val="20"/>
+          <w:szCs w:val="20"/>
+        </w:rPr>
+        <w:t xml:space="preserve">, the planning lead time. For uniform delays a person starting at </w:t>
       </w:r>
       <w:r>
         <w:rPr>
@@ -7018,7 +7173,7 @@
           <w:sz w:val="20"/>
           <w:szCs w:val="20"/>
         </w:rPr>
-        <w:t xml:space="preserve">no hazard; all people (300 on the grid) leave the single start point together and the run stops at 1800 s. </w:t>
+        <w:t xml:space="preserve">no hazard; all people (300 on the grid) start at the single start point, set off after their reaction delay and the run stops at 1800 s. </w:t>
       </w:r>
       <w:r>
         <w:rPr>
@@ -7036,7 +7191,7 @@
           <w:sz w:val="20"/>
           <w:szCs w:val="20"/>
         </w:rPr>
-        <w:t xml:space="preserve">as S2, but a 150 m danger zone centred on the middle of the free-flow shortest route to the nearest stop closes its roads at 300 s; people on a closed road finish it. </w:t>
+        <w:t xml:space="preserve">as S2, but a 150 m danger zone centred on the middle of the free-flow shortest route to the nearest stop closes its roads at 300 s; people on a closed road finish it. S2 and S3 are deterministic for shortest path, so we add S2′ and S3′ with the crowd spread over the 37 or 60 start nodes of the drill and, in S3′, the closure on the route from a randomly drawn start node (the same for every rule). We also vary the path capacity ρ in S2. </w:t>
       </w:r>
       <w:r>
         <w:rPr>
@@ -7380,7 +7535,7 @@
                 <w:sz w:val="16"/>
                 <w:szCs w:val="16"/>
               </w:rPr>
-              <w:t xml:space="preserve">0.25 persons/m; 0.3 to 2.0</w:t>
+              <w:t xml:space="preserve">0.25/m (0.5 to 2); 0.3 to 2.0</w:t>
             </w:r>
           </w:p>
         </w:tc>
@@ -8229,7 +8384,7 @@
           <w:sz w:val="20"/>
           <w:szCs w:val="20"/>
         </w:rPr>
-        <w:t xml:space="preserve">Panic Engine is written in Python. A scenario builder sets the start points, stops, hazard, closures and alert channels, and a seeded generator draws the crowd and stores it. The timestep engine of Section IV writes every event and position snapshot to an SQLite database (eighteen tables with foreign keys and CHECK constraints), and the Streamlit dashboard, the replay and all result tables read from it. The dashboard has quick controls (routing rule, walking speed, RUN, COMPARE ALL 3, PHONE) and a sidebar for the bomb, alert channels and crowd (Fig. 2a). The deck.gl replay (Fig. 2b–d) draws the alert and blast areas, every person and extruded buildings from 21,250 cached OpenStreetMap footprints, which cover 99% of the Mangalagiri road nodes. A phone-style screen shows what one tracked person sees, and that person can be taken over to choose destination and speed. Analytics, Strategies and SQL tabs report each run and run nine integrity checks.</w:t>
+        <w:t xml:space="preserve">Panic Engine is written in Python. A scenario builder sets the start points, stops, hazard, closures and alert channels, and a seeded generator draws and stores the crowd. The engine of Section IV writes every run to an SQLite database, which the dashboard, the replay and the result tables read. The dashboard has quick controls (routing rule, walking speed, RUN, COMPARE ALL 3, PHONE) and a sidebar for the bomb, alert channels and crowd (Fig. 2a). The deck.gl replay (Fig. 2b–d) draws the alert and blast areas, every person and extruded buildings from 21,250 cached OpenStreetMap footprints, which cover 99% of the Mangalagiri road nodes. A phone-style screen shows what one tracked person sees.</w:t>
       </w:r>
     </w:p>
     <w:p>
@@ -8241,7 +8396,7 @@
       <w:r>
         <w:drawing>
           <wp:inline distT="0" distB="0" distL="0" distR="0">
-            <wp:extent cx="6400800" cy="2562225"/>
+            <wp:extent cx="5667375" cy="2266950"/>
             <wp:effectExtent t="0" r="0" b="0" l="0"/>
             <wp:docPr id="2" name="fig2" descr="Dashboard quick controls and three moments of the 3-D replay" title="fig2"/>
             <wp:cNvGraphicFramePr>
@@ -8266,7 +8421,7 @@
                   <pic:spPr bwMode="auto">
                     <a:xfrm>
                       <a:off x="0" y="0"/>
-                      <a:ext cx="6400800" cy="2562225"/>
+                      <a:ext cx="5667375" cy="2266950"/>
                     </a:xfrm>
                     <a:prstGeom prst="rect">
                       <a:avLst/>
@@ -8328,7 +8483,7 @@
           <w:sz w:val="20"/>
           <w:szCs w:val="20"/>
         </w:rPr>
-        <w:t xml:space="preserve">We checked that the code does what Section IV says; this is verification, not validation against real events (Section IX). 82 automated tests pass, the nine integrity checks of the database pass on stored runs, and rerunning the formula checks and the paired statistics reproduced the saved results. Table III gives seven formula checks (scripts/verify_model.py).</w:t>
+        <w:t xml:space="preserve">We checked that the code does what Section IV says; this is verification, not validation against real events (Section IX). 82 automated tests pass, and rerunning the formula checks and the paired statistics reproduced the saved results. Table III gives seven formula checks (scripts/verify_model.py).</w:t>
       </w:r>
     </w:p>
     <w:p>
@@ -8994,7 +9149,7 @@
           <w:sz w:val="20"/>
           <w:szCs w:val="20"/>
         </w:rPr>
-        <w:t xml:space="preserve">The blast bound is a bound, not an estimate: it ignores crowding and detours, so the simulator catches more, and that it never catches fewer (63 of 63 runs) is the check. The discharge formula is close for the median but over-predicts the share of the campus crowd evacuated in 30 minutes (99.7% against 94.0%), because the other roads and the stop gate also hold people back.</w:t>
+        <w:t xml:space="preserve">The blast bound ignores crowding and detours, so the simulator catches more, and that it never catches fewer (63 of 63 runs) is the check. The discharge formula is close for the median but over-predicts the share of the campus crowd evacuated in 30 minutes (99.7% against 94.0%), because the other roads and the stop gate also hold people back.</w:t>
       </w:r>
     </w:p>
     <w:p>
@@ -9137,39 +9292,208 @@
           <w:sz w:val="20"/>
           <w:szCs w:val="20"/>
         </w:rPr>
-        <w:t xml:space="preserve">% at 180 s. The most that can be caught is the share of residents who start inside the blast circle, 9 of 37 start nodes (24.3%) on the campus and 4 of 60 (6.7%) in Mangalagiri, and at the shortest lead times nearly all of them are caught. The campus is also slower to clear: the expected bound of Eq. (20) is </w:t>
-      </w:r>
-      <w:r>
-        <w:rPr>
-          <w:rFonts w:ascii="Times New Roman" w:cs="Times New Roman" w:eastAsia="Times New Roman" w:hAnsi="Times New Roman"/>
-          <w:sz w:val="20"/>
-          <w:szCs w:val="20"/>
-        </w:rPr>
-        <w:t xml:space="preserve">3.1</w:t>
-      </w:r>
-      <w:r>
-        <w:rPr>
-          <w:rFonts w:ascii="Times New Roman" w:cs="Times New Roman" w:eastAsia="Times New Roman" w:hAnsi="Times New Roman"/>
-          <w:sz w:val="20"/>
-          <w:szCs w:val="20"/>
-        </w:rPr>
-        <w:t xml:space="preserve"> people at 180 s against </w:t>
-      </w:r>
-      <w:r>
-        <w:rPr>
-          <w:rFonts w:ascii="Times New Roman" w:cs="Times New Roman" w:eastAsia="Times New Roman" w:hAnsi="Times New Roman"/>
-          <w:sz w:val="20"/>
-          <w:szCs w:val="20"/>
-        </w:rPr>
-        <w:t xml:space="preserve">0.0</w:t>
-      </w:r>
-      <w:r>
-        <w:rPr>
-          <w:rFonts w:ascii="Times New Roman" w:cs="Times New Roman" w:eastAsia="Times New Roman" w:hAnsi="Times New Roman"/>
-          <w:sz w:val="20"/>
-          <w:szCs w:val="20"/>
-        </w:rPr>
-        <w:t xml:space="preserve"> in Mangalagiri. Nobody in Mangalagiri reaches a stop before the strike, because the stops are 731 to 789 m away, whereas on the campus </w:t>
+        <w:t xml:space="preserve">% at 180 s. The most that can be caught is the share of residents who start inside the blast circle, 9 of 37 start nodes (24.3%) on the campus and 4 of 60 (6.7%) in Mangalagiri. Measured against these shares, the campus catches </w:t>
+      </w:r>
+      <w:r>
+        <w:rPr>
+          <w:rFonts w:ascii="Times New Roman" w:cs="Times New Roman" w:eastAsia="Times New Roman" w:hAnsi="Times New Roman"/>
+          <w:sz w:val="20"/>
+          <w:szCs w:val="20"/>
+        </w:rPr>
+        <w:t xml:space="preserve">87</w:t>
+      </w:r>
+      <w:r>
+        <w:rPr>
+          <w:rFonts w:ascii="Times New Roman" w:cs="Times New Roman" w:eastAsia="Times New Roman" w:hAnsi="Times New Roman"/>
+          <w:sz w:val="20"/>
+          <w:szCs w:val="20"/>
+        </w:rPr>
+        <w:t xml:space="preserve">% of them at 60 s and </w:t>
+      </w:r>
+      <w:r>
+        <w:rPr>
+          <w:rFonts w:ascii="Times New Roman" w:cs="Times New Roman" w:eastAsia="Times New Roman" w:hAnsi="Times New Roman"/>
+          <w:sz w:val="20"/>
+          <w:szCs w:val="20"/>
+        </w:rPr>
+        <w:t xml:space="preserve">27</w:t>
+      </w:r>
+      <w:r>
+        <w:rPr>
+          <w:rFonts w:ascii="Times New Roman" w:cs="Times New Roman" w:eastAsia="Times New Roman" w:hAnsi="Times New Roman"/>
+          <w:sz w:val="20"/>
+          <w:szCs w:val="20"/>
+        </w:rPr>
+        <w:t xml:space="preserve">% at 180 s, and Mangalagiri </w:t>
+      </w:r>
+      <w:r>
+        <w:rPr>
+          <w:rFonts w:ascii="Times New Roman" w:cs="Times New Roman" w:eastAsia="Times New Roman" w:hAnsi="Times New Roman"/>
+          <w:sz w:val="20"/>
+          <w:szCs w:val="20"/>
+        </w:rPr>
+        <w:t xml:space="preserve">94</w:t>
+      </w:r>
+      <w:r>
+        <w:rPr>
+          <w:rFonts w:ascii="Times New Roman" w:cs="Times New Roman" w:eastAsia="Times New Roman" w:hAnsi="Times New Roman"/>
+          <w:sz w:val="20"/>
+          <w:szCs w:val="20"/>
+        </w:rPr>
+        <w:t xml:space="preserve">% at 30 s.</w:t>
+      </w:r>
+    </w:p>
+    <w:p>
+      <w:pPr>
+        <w:spacing w:after="60" w:before="0" w:line="228"/>
+        <w:ind w:firstLine="245"/>
+        <w:jc w:val="both"/>
+      </w:pPr>
+      <w:r>
+        <w:rPr>
+          <w:rFonts w:ascii="Times New Roman" w:cs="Times New Roman" w:eastAsia="Times New Roman" w:hAnsi="Times New Roman"/>
+          <w:sz w:val="20"/>
+          <w:szCs w:val="20"/>
+        </w:rPr>
+        <w:t xml:space="preserve">This result is largely fixed by two assumed values. By Eq. (19) the lower bound is zero once </w:t>
+      </w:r>
+      <w:r>
+        <w:rPr>
+          <w:rFonts w:ascii="Times New Roman" w:cs="Times New Roman" w:eastAsia="Times New Roman" w:hAnsi="Times New Roman"/>
+          <w:i/>
+          <w:iCs/>
+          <w:sz w:val="20"/>
+          <w:szCs w:val="20"/>
+        </w:rPr>
+        <w:t xml:space="preserve">λ ≥ λ* = </w:t>
+      </w:r>
+      <w:r>
+        <w:rPr>
+          <w:rFonts w:ascii="Times New Roman" w:cs="Times New Roman" w:eastAsia="Times New Roman" w:hAnsi="Times New Roman"/>
+          <w:i/>
+          <w:iCs/>
+          <w:sz w:val="20"/>
+          <w:szCs w:val="20"/>
+        </w:rPr>
+        <w:t xml:space="preserve">δ</w:t>
+      </w:r>
+      <w:r>
+        <w:rPr>
+          <w:rFonts w:ascii="Times New Roman" w:cs="Times New Roman" w:eastAsia="Times New Roman" w:hAnsi="Times New Roman"/>
+          <w:i/>
+          <w:iCs/>
+          <w:sz w:val="20"/>
+          <w:szCs w:val="20"/>
+          <w:vertAlign w:val="subscript"/>
+        </w:rPr>
+        <w:t xml:space="preserve">max</w:t>
+      </w:r>
+      <w:r>
+        <w:rPr>
+          <w:rFonts w:ascii="Times New Roman" w:cs="Times New Roman" w:eastAsia="Times New Roman" w:hAnsi="Times New Roman"/>
+          <w:i/>
+          <w:iCs/>
+          <w:sz w:val="20"/>
+          <w:szCs w:val="20"/>
+        </w:rPr>
+        <w:t xml:space="preserve"> + max </w:t>
+      </w:r>
+      <w:r>
+        <w:rPr>
+          <w:rFonts w:ascii="Times New Roman" w:cs="Times New Roman" w:eastAsia="Times New Roman" w:hAnsi="Times New Roman"/>
+          <w:i/>
+          <w:iCs/>
+          <w:sz w:val="20"/>
+          <w:szCs w:val="20"/>
+        </w:rPr>
+        <w:t xml:space="preserve">T</w:t>
+      </w:r>
+      <w:r>
+        <w:rPr>
+          <w:rFonts w:ascii="Times New Roman" w:cs="Times New Roman" w:eastAsia="Times New Roman" w:hAnsi="Times New Roman"/>
+          <w:i/>
+          <w:iCs/>
+          <w:sz w:val="20"/>
+          <w:szCs w:val="20"/>
+          <w:vertAlign w:val="subscript"/>
+        </w:rPr>
+        <w:t xml:space="preserve">o</w:t>
+      </w:r>
+      <w:r>
+        <w:rPr>
+          <w:rFonts w:ascii="Times New Roman" w:cs="Times New Roman" w:eastAsia="Times New Roman" w:hAnsi="Times New Roman"/>
+          <w:sz w:val="20"/>
+          <w:szCs w:val="20"/>
+        </w:rPr>
+        <w:t xml:space="preserve">, the longest reaction delay plus the longest time to walk out of the blast circle; </w:t>
+      </w:r>
+      <w:r>
+        <w:rPr>
+          <w:rFonts w:ascii="Times New Roman" w:cs="Times New Roman" w:eastAsia="Times New Roman" w:hAnsi="Times New Roman"/>
+          <w:i/>
+          <w:iCs/>
+          <w:sz w:val="20"/>
+          <w:szCs w:val="20"/>
+        </w:rPr>
+        <w:t xml:space="preserve">λ*</w:t>
+      </w:r>
+      <w:r>
+        <w:rPr>
+          <w:rFonts w:ascii="Times New Roman" w:cs="Times New Roman" w:eastAsia="Times New Roman" w:hAnsi="Times New Roman"/>
+          <w:sz w:val="20"/>
+          <w:szCs w:val="20"/>
+        </w:rPr>
+        <w:t xml:space="preserve"> is </w:t>
+      </w:r>
+      <w:r>
+        <w:rPr>
+          <w:rFonts w:ascii="Times New Roman" w:cs="Times New Roman" w:eastAsia="Times New Roman" w:hAnsi="Times New Roman"/>
+          <w:sz w:val="20"/>
+          <w:szCs w:val="20"/>
+        </w:rPr>
+        <w:t xml:space="preserve">222</w:t>
+      </w:r>
+      <w:r>
+        <w:rPr>
+          <w:rFonts w:ascii="Times New Roman" w:cs="Times New Roman" w:eastAsia="Times New Roman" w:hAnsi="Times New Roman"/>
+          <w:sz w:val="20"/>
+          <w:szCs w:val="20"/>
+        </w:rPr>
+        <w:t xml:space="preserve"> s on the campus and </w:t>
+      </w:r>
+      <w:r>
+        <w:rPr>
+          <w:rFonts w:ascii="Times New Roman" w:cs="Times New Roman" w:eastAsia="Times New Roman" w:hAnsi="Times New Roman"/>
+          <w:sz w:val="20"/>
+          <w:szCs w:val="20"/>
+        </w:rPr>
+        <w:t xml:space="preserve">137</w:t>
+      </w:r>
+      <w:r>
+        <w:rPr>
+          <w:rFonts w:ascii="Times New Roman" w:cs="Times New Roman" w:eastAsia="Times New Roman" w:hAnsi="Times New Roman"/>
+          <w:sz w:val="20"/>
+          <w:szCs w:val="20"/>
+        </w:rPr>
+        <w:t xml:space="preserve"> s in Mangalagiri. The simulated shares follow this: nobody is caught at 300 s on the campus, and only 0.04% (one person in one crowd) at 180 s in Mangalagiri, where crowding and detours still catch a few above </w:t>
+      </w:r>
+      <w:r>
+        <w:rPr>
+          <w:rFonts w:ascii="Times New Roman" w:cs="Times New Roman" w:eastAsia="Times New Roman" w:hAnsi="Times New Roman"/>
+          <w:i/>
+          <w:iCs/>
+          <w:sz w:val="20"/>
+          <w:szCs w:val="20"/>
+        </w:rPr>
+        <w:t xml:space="preserve">λ*</w:t>
+      </w:r>
+      <w:r>
+        <w:rPr>
+          <w:rFonts w:ascii="Times New Roman" w:cs="Times New Roman" w:eastAsia="Times New Roman" w:hAnsi="Times New Roman"/>
+          <w:sz w:val="20"/>
+          <w:szCs w:val="20"/>
+        </w:rPr>
+        <w:t xml:space="preserve">. The simulator thus confirms a planning rule more than it adds to it. Nobody in Mangalagiri reaches a stop before the strike, because the stops are 731 to 789 m away, whereas on the campus </w:t>
       </w:r>
       <w:r>
         <w:rPr>
@@ -9233,7 +9557,7 @@
           <w:sz w:val="20"/>
           <w:szCs w:val="20"/>
         </w:rPr>
-        <w:t xml:space="preserve">% are safe at 60, 180, 300 and 400 s; these shares are the same for all rules.</w:t>
+        <w:t xml:space="preserve">% are safe at 60, 180, 300 and 400 s; these shares are the same for all rules. The areas differ in several ways at once (Table I), so these comparisons are descriptive.</w:t>
       </w:r>
     </w:p>
     <w:p>
@@ -10726,7 +11050,7 @@
       <w:r>
         <w:drawing>
           <wp:inline distT="0" distB="0" distL="0" distR="0">
-            <wp:extent cx="3105150" cy="2105025"/>
+            <wp:extent cx="2838450" cy="1924050"/>
             <wp:effectExtent t="0" r="0" b="0" l="0"/>
             <wp:docPr id="3" name="fig3" descr="People caught against warning lead time on the campus and in Mangalagiri" title="fig3"/>
             <wp:cNvGraphicFramePr>
@@ -10751,7 +11075,7 @@
                   <pic:spPr bwMode="auto">
                     <a:xfrm>
                       <a:off x="0" y="0"/>
-                      <a:ext cx="3105150" cy="2105025"/>
+                      <a:ext cx="2838450" cy="1924050"/>
                     </a:xfrm>
                     <a:prstGeom prst="rect">
                       <a:avLst/>
@@ -10806,7 +11130,7 @@
           <w:sz w:val="20"/>
           <w:szCs w:val="20"/>
         </w:rPr>
-        <w:t xml:space="preserve">The rules run on the same crowds, so we compare them by paired differences (Eq. 17). On the campus shortest path caught </w:t>
+        <w:t xml:space="preserve">The rules run on the same crowds, so we compare them by paired differences (Eq. 17). These comparisons are exploratory. On the campus shortest path caught </w:t>
       </w:r>
       <w:r>
         <w:rPr>
@@ -10822,7 +11146,7 @@
           <w:sz w:val="20"/>
           <w:szCs w:val="20"/>
         </w:rPr>
-        <w:t xml:space="preserve"> percentage points more people than congestion-aware routing at a 60 s lead (mean difference and 95% interval; more in 8 of 10 crowds, fewer in none) and </w:t>
+        <w:t xml:space="preserve"> percentage points more people than congestion-aware routing at a 60 s lead (mean difference and unadjusted 95% interval; more in 8 of 10 crowds, fewer in none) and </w:t>
       </w:r>
       <w:r>
         <w:rPr>
@@ -10854,7 +11178,39 @@
           <w:sz w:val="20"/>
           <w:szCs w:val="20"/>
         </w:rPr>
-        <w:t xml:space="preserve"> people of 250. The standard deviation across crowds, about four points, would hide this; pairing reveals it. In Mangalagiri no interval excludes zero (60 s: </w:t>
+        <w:t xml:space="preserve"> people of 250. Across the nine bomb-drill comparisons the Holm-adjusted p-values are </w:t>
+      </w:r>
+      <w:r>
+        <w:rPr>
+          <w:rFonts w:ascii="Times New Roman" w:cs="Times New Roman" w:eastAsia="Times New Roman" w:hAnsi="Times New Roman"/>
+          <w:sz w:val="20"/>
+          <w:szCs w:val="20"/>
+        </w:rPr>
+        <w:t xml:space="preserve">0.085</w:t>
+      </w:r>
+      <w:r>
+        <w:rPr>
+          <w:rFonts w:ascii="Times New Roman" w:cs="Times New Roman" w:eastAsia="Times New Roman" w:hAnsi="Times New Roman"/>
+          <w:sz w:val="20"/>
+          <w:szCs w:val="20"/>
+        </w:rPr>
+        <w:t xml:space="preserve"> (60 s) and </w:t>
+      </w:r>
+      <w:r>
+        <w:rPr>
+          <w:rFonts w:ascii="Times New Roman" w:cs="Times New Roman" w:eastAsia="Times New Roman" w:hAnsi="Times New Roman"/>
+          <w:sz w:val="20"/>
+          <w:szCs w:val="20"/>
+        </w:rPr>
+        <w:t xml:space="preserve">0.31</w:t>
+      </w:r>
+      <w:r>
+        <w:rPr>
+          <w:rFonts w:ascii="Times New Roman" w:cs="Times New Roman" w:eastAsia="Times New Roman" w:hAnsi="Times New Roman"/>
+          <w:sz w:val="20"/>
+          <w:szCs w:val="20"/>
+        </w:rPr>
+        <w:t xml:space="preserve"> (180 s), so neither survives the correction, and in Mangalagiri no interval excludes zero (60 s: </w:t>
       </w:r>
       <w:r>
         <w:rPr>
@@ -10870,7 +11226,7 @@
           <w:sz w:val="20"/>
           <w:szCs w:val="20"/>
         </w:rPr>
-        <w:t xml:space="preserve">). Congestion-aware routing shortened the median time from the alert on the campus by </w:t>
+        <w:t xml:space="preserve">). We therefore do not claim that the routing rule changes the number caught in the drills. Among those who reached a stop, the median time from the alert was </w:t>
       </w:r>
       <w:r>
         <w:rPr>
@@ -10886,7 +11242,7 @@
           <w:sz w:val="20"/>
           <w:szCs w:val="20"/>
         </w:rPr>
-        <w:t xml:space="preserve"> s at 180 s, and the load-balanced rule did not differ from it (</w:t>
+        <w:t xml:space="preserve"> s shorter with congestion-aware routing at 180 s on the campus (unadjusted); the load-balanced rule did not differ from it (</w:t>
       </w:r>
       <w:r>
         <w:rPr>
@@ -10933,7 +11289,25 @@
           <w:sz w:val="20"/>
           <w:szCs w:val="20"/>
         </w:rPr>
-        <w:t xml:space="preserve">Without a hazard the rule matters a great deal (Table V). On the campus shortest path evacuated </w:t>
+        <w:t xml:space="preserve">In S2 and S3 everybody starts at one point and uses one route, so shortest path gives the same result in all ten crowds: the narrowest road fixes when people arrive, whatever their delays. The ten crowds are then one outcome, not ten independent samples, and Table V gives no spread for those rows. With path capacity </w:t>
+      </w:r>
+      <w:r>
+        <w:rPr>
+          <w:rFonts w:ascii="Times New Roman" w:cs="Times New Roman" w:eastAsia="Times New Roman" w:hAnsi="Times New Roman"/>
+          <w:i/>
+          <w:iCs/>
+          <w:sz w:val="20"/>
+          <w:szCs w:val="20"/>
+        </w:rPr>
+        <w:t xml:space="preserve">ρ = 0.25</w:t>
+      </w:r>
+      <w:r>
+        <w:rPr>
+          <w:rFonts w:ascii="Times New Roman" w:cs="Times New Roman" w:eastAsia="Times New Roman" w:hAnsi="Times New Roman"/>
+          <w:sz w:val="20"/>
+          <w:szCs w:val="20"/>
+        </w:rPr>
+        <w:t xml:space="preserve"> shortest path evacuated </w:t>
       </w:r>
       <w:r>
         <w:rPr>
@@ -10949,7 +11323,7 @@
           <w:sz w:val="20"/>
           <w:szCs w:val="20"/>
         </w:rPr>
-        <w:t xml:space="preserve">% of the crowd within 30 minutes against </w:t>
+        <w:t xml:space="preserve">% of the campus crowd within 30 minutes against </w:t>
       </w:r>
       <w:r>
         <w:rPr>
@@ -10965,15 +11339,15 @@
           <w:sz w:val="20"/>
           <w:szCs w:val="20"/>
         </w:rPr>
-        <w:t xml:space="preserve">% for the other rules, with a median time from the alert of </w:t>
-      </w:r>
-      <w:r>
-        <w:rPr>
-          <w:rFonts w:ascii="Times New Roman" w:cs="Times New Roman" w:eastAsia="Times New Roman" w:hAnsi="Times New Roman"/>
-          <w:sz w:val="20"/>
-          <w:szCs w:val="20"/>
-        </w:rPr>
-        <w:t xml:space="preserve">1105</w:t>
+        <w:t xml:space="preserve">% for the other rules, and half of all people had arrived after </w:t>
+      </w:r>
+      <w:r>
+        <w:rPr>
+          <w:rFonts w:ascii="Times New Roman" w:cs="Times New Roman" w:eastAsia="Times New Roman" w:hAnsi="Times New Roman"/>
+          <w:sz w:val="20"/>
+          <w:szCs w:val="20"/>
+        </w:rPr>
+        <w:t xml:space="preserve">1150</w:t>
       </w:r>
       <w:r>
         <w:rPr>
@@ -11005,7 +11379,7 @@
           <w:sz w:val="20"/>
           <w:szCs w:val="20"/>
         </w:rPr>
-        <w:t xml:space="preserve">843</w:t>
+        <w:t xml:space="preserve">842</w:t>
       </w:r>
       <w:r>
         <w:rPr>
@@ -11029,7 +11403,7 @@
           <w:sz w:val="20"/>
           <w:szCs w:val="20"/>
         </w:rPr>
-        <w:t xml:space="preserve">% and 100%. The road closure widened the gap: </w:t>
+        <w:t xml:space="preserve">% and 100%. A closure on the shortest route gave </w:t>
       </w:r>
       <w:r>
         <w:rPr>
@@ -11077,7 +11451,7 @@
           <w:sz w:val="20"/>
           <w:szCs w:val="20"/>
         </w:rPr>
-        <w:t xml:space="preserve">% in Mangalagiri. In all four scenarios shortest path evacuated fewer people in every one of the ten crowds. Property 4 explains the size: the campus route has a narrowest segment passing </w:t>
+        <w:t xml:space="preserve">% in Mangalagiri. By Property 4 the campus route passes </w:t>
       </w:r>
       <w:r>
         <w:rPr>
@@ -11093,7 +11467,7 @@
           <w:sz w:val="20"/>
           <w:szCs w:val="20"/>
         </w:rPr>
-        <w:t xml:space="preserve"> people per second, so after 344 s of walking the last of 250 people arrives about 1,800 s after the alert, the end of the 30 minutes available.</w:t>
+        <w:t xml:space="preserve"> people per second at its narrowest segment, so the last of 250 people arrives about 1,800 s after the alert, the end of the 30 minutes.</w:t>
       </w:r>
     </w:p>
     <w:p>
@@ -11319,7 +11693,7 @@
                 <w:sz w:val="16"/>
                 <w:szCs w:val="16"/>
               </w:rPr>
-              <w:t xml:space="preserve">Campus, crowd stress</w:t>
+              <w:t xml:space="preserve">Campus, stress</w:t>
             </w:r>
           </w:p>
         </w:tc>
@@ -11353,7 +11727,7 @@
                 <w:sz w:val="16"/>
                 <w:szCs w:val="16"/>
               </w:rPr>
-              <w:t xml:space="preserve">94.0 ± 0.0</w:t>
+              <w:t xml:space="preserve">94.0</w:t>
             </w:r>
           </w:p>
         </w:tc>
@@ -11387,7 +11761,7 @@
                 <w:sz w:val="16"/>
                 <w:szCs w:val="16"/>
               </w:rPr>
-              <w:t xml:space="preserve">100.0 ± 0.0</w:t>
+              <w:t xml:space="preserve">100.0</w:t>
             </w:r>
           </w:p>
         </w:tc>
@@ -11421,7 +11795,7 @@
                 <w:sz w:val="16"/>
                 <w:szCs w:val="16"/>
               </w:rPr>
-              <w:t xml:space="preserve">100.0 ± 0.0</w:t>
+              <w:t xml:space="preserve">100.0</w:t>
             </w:r>
           </w:p>
         </w:tc>
@@ -11461,7 +11835,7 @@
                 <w:sz w:val="16"/>
                 <w:szCs w:val="16"/>
               </w:rPr>
-              <w:t xml:space="preserve">Campus, road closure</w:t>
+              <w:t xml:space="preserve">Campus, closure</w:t>
             </w:r>
           </w:p>
         </w:tc>
@@ -11495,7 +11869,7 @@
                 <w:sz w:val="16"/>
                 <w:szCs w:val="16"/>
               </w:rPr>
-              <w:t xml:space="preserve">82.4 ± 0.0</w:t>
+              <w:t xml:space="preserve">82.4</w:t>
             </w:r>
           </w:p>
         </w:tc>
@@ -11529,7 +11903,7 @@
                 <w:sz w:val="16"/>
                 <w:szCs w:val="16"/>
               </w:rPr>
-              <w:t xml:space="preserve">100.0 ± 0.0</w:t>
+              <w:t xml:space="preserve">100.0</w:t>
             </w:r>
           </w:p>
         </w:tc>
@@ -11563,7 +11937,7 @@
                 <w:sz w:val="16"/>
                 <w:szCs w:val="16"/>
               </w:rPr>
-              <w:t xml:space="preserve">100.0 ± 0.0</w:t>
+              <w:t xml:space="preserve">100.0</w:t>
             </w:r>
           </w:p>
         </w:tc>
@@ -11637,7 +12011,7 @@
                 <w:sz w:val="16"/>
                 <w:szCs w:val="16"/>
               </w:rPr>
-              <w:t xml:space="preserve">79.6 ± 0.0</w:t>
+              <w:t xml:space="preserve">79.6</w:t>
             </w:r>
           </w:p>
         </w:tc>
@@ -11671,7 +12045,7 @@
                 <w:sz w:val="16"/>
                 <w:szCs w:val="16"/>
               </w:rPr>
-              <w:t xml:space="preserve">100.0 ± 0.0</w:t>
+              <w:t xml:space="preserve">100.0</w:t>
             </w:r>
           </w:p>
         </w:tc>
@@ -11705,7 +12079,7 @@
                 <w:sz w:val="16"/>
                 <w:szCs w:val="16"/>
               </w:rPr>
-              <w:t xml:space="preserve">100.0 ± 0.0</w:t>
+              <w:t xml:space="preserve">100.0</w:t>
             </w:r>
           </w:p>
         </w:tc>
@@ -11779,7 +12153,7 @@
                 <w:sz w:val="16"/>
                 <w:szCs w:val="16"/>
               </w:rPr>
-              <w:t xml:space="preserve">75.6 ± 0.0</w:t>
+              <w:t xml:space="preserve">75.6</w:t>
             </w:r>
           </w:p>
         </w:tc>
@@ -11813,7 +12187,7 @@
                 <w:sz w:val="16"/>
                 <w:szCs w:val="16"/>
               </w:rPr>
-              <w:t xml:space="preserve">97.2 ± 0.0</w:t>
+              <w:t xml:space="preserve">97.2</w:t>
             </w:r>
           </w:p>
         </w:tc>
@@ -11847,7 +12221,7 @@
                 <w:sz w:val="16"/>
                 <w:szCs w:val="16"/>
               </w:rPr>
-              <w:t xml:space="preserve">97.2 ± 0.0</w:t>
+              <w:t xml:space="preserve">97.2</w:t>
             </w:r>
           </w:p>
         </w:tc>
@@ -11990,6 +12364,574 @@
                 <w:szCs w:val="16"/>
               </w:rPr>
               <w:t xml:space="preserve">78.0 ± 1.7</w:t>
+            </w:r>
+          </w:p>
+        </w:tc>
+      </w:tr>
+      <w:tr>
+        <w:trPr>
+          <w:cantSplit/>
+          <w:tblHeader w:val="off"/>
+        </w:trPr>
+        <w:tc>
+          <w:tcPr>
+            <w:tcW w:type="dxa" w:w="1650"/>
+            <w:tcBorders>
+              <w:top w:val="none" w:color="FFFFFF" w:sz="0"/>
+              <w:left w:val="none" w:color="FFFFFF" w:sz="0"/>
+              <w:bottom w:val="none" w:color="FFFFFF" w:sz="0"/>
+              <w:right w:val="none" w:color="FFFFFF" w:sz="0"/>
+            </w:tcBorders>
+            <w:tcMar>
+              <w:top w:type="dxa" w:w="20"/>
+              <w:left w:type="dxa" w:w="40"/>
+              <w:bottom w:type="dxa" w:w="20"/>
+              <w:right w:type="dxa" w:w="40"/>
+            </w:tcMar>
+          </w:tcPr>
+          <w:p>
+            <w:pPr>
+              <w:keepNext w:val="false"/>
+              <w:spacing w:line="200"/>
+              <w:jc w:val="left"/>
+            </w:pPr>
+            <w:r>
+              <w:rPr>
+                <w:rFonts w:ascii="Times New Roman" w:cs="Times New Roman" w:eastAsia="Times New Roman" w:hAnsi="Times New Roman"/>
+                <w:b w:val="false"/>
+                <w:bCs w:val="false"/>
+                <w:sz w:val="16"/>
+                <w:szCs w:val="16"/>
+              </w:rPr>
+              <w:t xml:space="preserve">Campus, stress, many starts</w:t>
+            </w:r>
+          </w:p>
+        </w:tc>
+        <w:tc>
+          <w:tcPr>
+            <w:tcW w:type="dxa" w:w="1130"/>
+            <w:tcBorders>
+              <w:top w:val="none" w:color="FFFFFF" w:sz="0"/>
+              <w:left w:val="none" w:color="FFFFFF" w:sz="0"/>
+              <w:bottom w:val="none" w:color="FFFFFF" w:sz="0"/>
+              <w:right w:val="none" w:color="FFFFFF" w:sz="0"/>
+            </w:tcBorders>
+            <w:tcMar>
+              <w:top w:type="dxa" w:w="20"/>
+              <w:left w:type="dxa" w:w="40"/>
+              <w:bottom w:type="dxa" w:w="20"/>
+              <w:right w:type="dxa" w:w="40"/>
+            </w:tcMar>
+          </w:tcPr>
+          <w:p>
+            <w:pPr>
+              <w:keepNext w:val="false"/>
+              <w:spacing w:line="200"/>
+              <w:jc w:val="center"/>
+            </w:pPr>
+            <w:r>
+              <w:rPr>
+                <w:rFonts w:ascii="Times New Roman" w:cs="Times New Roman" w:eastAsia="Times New Roman" w:hAnsi="Times New Roman"/>
+                <w:b w:val="false"/>
+                <w:bCs w:val="false"/>
+                <w:sz w:val="16"/>
+                <w:szCs w:val="16"/>
+              </w:rPr>
+              <w:t xml:space="preserve">100.0</w:t>
+            </w:r>
+          </w:p>
+        </w:tc>
+        <w:tc>
+          <w:tcPr>
+            <w:tcW w:type="dxa" w:w="1130"/>
+            <w:tcBorders>
+              <w:top w:val="none" w:color="FFFFFF" w:sz="0"/>
+              <w:left w:val="none" w:color="FFFFFF" w:sz="0"/>
+              <w:bottom w:val="none" w:color="FFFFFF" w:sz="0"/>
+              <w:right w:val="none" w:color="FFFFFF" w:sz="0"/>
+            </w:tcBorders>
+            <w:tcMar>
+              <w:top w:type="dxa" w:w="20"/>
+              <w:left w:type="dxa" w:w="40"/>
+              <w:bottom w:type="dxa" w:w="20"/>
+              <w:right w:type="dxa" w:w="40"/>
+            </w:tcMar>
+          </w:tcPr>
+          <w:p>
+            <w:pPr>
+              <w:keepNext w:val="false"/>
+              <w:spacing w:line="200"/>
+              <w:jc w:val="center"/>
+            </w:pPr>
+            <w:r>
+              <w:rPr>
+                <w:rFonts w:ascii="Times New Roman" w:cs="Times New Roman" w:eastAsia="Times New Roman" w:hAnsi="Times New Roman"/>
+                <w:b w:val="false"/>
+                <w:bCs w:val="false"/>
+                <w:sz w:val="16"/>
+                <w:szCs w:val="16"/>
+              </w:rPr>
+              <w:t xml:space="preserve">100.0</w:t>
+            </w:r>
+          </w:p>
+        </w:tc>
+        <w:tc>
+          <w:tcPr>
+            <w:tcW w:type="dxa" w:w="1130"/>
+            <w:tcBorders>
+              <w:top w:val="none" w:color="FFFFFF" w:sz="0"/>
+              <w:left w:val="none" w:color="FFFFFF" w:sz="0"/>
+              <w:bottom w:val="none" w:color="FFFFFF" w:sz="0"/>
+              <w:right w:val="none" w:color="FFFFFF" w:sz="0"/>
+            </w:tcBorders>
+            <w:tcMar>
+              <w:top w:type="dxa" w:w="20"/>
+              <w:left w:type="dxa" w:w="40"/>
+              <w:bottom w:type="dxa" w:w="20"/>
+              <w:right w:type="dxa" w:w="40"/>
+            </w:tcMar>
+          </w:tcPr>
+          <w:p>
+            <w:pPr>
+              <w:keepNext w:val="false"/>
+              <w:spacing w:line="200"/>
+              <w:jc w:val="center"/>
+            </w:pPr>
+            <w:r>
+              <w:rPr>
+                <w:rFonts w:ascii="Times New Roman" w:cs="Times New Roman" w:eastAsia="Times New Roman" w:hAnsi="Times New Roman"/>
+                <w:b w:val="false"/>
+                <w:bCs w:val="false"/>
+                <w:sz w:val="16"/>
+                <w:szCs w:val="16"/>
+              </w:rPr>
+              <w:t xml:space="preserve">100.0</w:t>
+            </w:r>
+          </w:p>
+        </w:tc>
+      </w:tr>
+      <w:tr>
+        <w:trPr>
+          <w:cantSplit/>
+          <w:tblHeader w:val="off"/>
+        </w:trPr>
+        <w:tc>
+          <w:tcPr>
+            <w:tcW w:type="dxa" w:w="1650"/>
+            <w:tcBorders>
+              <w:top w:val="none" w:color="FFFFFF" w:sz="0"/>
+              <w:left w:val="none" w:color="FFFFFF" w:sz="0"/>
+              <w:bottom w:val="none" w:color="FFFFFF" w:sz="0"/>
+              <w:right w:val="none" w:color="FFFFFF" w:sz="0"/>
+            </w:tcBorders>
+            <w:tcMar>
+              <w:top w:type="dxa" w:w="20"/>
+              <w:left w:type="dxa" w:w="40"/>
+              <w:bottom w:type="dxa" w:w="20"/>
+              <w:right w:type="dxa" w:w="40"/>
+            </w:tcMar>
+          </w:tcPr>
+          <w:p>
+            <w:pPr>
+              <w:keepNext w:val="false"/>
+              <w:spacing w:line="200"/>
+              <w:jc w:val="left"/>
+            </w:pPr>
+            <w:r>
+              <w:rPr>
+                <w:rFonts w:ascii="Times New Roman" w:cs="Times New Roman" w:eastAsia="Times New Roman" w:hAnsi="Times New Roman"/>
+                <w:b w:val="false"/>
+                <w:bCs w:val="false"/>
+                <w:sz w:val="16"/>
+                <w:szCs w:val="16"/>
+              </w:rPr>
+              <w:t xml:space="preserve">Campus, closure, many starts</w:t>
+            </w:r>
+          </w:p>
+        </w:tc>
+        <w:tc>
+          <w:tcPr>
+            <w:tcW w:type="dxa" w:w="1130"/>
+            <w:tcBorders>
+              <w:top w:val="none" w:color="FFFFFF" w:sz="0"/>
+              <w:left w:val="none" w:color="FFFFFF" w:sz="0"/>
+              <w:bottom w:val="none" w:color="FFFFFF" w:sz="0"/>
+              <w:right w:val="none" w:color="FFFFFF" w:sz="0"/>
+            </w:tcBorders>
+            <w:tcMar>
+              <w:top w:type="dxa" w:w="20"/>
+              <w:left w:type="dxa" w:w="40"/>
+              <w:bottom w:type="dxa" w:w="20"/>
+              <w:right w:type="dxa" w:w="40"/>
+            </w:tcMar>
+          </w:tcPr>
+          <w:p>
+            <w:pPr>
+              <w:keepNext w:val="false"/>
+              <w:spacing w:line="200"/>
+              <w:jc w:val="center"/>
+            </w:pPr>
+            <w:r>
+              <w:rPr>
+                <w:rFonts w:ascii="Times New Roman" w:cs="Times New Roman" w:eastAsia="Times New Roman" w:hAnsi="Times New Roman"/>
+                <w:b w:val="false"/>
+                <w:bCs w:val="false"/>
+                <w:sz w:val="16"/>
+                <w:szCs w:val="16"/>
+              </w:rPr>
+              <w:t xml:space="preserve">88.0 ± 7.5</w:t>
+            </w:r>
+          </w:p>
+        </w:tc>
+        <w:tc>
+          <w:tcPr>
+            <w:tcW w:type="dxa" w:w="1130"/>
+            <w:tcBorders>
+              <w:top w:val="none" w:color="FFFFFF" w:sz="0"/>
+              <w:left w:val="none" w:color="FFFFFF" w:sz="0"/>
+              <w:bottom w:val="none" w:color="FFFFFF" w:sz="0"/>
+              <w:right w:val="none" w:color="FFFFFF" w:sz="0"/>
+            </w:tcBorders>
+            <w:tcMar>
+              <w:top w:type="dxa" w:w="20"/>
+              <w:left w:type="dxa" w:w="40"/>
+              <w:bottom w:type="dxa" w:w="20"/>
+              <w:right w:type="dxa" w:w="40"/>
+            </w:tcMar>
+          </w:tcPr>
+          <w:p>
+            <w:pPr>
+              <w:keepNext w:val="false"/>
+              <w:spacing w:line="200"/>
+              <w:jc w:val="center"/>
+            </w:pPr>
+            <w:r>
+              <w:rPr>
+                <w:rFonts w:ascii="Times New Roman" w:cs="Times New Roman" w:eastAsia="Times New Roman" w:hAnsi="Times New Roman"/>
+                <w:b w:val="false"/>
+                <w:bCs w:val="false"/>
+                <w:sz w:val="16"/>
+                <w:szCs w:val="16"/>
+              </w:rPr>
+              <w:t xml:space="preserve">91.8 ± 3.5</w:t>
+            </w:r>
+          </w:p>
+        </w:tc>
+        <w:tc>
+          <w:tcPr>
+            <w:tcW w:type="dxa" w:w="1130"/>
+            <w:tcBorders>
+              <w:top w:val="none" w:color="FFFFFF" w:sz="0"/>
+              <w:left w:val="none" w:color="FFFFFF" w:sz="0"/>
+              <w:bottom w:val="none" w:color="FFFFFF" w:sz="0"/>
+              <w:right w:val="none" w:color="FFFFFF" w:sz="0"/>
+            </w:tcBorders>
+            <w:tcMar>
+              <w:top w:type="dxa" w:w="20"/>
+              <w:left w:type="dxa" w:w="40"/>
+              <w:bottom w:type="dxa" w:w="20"/>
+              <w:right w:type="dxa" w:w="40"/>
+            </w:tcMar>
+          </w:tcPr>
+          <w:p>
+            <w:pPr>
+              <w:keepNext w:val="false"/>
+              <w:spacing w:line="200"/>
+              <w:jc w:val="center"/>
+            </w:pPr>
+            <w:r>
+              <w:rPr>
+                <w:rFonts w:ascii="Times New Roman" w:cs="Times New Roman" w:eastAsia="Times New Roman" w:hAnsi="Times New Roman"/>
+                <w:b w:val="false"/>
+                <w:bCs w:val="false"/>
+                <w:sz w:val="16"/>
+                <w:szCs w:val="16"/>
+              </w:rPr>
+              <w:t xml:space="preserve">91.7 ± 3.6</w:t>
+            </w:r>
+          </w:p>
+        </w:tc>
+      </w:tr>
+      <w:tr>
+        <w:trPr>
+          <w:cantSplit/>
+          <w:tblHeader w:val="off"/>
+        </w:trPr>
+        <w:tc>
+          <w:tcPr>
+            <w:tcW w:type="dxa" w:w="1650"/>
+            <w:tcBorders>
+              <w:top w:val="none" w:color="FFFFFF" w:sz="0"/>
+              <w:left w:val="none" w:color="FFFFFF" w:sz="0"/>
+              <w:bottom w:val="none" w:color="FFFFFF" w:sz="0"/>
+              <w:right w:val="none" w:color="FFFFFF" w:sz="0"/>
+            </w:tcBorders>
+            <w:tcMar>
+              <w:top w:type="dxa" w:w="20"/>
+              <w:left w:type="dxa" w:w="40"/>
+              <w:bottom w:type="dxa" w:w="20"/>
+              <w:right w:type="dxa" w:w="40"/>
+            </w:tcMar>
+          </w:tcPr>
+          <w:p>
+            <w:pPr>
+              <w:keepNext w:val="false"/>
+              <w:spacing w:line="200"/>
+              <w:jc w:val="left"/>
+            </w:pPr>
+            <w:r>
+              <w:rPr>
+                <w:rFonts w:ascii="Times New Roman" w:cs="Times New Roman" w:eastAsia="Times New Roman" w:hAnsi="Times New Roman"/>
+                <w:b w:val="false"/>
+                <w:bCs w:val="false"/>
+                <w:sz w:val="16"/>
+                <w:szCs w:val="16"/>
+              </w:rPr>
+              <w:t xml:space="preserve">Mangalagiri, stress, many starts</w:t>
+            </w:r>
+          </w:p>
+        </w:tc>
+        <w:tc>
+          <w:tcPr>
+            <w:tcW w:type="dxa" w:w="1130"/>
+            <w:tcBorders>
+              <w:top w:val="none" w:color="FFFFFF" w:sz="0"/>
+              <w:left w:val="none" w:color="FFFFFF" w:sz="0"/>
+              <w:bottom w:val="none" w:color="FFFFFF" w:sz="0"/>
+              <w:right w:val="none" w:color="FFFFFF" w:sz="0"/>
+            </w:tcBorders>
+            <w:tcMar>
+              <w:top w:type="dxa" w:w="20"/>
+              <w:left w:type="dxa" w:w="40"/>
+              <w:bottom w:type="dxa" w:w="20"/>
+              <w:right w:type="dxa" w:w="40"/>
+            </w:tcMar>
+          </w:tcPr>
+          <w:p>
+            <w:pPr>
+              <w:keepNext w:val="false"/>
+              <w:spacing w:line="200"/>
+              <w:jc w:val="center"/>
+            </w:pPr>
+            <w:r>
+              <w:rPr>
+                <w:rFonts w:ascii="Times New Roman" w:cs="Times New Roman" w:eastAsia="Times New Roman" w:hAnsi="Times New Roman"/>
+                <w:b w:val="false"/>
+                <w:bCs w:val="false"/>
+                <w:sz w:val="16"/>
+                <w:szCs w:val="16"/>
+              </w:rPr>
+              <w:t xml:space="preserve">100.0</w:t>
+            </w:r>
+          </w:p>
+        </w:tc>
+        <w:tc>
+          <w:tcPr>
+            <w:tcW w:type="dxa" w:w="1130"/>
+            <w:tcBorders>
+              <w:top w:val="none" w:color="FFFFFF" w:sz="0"/>
+              <w:left w:val="none" w:color="FFFFFF" w:sz="0"/>
+              <w:bottom w:val="none" w:color="FFFFFF" w:sz="0"/>
+              <w:right w:val="none" w:color="FFFFFF" w:sz="0"/>
+            </w:tcBorders>
+            <w:tcMar>
+              <w:top w:type="dxa" w:w="20"/>
+              <w:left w:type="dxa" w:w="40"/>
+              <w:bottom w:type="dxa" w:w="20"/>
+              <w:right w:type="dxa" w:w="40"/>
+            </w:tcMar>
+          </w:tcPr>
+          <w:p>
+            <w:pPr>
+              <w:keepNext w:val="false"/>
+              <w:spacing w:line="200"/>
+              <w:jc w:val="center"/>
+            </w:pPr>
+            <w:r>
+              <w:rPr>
+                <w:rFonts w:ascii="Times New Roman" w:cs="Times New Roman" w:eastAsia="Times New Roman" w:hAnsi="Times New Roman"/>
+                <w:b w:val="false"/>
+                <w:bCs w:val="false"/>
+                <w:sz w:val="16"/>
+                <w:szCs w:val="16"/>
+              </w:rPr>
+              <w:t xml:space="preserve">100.0</w:t>
+            </w:r>
+          </w:p>
+        </w:tc>
+        <w:tc>
+          <w:tcPr>
+            <w:tcW w:type="dxa" w:w="1130"/>
+            <w:tcBorders>
+              <w:top w:val="none" w:color="FFFFFF" w:sz="0"/>
+              <w:left w:val="none" w:color="FFFFFF" w:sz="0"/>
+              <w:bottom w:val="none" w:color="FFFFFF" w:sz="0"/>
+              <w:right w:val="none" w:color="FFFFFF" w:sz="0"/>
+            </w:tcBorders>
+            <w:tcMar>
+              <w:top w:type="dxa" w:w="20"/>
+              <w:left w:type="dxa" w:w="40"/>
+              <w:bottom w:type="dxa" w:w="20"/>
+              <w:right w:type="dxa" w:w="40"/>
+            </w:tcMar>
+          </w:tcPr>
+          <w:p>
+            <w:pPr>
+              <w:keepNext w:val="false"/>
+              <w:spacing w:line="200"/>
+              <w:jc w:val="center"/>
+            </w:pPr>
+            <w:r>
+              <w:rPr>
+                <w:rFonts w:ascii="Times New Roman" w:cs="Times New Roman" w:eastAsia="Times New Roman" w:hAnsi="Times New Roman"/>
+                <w:b w:val="false"/>
+                <w:bCs w:val="false"/>
+                <w:sz w:val="16"/>
+                <w:szCs w:val="16"/>
+              </w:rPr>
+              <w:t xml:space="preserve">100.0</w:t>
+            </w:r>
+          </w:p>
+        </w:tc>
+      </w:tr>
+      <w:tr>
+        <w:trPr>
+          <w:cantSplit/>
+          <w:tblHeader w:val="off"/>
+        </w:trPr>
+        <w:tc>
+          <w:tcPr>
+            <w:tcW w:type="dxa" w:w="1650"/>
+            <w:tcBorders>
+              <w:top w:val="none" w:color="FFFFFF" w:sz="0"/>
+              <w:left w:val="none" w:color="FFFFFF" w:sz="0"/>
+              <w:bottom w:val="single" w:color="000000" w:sz="4"/>
+              <w:right w:val="none" w:color="FFFFFF" w:sz="0"/>
+            </w:tcBorders>
+            <w:tcMar>
+              <w:top w:type="dxa" w:w="20"/>
+              <w:left w:type="dxa" w:w="40"/>
+              <w:bottom w:type="dxa" w:w="20"/>
+              <w:right w:type="dxa" w:w="40"/>
+            </w:tcMar>
+          </w:tcPr>
+          <w:p>
+            <w:pPr>
+              <w:keepNext w:val="false"/>
+              <w:spacing w:line="200"/>
+              <w:jc w:val="left"/>
+            </w:pPr>
+            <w:r>
+              <w:rPr>
+                <w:rFonts w:ascii="Times New Roman" w:cs="Times New Roman" w:eastAsia="Times New Roman" w:hAnsi="Times New Roman"/>
+                <w:b w:val="false"/>
+                <w:bCs w:val="false"/>
+                <w:sz w:val="16"/>
+                <w:szCs w:val="16"/>
+              </w:rPr>
+              <w:t xml:space="preserve">Mangalagiri, closure, many starts</w:t>
+            </w:r>
+          </w:p>
+        </w:tc>
+        <w:tc>
+          <w:tcPr>
+            <w:tcW w:type="dxa" w:w="1130"/>
+            <w:tcBorders>
+              <w:top w:val="none" w:color="FFFFFF" w:sz="0"/>
+              <w:left w:val="none" w:color="FFFFFF" w:sz="0"/>
+              <w:bottom w:val="single" w:color="000000" w:sz="4"/>
+              <w:right w:val="none" w:color="FFFFFF" w:sz="0"/>
+            </w:tcBorders>
+            <w:tcMar>
+              <w:top w:type="dxa" w:w="20"/>
+              <w:left w:type="dxa" w:w="40"/>
+              <w:bottom w:type="dxa" w:w="20"/>
+              <w:right w:type="dxa" w:w="40"/>
+            </w:tcMar>
+          </w:tcPr>
+          <w:p>
+            <w:pPr>
+              <w:keepNext w:val="false"/>
+              <w:spacing w:line="200"/>
+              <w:jc w:val="center"/>
+            </w:pPr>
+            <w:r>
+              <w:rPr>
+                <w:rFonts w:ascii="Times New Roman" w:cs="Times New Roman" w:eastAsia="Times New Roman" w:hAnsi="Times New Roman"/>
+                <w:b w:val="false"/>
+                <w:bCs w:val="false"/>
+                <w:sz w:val="16"/>
+                <w:szCs w:val="16"/>
+              </w:rPr>
+              <w:t xml:space="preserve">94.9 ± 4.0</w:t>
+            </w:r>
+          </w:p>
+        </w:tc>
+        <w:tc>
+          <w:tcPr>
+            <w:tcW w:type="dxa" w:w="1130"/>
+            <w:tcBorders>
+              <w:top w:val="none" w:color="FFFFFF" w:sz="0"/>
+              <w:left w:val="none" w:color="FFFFFF" w:sz="0"/>
+              <w:bottom w:val="single" w:color="000000" w:sz="4"/>
+              <w:right w:val="none" w:color="FFFFFF" w:sz="0"/>
+            </w:tcBorders>
+            <w:tcMar>
+              <w:top w:type="dxa" w:w="20"/>
+              <w:left w:type="dxa" w:w="40"/>
+              <w:bottom w:type="dxa" w:w="20"/>
+              <w:right w:type="dxa" w:w="40"/>
+            </w:tcMar>
+          </w:tcPr>
+          <w:p>
+            <w:pPr>
+              <w:keepNext w:val="false"/>
+              <w:spacing w:line="200"/>
+              <w:jc w:val="center"/>
+            </w:pPr>
+            <w:r>
+              <w:rPr>
+                <w:rFonts w:ascii="Times New Roman" w:cs="Times New Roman" w:eastAsia="Times New Roman" w:hAnsi="Times New Roman"/>
+                <w:b w:val="false"/>
+                <w:bCs w:val="false"/>
+                <w:sz w:val="16"/>
+                <w:szCs w:val="16"/>
+              </w:rPr>
+              <w:t xml:space="preserve">95.0 ± 3.6</w:t>
+            </w:r>
+          </w:p>
+        </w:tc>
+        <w:tc>
+          <w:tcPr>
+            <w:tcW w:type="dxa" w:w="1130"/>
+            <w:tcBorders>
+              <w:top w:val="none" w:color="FFFFFF" w:sz="0"/>
+              <w:left w:val="none" w:color="FFFFFF" w:sz="0"/>
+              <w:bottom w:val="single" w:color="000000" w:sz="4"/>
+              <w:right w:val="none" w:color="FFFFFF" w:sz="0"/>
+            </w:tcBorders>
+            <w:tcMar>
+              <w:top w:type="dxa" w:w="20"/>
+              <w:left w:type="dxa" w:w="40"/>
+              <w:bottom w:type="dxa" w:w="20"/>
+              <w:right w:type="dxa" w:w="40"/>
+            </w:tcMar>
+          </w:tcPr>
+          <w:p>
+            <w:pPr>
+              <w:keepNext w:val="false"/>
+              <w:spacing w:line="200"/>
+              <w:jc w:val="center"/>
+            </w:pPr>
+            <w:r>
+              <w:rPr>
+                <w:rFonts w:ascii="Times New Roman" w:cs="Times New Roman" w:eastAsia="Times New Roman" w:hAnsi="Times New Roman"/>
+                <w:b w:val="false"/>
+                <w:bCs w:val="false"/>
+                <w:sz w:val="16"/>
+                <w:szCs w:val="16"/>
+              </w:rPr>
+              <w:t xml:space="preserve">95.0 ± 3.6</w:t>
             </w:r>
           </w:p>
         </w:tc>
@@ -12011,6 +12953,1023 @@
     </w:p>
     <w:p>
       <w:pPr>
+        <w:spacing w:after="60" w:before="0" w:line="228"/>
+        <w:ind w:firstLine="245"/>
+        <w:jc w:val="both"/>
+      </w:pPr>
+      <w:r>
+        <w:rPr>
+          <w:rFonts w:ascii="Times New Roman" w:cs="Times New Roman" w:eastAsia="Times New Roman" w:hAnsi="Times New Roman"/>
+          <w:sz w:val="20"/>
+          <w:szCs w:val="20"/>
+        </w:rPr>
+        <w:t xml:space="preserve">The large gaps therefore depend on two assumptions. Table VI gives, for shortest path, the share evacuated and the time by which half of all people had arrived, followed by the same time for congestion-aware routing (SP / CA, ρ in persons per metre). With the path capacity raised to </w:t>
+      </w:r>
+      <w:r>
+        <w:rPr>
+          <w:rFonts w:ascii="Times New Roman" w:cs="Times New Roman" w:eastAsia="Times New Roman" w:hAnsi="Times New Roman"/>
+          <w:i/>
+          <w:iCs/>
+          <w:sz w:val="20"/>
+          <w:szCs w:val="20"/>
+        </w:rPr>
+        <w:t xml:space="preserve">ρ = 0.5</w:t>
+      </w:r>
+      <w:r>
+        <w:rPr>
+          <w:rFonts w:ascii="Times New Roman" w:cs="Times New Roman" w:eastAsia="Times New Roman" w:hAnsi="Times New Roman"/>
+          <w:sz w:val="20"/>
+          <w:szCs w:val="20"/>
+        </w:rPr>
+        <w:t xml:space="preserve"> persons per metre, shortest path already evacuated everyone in both areas and only the times differ, and at </w:t>
+      </w:r>
+      <w:r>
+        <w:rPr>
+          <w:rFonts w:ascii="Times New Roman" w:cs="Times New Roman" w:eastAsia="Times New Roman" w:hAnsi="Times New Roman"/>
+          <w:i/>
+          <w:iCs/>
+          <w:sz w:val="20"/>
+          <w:szCs w:val="20"/>
+        </w:rPr>
+        <w:t xml:space="preserve">ρ = 2</w:t>
+      </w:r>
+      <w:r>
+        <w:rPr>
+          <w:rFonts w:ascii="Times New Roman" w:cs="Times New Roman" w:eastAsia="Times New Roman" w:hAnsi="Times New Roman"/>
+          <w:sz w:val="20"/>
+          <w:szCs w:val="20"/>
+        </w:rPr>
+        <w:t xml:space="preserve"> all three rules gave the same times on the campus. With the crowd spread over the </w:t>
+      </w:r>
+      <w:r>
+        <w:rPr>
+          <w:rFonts w:ascii="Times New Roman" w:cs="Times New Roman" w:eastAsia="Times New Roman" w:hAnsi="Times New Roman"/>
+          <w:sz w:val="20"/>
+          <w:szCs w:val="20"/>
+        </w:rPr>
+        <w:t xml:space="preserve">37 or 60 start nodes of the drill (S2′, S3′; the closure is centred on the route from a randomly drawn start node, the same for every rule) all rules evacuated everyone in the stress test. In the closure test the rules differ on the campus (shortest path </w:t>
+      </w:r>
+      <w:r>
+        <w:rPr>
+          <w:rFonts w:ascii="Times New Roman" w:cs="Times New Roman" w:eastAsia="Times New Roman" w:hAnsi="Times New Roman"/>
+          <w:sz w:val="20"/>
+          <w:szCs w:val="20"/>
+        </w:rPr>
+        <w:t xml:space="preserve">−3.76 [−6.69, −0.83]</w:t>
+      </w:r>
+      <w:r>
+        <w:rPr>
+          <w:rFonts w:ascii="Times New Roman" w:cs="Times New Roman" w:eastAsia="Times New Roman" w:hAnsi="Times New Roman"/>
+          <w:sz w:val="20"/>
+          <w:szCs w:val="20"/>
+        </w:rPr>
+        <w:t xml:space="preserve"> points relative to congestion-aware, unadjusted) and not in Mangalagiri (Table V). The single-start figures are a worst case, not a general result about routing.</w:t>
+      </w:r>
+    </w:p>
+    <w:p>
+      <w:pPr>
+        <w:keepNext/>
+        <w:spacing w:after="40" w:before="40" w:line="200"/>
+        <w:jc w:val="center"/>
+      </w:pPr>
+      <w:r>
+        <w:rPr>
+          <w:rFonts w:ascii="Times New Roman" w:cs="Times New Roman" w:eastAsia="Times New Roman" w:hAnsi="Times New Roman"/>
+          <w:sz w:val="16"/>
+          <w:szCs w:val="16"/>
+        </w:rPr>
+        <w:t xml:space="preserve">TABLE VI</w:t>
+      </w:r>
+      <w:r>
+        <w:br/>
+        <w:t xml:space="preserve"/>
+      </w:r>
+      <w:r>
+        <w:rPr>
+          <w:rFonts w:ascii="Times New Roman" w:cs="Times New Roman" w:eastAsia="Times New Roman" w:hAnsi="Times New Roman"/>
+          <w:sz w:val="16"/>
+          <w:szCs w:val="16"/>
+        </w:rPr>
+        <w:t xml:space="preserve">EFFECT OF PATH CAPACITY ON THE STRESS TEST</w:t>
+      </w:r>
+    </w:p>
+    <w:tbl>
+      <w:tblPr>
+        <w:tblW w:type="dxa" w:w="5040"/>
+        <w:jc w:val="center"/>
+        <w:tblBorders>
+          <w:top w:val="single" w:color="auto" w:sz="4"/>
+          <w:left w:val="single" w:color="auto" w:sz="4"/>
+          <w:bottom w:val="single" w:color="auto" w:sz="4"/>
+          <w:right w:val="single" w:color="auto" w:sz="4"/>
+          <w:insideH w:val="single" w:color="auto" w:sz="4"/>
+          <w:insideV w:val="single" w:color="auto" w:sz="4"/>
+        </w:tblBorders>
+      </w:tblPr>
+      <w:tblGrid>
+        <w:gridCol w:w="700"/>
+        <w:gridCol w:w="900"/>
+        <w:gridCol w:w="1250"/>
+        <w:gridCol w:w="900"/>
+        <w:gridCol w:w="1290"/>
+      </w:tblGrid>
+      <w:tr>
+        <w:trPr>
+          <w:cantSplit/>
+          <w:tblHeader/>
+        </w:trPr>
+        <w:tc>
+          <w:tcPr>
+            <w:tcW w:type="dxa" w:w="700"/>
+            <w:tcBorders>
+              <w:top w:val="single" w:color="000000" w:sz="4"/>
+              <w:left w:val="none" w:color="FFFFFF" w:sz="0"/>
+              <w:bottom w:val="single" w:color="000000" w:sz="4"/>
+              <w:right w:val="none" w:color="FFFFFF" w:sz="0"/>
+            </w:tcBorders>
+            <w:tcMar>
+              <w:top w:type="dxa" w:w="20"/>
+              <w:left w:type="dxa" w:w="40"/>
+              <w:bottom w:type="dxa" w:w="20"/>
+              <w:right w:type="dxa" w:w="40"/>
+            </w:tcMar>
+          </w:tcPr>
+          <w:p>
+            <w:pPr>
+              <w:keepNext w:val="false"/>
+              <w:spacing w:line="200"/>
+              <w:jc w:val="left"/>
+            </w:pPr>
+            <w:r>
+              <w:rPr>
+                <w:rFonts w:ascii="Times New Roman" w:cs="Times New Roman" w:eastAsia="Times New Roman" w:hAnsi="Times New Roman"/>
+                <w:b/>
+                <w:bCs/>
+                <w:sz w:val="16"/>
+                <w:szCs w:val="16"/>
+              </w:rPr>
+              <w:t xml:space="preserve">ρ</w:t>
+            </w:r>
+          </w:p>
+        </w:tc>
+        <w:tc>
+          <w:tcPr>
+            <w:tcW w:type="dxa" w:w="900"/>
+            <w:tcBorders>
+              <w:top w:val="single" w:color="000000" w:sz="4"/>
+              <w:left w:val="none" w:color="FFFFFF" w:sz="0"/>
+              <w:bottom w:val="single" w:color="000000" w:sz="4"/>
+              <w:right w:val="none" w:color="FFFFFF" w:sz="0"/>
+            </w:tcBorders>
+            <w:tcMar>
+              <w:top w:type="dxa" w:w="20"/>
+              <w:left w:type="dxa" w:w="40"/>
+              <w:bottom w:type="dxa" w:w="20"/>
+              <w:right w:type="dxa" w:w="40"/>
+            </w:tcMar>
+          </w:tcPr>
+          <w:p>
+            <w:pPr>
+              <w:keepNext w:val="false"/>
+              <w:spacing w:line="200"/>
+              <w:jc w:val="center"/>
+            </w:pPr>
+            <w:r>
+              <w:rPr>
+                <w:rFonts w:ascii="Times New Roman" w:cs="Times New Roman" w:eastAsia="Times New Roman" w:hAnsi="Times New Roman"/>
+                <w:b/>
+                <w:bCs/>
+                <w:sz w:val="16"/>
+                <w:szCs w:val="16"/>
+              </w:rPr>
+              <w:t xml:space="preserve">Campus evac. (%)</w:t>
+            </w:r>
+          </w:p>
+        </w:tc>
+        <w:tc>
+          <w:tcPr>
+            <w:tcW w:type="dxa" w:w="1250"/>
+            <w:tcBorders>
+              <w:top w:val="single" w:color="000000" w:sz="4"/>
+              <w:left w:val="none" w:color="FFFFFF" w:sz="0"/>
+              <w:bottom w:val="single" w:color="000000" w:sz="4"/>
+              <w:right w:val="none" w:color="FFFFFF" w:sz="0"/>
+            </w:tcBorders>
+            <w:tcMar>
+              <w:top w:type="dxa" w:w="20"/>
+              <w:left w:type="dxa" w:w="40"/>
+              <w:bottom w:type="dxa" w:w="20"/>
+              <w:right w:type="dxa" w:w="40"/>
+            </w:tcMar>
+          </w:tcPr>
+          <w:p>
+            <w:pPr>
+              <w:keepNext w:val="false"/>
+              <w:spacing w:line="200"/>
+              <w:jc w:val="center"/>
+            </w:pPr>
+            <w:r>
+              <w:rPr>
+                <w:rFonts w:ascii="Times New Roman" w:cs="Times New Roman" w:eastAsia="Times New Roman" w:hAnsi="Times New Roman"/>
+                <w:b/>
+                <w:bCs/>
+                <w:sz w:val="16"/>
+                <w:szCs w:val="16"/>
+              </w:rPr>
+              <w:t xml:space="preserve">Campus half, SP / CA (s)</w:t>
+            </w:r>
+          </w:p>
+        </w:tc>
+        <w:tc>
+          <w:tcPr>
+            <w:tcW w:type="dxa" w:w="900"/>
+            <w:tcBorders>
+              <w:top w:val="single" w:color="000000" w:sz="4"/>
+              <w:left w:val="none" w:color="FFFFFF" w:sz="0"/>
+              <w:bottom w:val="single" w:color="000000" w:sz="4"/>
+              <w:right w:val="none" w:color="FFFFFF" w:sz="0"/>
+            </w:tcBorders>
+            <w:tcMar>
+              <w:top w:type="dxa" w:w="20"/>
+              <w:left w:type="dxa" w:w="40"/>
+              <w:bottom w:type="dxa" w:w="20"/>
+              <w:right w:type="dxa" w:w="40"/>
+            </w:tcMar>
+          </w:tcPr>
+          <w:p>
+            <w:pPr>
+              <w:keepNext w:val="false"/>
+              <w:spacing w:line="200"/>
+              <w:jc w:val="center"/>
+            </w:pPr>
+            <w:r>
+              <w:rPr>
+                <w:rFonts w:ascii="Times New Roman" w:cs="Times New Roman" w:eastAsia="Times New Roman" w:hAnsi="Times New Roman"/>
+                <w:b/>
+                <w:bCs/>
+                <w:sz w:val="16"/>
+                <w:szCs w:val="16"/>
+              </w:rPr>
+              <w:t xml:space="preserve">Mang. evac. (%)</w:t>
+            </w:r>
+          </w:p>
+        </w:tc>
+        <w:tc>
+          <w:tcPr>
+            <w:tcW w:type="dxa" w:w="1290"/>
+            <w:tcBorders>
+              <w:top w:val="single" w:color="000000" w:sz="4"/>
+              <w:left w:val="none" w:color="FFFFFF" w:sz="0"/>
+              <w:bottom w:val="single" w:color="000000" w:sz="4"/>
+              <w:right w:val="none" w:color="FFFFFF" w:sz="0"/>
+            </w:tcBorders>
+            <w:tcMar>
+              <w:top w:type="dxa" w:w="20"/>
+              <w:left w:type="dxa" w:w="40"/>
+              <w:bottom w:type="dxa" w:w="20"/>
+              <w:right w:type="dxa" w:w="40"/>
+            </w:tcMar>
+          </w:tcPr>
+          <w:p>
+            <w:pPr>
+              <w:keepNext w:val="false"/>
+              <w:spacing w:line="200"/>
+              <w:jc w:val="center"/>
+            </w:pPr>
+            <w:r>
+              <w:rPr>
+                <w:rFonts w:ascii="Times New Roman" w:cs="Times New Roman" w:eastAsia="Times New Roman" w:hAnsi="Times New Roman"/>
+                <w:b/>
+                <w:bCs/>
+                <w:sz w:val="16"/>
+                <w:szCs w:val="16"/>
+              </w:rPr>
+              <w:t xml:space="preserve">Mang. half, SP / CA (s)</w:t>
+            </w:r>
+          </w:p>
+        </w:tc>
+      </w:tr>
+      <w:tr>
+        <w:trPr>
+          <w:cantSplit/>
+          <w:tblHeader w:val="off"/>
+        </w:trPr>
+        <w:tc>
+          <w:tcPr>
+            <w:tcW w:type="dxa" w:w="700"/>
+            <w:tcBorders>
+              <w:top w:val="none" w:color="FFFFFF" w:sz="0"/>
+              <w:left w:val="none" w:color="FFFFFF" w:sz="0"/>
+              <w:bottom w:val="none" w:color="FFFFFF" w:sz="0"/>
+              <w:right w:val="none" w:color="FFFFFF" w:sz="0"/>
+            </w:tcBorders>
+            <w:tcMar>
+              <w:top w:type="dxa" w:w="20"/>
+              <w:left w:type="dxa" w:w="40"/>
+              <w:bottom w:type="dxa" w:w="20"/>
+              <w:right w:type="dxa" w:w="40"/>
+            </w:tcMar>
+          </w:tcPr>
+          <w:p>
+            <w:pPr>
+              <w:keepNext w:val="false"/>
+              <w:spacing w:line="200"/>
+              <w:jc w:val="left"/>
+            </w:pPr>
+            <w:r>
+              <w:rPr>
+                <w:rFonts w:ascii="Times New Roman" w:cs="Times New Roman" w:eastAsia="Times New Roman" w:hAnsi="Times New Roman"/>
+                <w:b w:val="false"/>
+                <w:bCs w:val="false"/>
+                <w:sz w:val="16"/>
+                <w:szCs w:val="16"/>
+              </w:rPr>
+              <w:t xml:space="preserve">0.25</w:t>
+            </w:r>
+          </w:p>
+        </w:tc>
+        <w:tc>
+          <w:tcPr>
+            <w:tcW w:type="dxa" w:w="900"/>
+            <w:tcBorders>
+              <w:top w:val="none" w:color="FFFFFF" w:sz="0"/>
+              <w:left w:val="none" w:color="FFFFFF" w:sz="0"/>
+              <w:bottom w:val="none" w:color="FFFFFF" w:sz="0"/>
+              <w:right w:val="none" w:color="FFFFFF" w:sz="0"/>
+            </w:tcBorders>
+            <w:tcMar>
+              <w:top w:type="dxa" w:w="20"/>
+              <w:left w:type="dxa" w:w="40"/>
+              <w:bottom w:type="dxa" w:w="20"/>
+              <w:right w:type="dxa" w:w="40"/>
+            </w:tcMar>
+          </w:tcPr>
+          <w:p>
+            <w:pPr>
+              <w:keepNext w:val="false"/>
+              <w:spacing w:line="200"/>
+              <w:jc w:val="center"/>
+            </w:pPr>
+            <w:r>
+              <w:rPr>
+                <w:rFonts w:ascii="Times New Roman" w:cs="Times New Roman" w:eastAsia="Times New Roman" w:hAnsi="Times New Roman"/>
+                <w:b w:val="false"/>
+                <w:bCs w:val="false"/>
+                <w:sz w:val="16"/>
+                <w:szCs w:val="16"/>
+              </w:rPr>
+              <w:t xml:space="preserve">94.0</w:t>
+            </w:r>
+          </w:p>
+        </w:tc>
+        <w:tc>
+          <w:tcPr>
+            <w:tcW w:type="dxa" w:w="1250"/>
+            <w:tcBorders>
+              <w:top w:val="none" w:color="FFFFFF" w:sz="0"/>
+              <w:left w:val="none" w:color="FFFFFF" w:sz="0"/>
+              <w:bottom w:val="none" w:color="FFFFFF" w:sz="0"/>
+              <w:right w:val="none" w:color="FFFFFF" w:sz="0"/>
+            </w:tcBorders>
+            <w:tcMar>
+              <w:top w:type="dxa" w:w="20"/>
+              <w:left w:type="dxa" w:w="40"/>
+              <w:bottom w:type="dxa" w:w="20"/>
+              <w:right w:type="dxa" w:w="40"/>
+            </w:tcMar>
+          </w:tcPr>
+          <w:p>
+            <w:pPr>
+              <w:keepNext w:val="false"/>
+              <w:spacing w:line="200"/>
+              <w:jc w:val="center"/>
+            </w:pPr>
+            <w:r>
+              <w:rPr>
+                <w:rFonts w:ascii="Times New Roman" w:cs="Times New Roman" w:eastAsia="Times New Roman" w:hAnsi="Times New Roman"/>
+                <w:b w:val="false"/>
+                <w:bCs w:val="false"/>
+                <w:sz w:val="16"/>
+                <w:szCs w:val="16"/>
+              </w:rPr>
+              <w:t xml:space="preserve">1150 / 805</w:t>
+            </w:r>
+          </w:p>
+        </w:tc>
+        <w:tc>
+          <w:tcPr>
+            <w:tcW w:type="dxa" w:w="900"/>
+            <w:tcBorders>
+              <w:top w:val="none" w:color="FFFFFF" w:sz="0"/>
+              <w:left w:val="none" w:color="FFFFFF" w:sz="0"/>
+              <w:bottom w:val="none" w:color="FFFFFF" w:sz="0"/>
+              <w:right w:val="none" w:color="FFFFFF" w:sz="0"/>
+            </w:tcBorders>
+            <w:tcMar>
+              <w:top w:type="dxa" w:w="20"/>
+              <w:left w:type="dxa" w:w="40"/>
+              <w:bottom w:type="dxa" w:w="20"/>
+              <w:right w:type="dxa" w:w="40"/>
+            </w:tcMar>
+          </w:tcPr>
+          <w:p>
+            <w:pPr>
+              <w:keepNext w:val="false"/>
+              <w:spacing w:line="200"/>
+              <w:jc w:val="center"/>
+            </w:pPr>
+            <w:r>
+              <w:rPr>
+                <w:rFonts w:ascii="Times New Roman" w:cs="Times New Roman" w:eastAsia="Times New Roman" w:hAnsi="Times New Roman"/>
+                <w:b w:val="false"/>
+                <w:bCs w:val="false"/>
+                <w:sz w:val="16"/>
+                <w:szCs w:val="16"/>
+              </w:rPr>
+              <w:t xml:space="preserve">79.6</w:t>
+            </w:r>
+          </w:p>
+        </w:tc>
+        <w:tc>
+          <w:tcPr>
+            <w:tcW w:type="dxa" w:w="1290"/>
+            <w:tcBorders>
+              <w:top w:val="none" w:color="FFFFFF" w:sz="0"/>
+              <w:left w:val="none" w:color="FFFFFF" w:sz="0"/>
+              <w:bottom w:val="none" w:color="FFFFFF" w:sz="0"/>
+              <w:right w:val="none" w:color="FFFFFF" w:sz="0"/>
+            </w:tcBorders>
+            <w:tcMar>
+              <w:top w:type="dxa" w:w="20"/>
+              <w:left w:type="dxa" w:w="40"/>
+              <w:bottom w:type="dxa" w:w="20"/>
+              <w:right w:type="dxa" w:w="40"/>
+            </w:tcMar>
+          </w:tcPr>
+          <w:p>
+            <w:pPr>
+              <w:keepNext w:val="false"/>
+              <w:spacing w:line="200"/>
+              <w:jc w:val="center"/>
+            </w:pPr>
+            <w:r>
+              <w:rPr>
+                <w:rFonts w:ascii="Times New Roman" w:cs="Times New Roman" w:eastAsia="Times New Roman" w:hAnsi="Times New Roman"/>
+                <w:b w:val="false"/>
+                <w:bCs w:val="false"/>
+                <w:sz w:val="16"/>
+                <w:szCs w:val="16"/>
+              </w:rPr>
+              <w:t xml:space="preserve">1430 / 1120</w:t>
+            </w:r>
+          </w:p>
+        </w:tc>
+      </w:tr>
+      <w:tr>
+        <w:trPr>
+          <w:cantSplit/>
+          <w:tblHeader w:val="off"/>
+        </w:trPr>
+        <w:tc>
+          <w:tcPr>
+            <w:tcW w:type="dxa" w:w="700"/>
+            <w:tcBorders>
+              <w:top w:val="none" w:color="FFFFFF" w:sz="0"/>
+              <w:left w:val="none" w:color="FFFFFF" w:sz="0"/>
+              <w:bottom w:val="none" w:color="FFFFFF" w:sz="0"/>
+              <w:right w:val="none" w:color="FFFFFF" w:sz="0"/>
+            </w:tcBorders>
+            <w:tcMar>
+              <w:top w:type="dxa" w:w="20"/>
+              <w:left w:type="dxa" w:w="40"/>
+              <w:bottom w:type="dxa" w:w="20"/>
+              <w:right w:type="dxa" w:w="40"/>
+            </w:tcMar>
+          </w:tcPr>
+          <w:p>
+            <w:pPr>
+              <w:keepNext w:val="false"/>
+              <w:spacing w:line="200"/>
+              <w:jc w:val="left"/>
+            </w:pPr>
+            <w:r>
+              <w:rPr>
+                <w:rFonts w:ascii="Times New Roman" w:cs="Times New Roman" w:eastAsia="Times New Roman" w:hAnsi="Times New Roman"/>
+                <w:b w:val="false"/>
+                <w:bCs w:val="false"/>
+                <w:sz w:val="16"/>
+                <w:szCs w:val="16"/>
+              </w:rPr>
+              <w:t xml:space="preserve">0.5</w:t>
+            </w:r>
+          </w:p>
+        </w:tc>
+        <w:tc>
+          <w:tcPr>
+            <w:tcW w:type="dxa" w:w="900"/>
+            <w:tcBorders>
+              <w:top w:val="none" w:color="FFFFFF" w:sz="0"/>
+              <w:left w:val="none" w:color="FFFFFF" w:sz="0"/>
+              <w:bottom w:val="none" w:color="FFFFFF" w:sz="0"/>
+              <w:right w:val="none" w:color="FFFFFF" w:sz="0"/>
+            </w:tcBorders>
+            <w:tcMar>
+              <w:top w:type="dxa" w:w="20"/>
+              <w:left w:type="dxa" w:w="40"/>
+              <w:bottom w:type="dxa" w:w="20"/>
+              <w:right w:type="dxa" w:w="40"/>
+            </w:tcMar>
+          </w:tcPr>
+          <w:p>
+            <w:pPr>
+              <w:keepNext w:val="false"/>
+              <w:spacing w:line="200"/>
+              <w:jc w:val="center"/>
+            </w:pPr>
+            <w:r>
+              <w:rPr>
+                <w:rFonts w:ascii="Times New Roman" w:cs="Times New Roman" w:eastAsia="Times New Roman" w:hAnsi="Times New Roman"/>
+                <w:b w:val="false"/>
+                <w:bCs w:val="false"/>
+                <w:sz w:val="16"/>
+                <w:szCs w:val="16"/>
+              </w:rPr>
+              <w:t xml:space="preserve">100.0</w:t>
+            </w:r>
+          </w:p>
+        </w:tc>
+        <w:tc>
+          <w:tcPr>
+            <w:tcW w:type="dxa" w:w="1250"/>
+            <w:tcBorders>
+              <w:top w:val="none" w:color="FFFFFF" w:sz="0"/>
+              <w:left w:val="none" w:color="FFFFFF" w:sz="0"/>
+              <w:bottom w:val="none" w:color="FFFFFF" w:sz="0"/>
+              <w:right w:val="none" w:color="FFFFFF" w:sz="0"/>
+            </w:tcBorders>
+            <w:tcMar>
+              <w:top w:type="dxa" w:w="20"/>
+              <w:left w:type="dxa" w:w="40"/>
+              <w:bottom w:type="dxa" w:w="20"/>
+              <w:right w:type="dxa" w:w="40"/>
+            </w:tcMar>
+          </w:tcPr>
+          <w:p>
+            <w:pPr>
+              <w:keepNext w:val="false"/>
+              <w:spacing w:line="200"/>
+              <w:jc w:val="center"/>
+            </w:pPr>
+            <w:r>
+              <w:rPr>
+                <w:rFonts w:ascii="Times New Roman" w:cs="Times New Roman" w:eastAsia="Times New Roman" w:hAnsi="Times New Roman"/>
+                <w:b w:val="false"/>
+                <w:bCs w:val="false"/>
+                <w:sz w:val="16"/>
+                <w:szCs w:val="16"/>
+              </w:rPr>
+              <w:t xml:space="preserve">775 / 643</w:t>
+            </w:r>
+          </w:p>
+        </w:tc>
+        <w:tc>
+          <w:tcPr>
+            <w:tcW w:type="dxa" w:w="900"/>
+            <w:tcBorders>
+              <w:top w:val="none" w:color="FFFFFF" w:sz="0"/>
+              <w:left w:val="none" w:color="FFFFFF" w:sz="0"/>
+              <w:bottom w:val="none" w:color="FFFFFF" w:sz="0"/>
+              <w:right w:val="none" w:color="FFFFFF" w:sz="0"/>
+            </w:tcBorders>
+            <w:tcMar>
+              <w:top w:type="dxa" w:w="20"/>
+              <w:left w:type="dxa" w:w="40"/>
+              <w:bottom w:type="dxa" w:w="20"/>
+              <w:right w:type="dxa" w:w="40"/>
+            </w:tcMar>
+          </w:tcPr>
+          <w:p>
+            <w:pPr>
+              <w:keepNext w:val="false"/>
+              <w:spacing w:line="200"/>
+              <w:jc w:val="center"/>
+            </w:pPr>
+            <w:r>
+              <w:rPr>
+                <w:rFonts w:ascii="Times New Roman" w:cs="Times New Roman" w:eastAsia="Times New Roman" w:hAnsi="Times New Roman"/>
+                <w:b w:val="false"/>
+                <w:bCs w:val="false"/>
+                <w:sz w:val="16"/>
+                <w:szCs w:val="16"/>
+              </w:rPr>
+              <w:t xml:space="preserve">100.0</w:t>
+            </w:r>
+          </w:p>
+        </w:tc>
+        <w:tc>
+          <w:tcPr>
+            <w:tcW w:type="dxa" w:w="1290"/>
+            <w:tcBorders>
+              <w:top w:val="none" w:color="FFFFFF" w:sz="0"/>
+              <w:left w:val="none" w:color="FFFFFF" w:sz="0"/>
+              <w:bottom w:val="none" w:color="FFFFFF" w:sz="0"/>
+              <w:right w:val="none" w:color="FFFFFF" w:sz="0"/>
+            </w:tcBorders>
+            <w:tcMar>
+              <w:top w:type="dxa" w:w="20"/>
+              <w:left w:type="dxa" w:w="40"/>
+              <w:bottom w:type="dxa" w:w="20"/>
+              <w:right w:type="dxa" w:w="40"/>
+            </w:tcMar>
+          </w:tcPr>
+          <w:p>
+            <w:pPr>
+              <w:keepNext w:val="false"/>
+              <w:spacing w:line="200"/>
+              <w:jc w:val="center"/>
+            </w:pPr>
+            <w:r>
+              <w:rPr>
+                <w:rFonts w:ascii="Times New Roman" w:cs="Times New Roman" w:eastAsia="Times New Roman" w:hAnsi="Times New Roman"/>
+                <w:b w:val="false"/>
+                <w:bCs w:val="false"/>
+                <w:sz w:val="16"/>
+                <w:szCs w:val="16"/>
+              </w:rPr>
+              <w:t xml:space="preserve">1130 / 974</w:t>
+            </w:r>
+          </w:p>
+        </w:tc>
+      </w:tr>
+      <w:tr>
+        <w:trPr>
+          <w:cantSplit/>
+          <w:tblHeader w:val="off"/>
+        </w:trPr>
+        <w:tc>
+          <w:tcPr>
+            <w:tcW w:type="dxa" w:w="700"/>
+            <w:tcBorders>
+              <w:top w:val="none" w:color="FFFFFF" w:sz="0"/>
+              <w:left w:val="none" w:color="FFFFFF" w:sz="0"/>
+              <w:bottom w:val="none" w:color="FFFFFF" w:sz="0"/>
+              <w:right w:val="none" w:color="FFFFFF" w:sz="0"/>
+            </w:tcBorders>
+            <w:tcMar>
+              <w:top w:type="dxa" w:w="20"/>
+              <w:left w:type="dxa" w:w="40"/>
+              <w:bottom w:type="dxa" w:w="20"/>
+              <w:right w:type="dxa" w:w="40"/>
+            </w:tcMar>
+          </w:tcPr>
+          <w:p>
+            <w:pPr>
+              <w:keepNext w:val="false"/>
+              <w:spacing w:line="200"/>
+              <w:jc w:val="left"/>
+            </w:pPr>
+            <w:r>
+              <w:rPr>
+                <w:rFonts w:ascii="Times New Roman" w:cs="Times New Roman" w:eastAsia="Times New Roman" w:hAnsi="Times New Roman"/>
+                <w:b w:val="false"/>
+                <w:bCs w:val="false"/>
+                <w:sz w:val="16"/>
+                <w:szCs w:val="16"/>
+              </w:rPr>
+              <w:t xml:space="preserve">1</w:t>
+            </w:r>
+          </w:p>
+        </w:tc>
+        <w:tc>
+          <w:tcPr>
+            <w:tcW w:type="dxa" w:w="900"/>
+            <w:tcBorders>
+              <w:top w:val="none" w:color="FFFFFF" w:sz="0"/>
+              <w:left w:val="none" w:color="FFFFFF" w:sz="0"/>
+              <w:bottom w:val="none" w:color="FFFFFF" w:sz="0"/>
+              <w:right w:val="none" w:color="FFFFFF" w:sz="0"/>
+            </w:tcBorders>
+            <w:tcMar>
+              <w:top w:type="dxa" w:w="20"/>
+              <w:left w:type="dxa" w:w="40"/>
+              <w:bottom w:type="dxa" w:w="20"/>
+              <w:right w:type="dxa" w:w="40"/>
+            </w:tcMar>
+          </w:tcPr>
+          <w:p>
+            <w:pPr>
+              <w:keepNext w:val="false"/>
+              <w:spacing w:line="200"/>
+              <w:jc w:val="center"/>
+            </w:pPr>
+            <w:r>
+              <w:rPr>
+                <w:rFonts w:ascii="Times New Roman" w:cs="Times New Roman" w:eastAsia="Times New Roman" w:hAnsi="Times New Roman"/>
+                <w:b w:val="false"/>
+                <w:bCs w:val="false"/>
+                <w:sz w:val="16"/>
+                <w:szCs w:val="16"/>
+              </w:rPr>
+              <w:t xml:space="preserve">100.0</w:t>
+            </w:r>
+          </w:p>
+        </w:tc>
+        <w:tc>
+          <w:tcPr>
+            <w:tcW w:type="dxa" w:w="1250"/>
+            <w:tcBorders>
+              <w:top w:val="none" w:color="FFFFFF" w:sz="0"/>
+              <w:left w:val="none" w:color="FFFFFF" w:sz="0"/>
+              <w:bottom w:val="none" w:color="FFFFFF" w:sz="0"/>
+              <w:right w:val="none" w:color="FFFFFF" w:sz="0"/>
+            </w:tcBorders>
+            <w:tcMar>
+              <w:top w:type="dxa" w:w="20"/>
+              <w:left w:type="dxa" w:w="40"/>
+              <w:bottom w:type="dxa" w:w="20"/>
+              <w:right w:type="dxa" w:w="40"/>
+            </w:tcMar>
+          </w:tcPr>
+          <w:p>
+            <w:pPr>
+              <w:keepNext w:val="false"/>
+              <w:spacing w:line="200"/>
+              <w:jc w:val="center"/>
+            </w:pPr>
+            <w:r>
+              <w:rPr>
+                <w:rFonts w:ascii="Times New Roman" w:cs="Times New Roman" w:eastAsia="Times New Roman" w:hAnsi="Times New Roman"/>
+                <w:b w:val="false"/>
+                <w:bCs w:val="false"/>
+                <w:sz w:val="16"/>
+                <w:szCs w:val="16"/>
+              </w:rPr>
+              <w:t xml:space="preserve">580 / 551</w:t>
+            </w:r>
+          </w:p>
+        </w:tc>
+        <w:tc>
+          <w:tcPr>
+            <w:tcW w:type="dxa" w:w="900"/>
+            <w:tcBorders>
+              <w:top w:val="none" w:color="FFFFFF" w:sz="0"/>
+              <w:left w:val="none" w:color="FFFFFF" w:sz="0"/>
+              <w:bottom w:val="none" w:color="FFFFFF" w:sz="0"/>
+              <w:right w:val="none" w:color="FFFFFF" w:sz="0"/>
+            </w:tcBorders>
+            <w:tcMar>
+              <w:top w:type="dxa" w:w="20"/>
+              <w:left w:type="dxa" w:w="40"/>
+              <w:bottom w:type="dxa" w:w="20"/>
+              <w:right w:type="dxa" w:w="40"/>
+            </w:tcMar>
+          </w:tcPr>
+          <w:p>
+            <w:pPr>
+              <w:keepNext w:val="false"/>
+              <w:spacing w:line="200"/>
+              <w:jc w:val="center"/>
+            </w:pPr>
+            <w:r>
+              <w:rPr>
+                <w:rFonts w:ascii="Times New Roman" w:cs="Times New Roman" w:eastAsia="Times New Roman" w:hAnsi="Times New Roman"/>
+                <w:b w:val="false"/>
+                <w:bCs w:val="false"/>
+                <w:sz w:val="16"/>
+                <w:szCs w:val="16"/>
+              </w:rPr>
+              <w:t xml:space="preserve">100.0</w:t>
+            </w:r>
+          </w:p>
+        </w:tc>
+        <w:tc>
+          <w:tcPr>
+            <w:tcW w:type="dxa" w:w="1290"/>
+            <w:tcBorders>
+              <w:top w:val="none" w:color="FFFFFF" w:sz="0"/>
+              <w:left w:val="none" w:color="FFFFFF" w:sz="0"/>
+              <w:bottom w:val="none" w:color="FFFFFF" w:sz="0"/>
+              <w:right w:val="none" w:color="FFFFFF" w:sz="0"/>
+            </w:tcBorders>
+            <w:tcMar>
+              <w:top w:type="dxa" w:w="20"/>
+              <w:left w:type="dxa" w:w="40"/>
+              <w:bottom w:type="dxa" w:w="20"/>
+              <w:right w:type="dxa" w:w="40"/>
+            </w:tcMar>
+          </w:tcPr>
+          <w:p>
+            <w:pPr>
+              <w:keepNext w:val="false"/>
+              <w:spacing w:line="200"/>
+              <w:jc w:val="center"/>
+            </w:pPr>
+            <w:r>
+              <w:rPr>
+                <w:rFonts w:ascii="Times New Roman" w:cs="Times New Roman" w:eastAsia="Times New Roman" w:hAnsi="Times New Roman"/>
+                <w:b w:val="false"/>
+                <w:bCs w:val="false"/>
+                <w:sz w:val="16"/>
+                <w:szCs w:val="16"/>
+              </w:rPr>
+              <w:t xml:space="preserve">981 / 889</w:t>
+            </w:r>
+          </w:p>
+        </w:tc>
+      </w:tr>
+      <w:tr>
+        <w:trPr>
+          <w:cantSplit/>
+          <w:tblHeader w:val="off"/>
+        </w:trPr>
+        <w:tc>
+          <w:tcPr>
+            <w:tcW w:type="dxa" w:w="700"/>
+            <w:tcBorders>
+              <w:top w:val="none" w:color="FFFFFF" w:sz="0"/>
+              <w:left w:val="none" w:color="FFFFFF" w:sz="0"/>
+              <w:bottom w:val="single" w:color="000000" w:sz="4"/>
+              <w:right w:val="none" w:color="FFFFFF" w:sz="0"/>
+            </w:tcBorders>
+            <w:tcMar>
+              <w:top w:type="dxa" w:w="20"/>
+              <w:left w:type="dxa" w:w="40"/>
+              <w:bottom w:type="dxa" w:w="20"/>
+              <w:right w:type="dxa" w:w="40"/>
+            </w:tcMar>
+          </w:tcPr>
+          <w:p>
+            <w:pPr>
+              <w:keepNext w:val="false"/>
+              <w:spacing w:line="200"/>
+              <w:jc w:val="left"/>
+            </w:pPr>
+            <w:r>
+              <w:rPr>
+                <w:rFonts w:ascii="Times New Roman" w:cs="Times New Roman" w:eastAsia="Times New Roman" w:hAnsi="Times New Roman"/>
+                <w:b w:val="false"/>
+                <w:bCs w:val="false"/>
+                <w:sz w:val="16"/>
+                <w:szCs w:val="16"/>
+              </w:rPr>
+              <w:t xml:space="preserve">2</w:t>
+            </w:r>
+          </w:p>
+        </w:tc>
+        <w:tc>
+          <w:tcPr>
+            <w:tcW w:type="dxa" w:w="900"/>
+            <w:tcBorders>
+              <w:top w:val="none" w:color="FFFFFF" w:sz="0"/>
+              <w:left w:val="none" w:color="FFFFFF" w:sz="0"/>
+              <w:bottom w:val="single" w:color="000000" w:sz="4"/>
+              <w:right w:val="none" w:color="FFFFFF" w:sz="0"/>
+            </w:tcBorders>
+            <w:tcMar>
+              <w:top w:type="dxa" w:w="20"/>
+              <w:left w:type="dxa" w:w="40"/>
+              <w:bottom w:type="dxa" w:w="20"/>
+              <w:right w:type="dxa" w:w="40"/>
+            </w:tcMar>
+          </w:tcPr>
+          <w:p>
+            <w:pPr>
+              <w:keepNext w:val="false"/>
+              <w:spacing w:line="200"/>
+              <w:jc w:val="center"/>
+            </w:pPr>
+            <w:r>
+              <w:rPr>
+                <w:rFonts w:ascii="Times New Roman" w:cs="Times New Roman" w:eastAsia="Times New Roman" w:hAnsi="Times New Roman"/>
+                <w:b w:val="false"/>
+                <w:bCs w:val="false"/>
+                <w:sz w:val="16"/>
+                <w:szCs w:val="16"/>
+              </w:rPr>
+              <w:t xml:space="preserve">100.0</w:t>
+            </w:r>
+          </w:p>
+        </w:tc>
+        <w:tc>
+          <w:tcPr>
+            <w:tcW w:type="dxa" w:w="1250"/>
+            <w:tcBorders>
+              <w:top w:val="none" w:color="FFFFFF" w:sz="0"/>
+              <w:left w:val="none" w:color="FFFFFF" w:sz="0"/>
+              <w:bottom w:val="single" w:color="000000" w:sz="4"/>
+              <w:right w:val="none" w:color="FFFFFF" w:sz="0"/>
+            </w:tcBorders>
+            <w:tcMar>
+              <w:top w:type="dxa" w:w="20"/>
+              <w:left w:type="dxa" w:w="40"/>
+              <w:bottom w:type="dxa" w:w="20"/>
+              <w:right w:type="dxa" w:w="40"/>
+            </w:tcMar>
+          </w:tcPr>
+          <w:p>
+            <w:pPr>
+              <w:keepNext w:val="false"/>
+              <w:spacing w:line="200"/>
+              <w:jc w:val="center"/>
+            </w:pPr>
+            <w:r>
+              <w:rPr>
+                <w:rFonts w:ascii="Times New Roman" w:cs="Times New Roman" w:eastAsia="Times New Roman" w:hAnsi="Times New Roman"/>
+                <w:b w:val="false"/>
+                <w:bCs w:val="false"/>
+                <w:sz w:val="16"/>
+                <w:szCs w:val="16"/>
+              </w:rPr>
+              <w:t xml:space="preserve">465 / 465</w:t>
+            </w:r>
+          </w:p>
+        </w:tc>
+        <w:tc>
+          <w:tcPr>
+            <w:tcW w:type="dxa" w:w="900"/>
+            <w:tcBorders>
+              <w:top w:val="none" w:color="FFFFFF" w:sz="0"/>
+              <w:left w:val="none" w:color="FFFFFF" w:sz="0"/>
+              <w:bottom w:val="single" w:color="000000" w:sz="4"/>
+              <w:right w:val="none" w:color="FFFFFF" w:sz="0"/>
+            </w:tcBorders>
+            <w:tcMar>
+              <w:top w:type="dxa" w:w="20"/>
+              <w:left w:type="dxa" w:w="40"/>
+              <w:bottom w:type="dxa" w:w="20"/>
+              <w:right w:type="dxa" w:w="40"/>
+            </w:tcMar>
+          </w:tcPr>
+          <w:p>
+            <w:pPr>
+              <w:keepNext w:val="false"/>
+              <w:spacing w:line="200"/>
+              <w:jc w:val="center"/>
+            </w:pPr>
+            <w:r>
+              <w:rPr>
+                <w:rFonts w:ascii="Times New Roman" w:cs="Times New Roman" w:eastAsia="Times New Roman" w:hAnsi="Times New Roman"/>
+                <w:b w:val="false"/>
+                <w:bCs w:val="false"/>
+                <w:sz w:val="16"/>
+                <w:szCs w:val="16"/>
+              </w:rPr>
+              <w:t xml:space="preserve">100.0</w:t>
+            </w:r>
+          </w:p>
+        </w:tc>
+        <w:tc>
+          <w:tcPr>
+            <w:tcW w:type="dxa" w:w="1290"/>
+            <w:tcBorders>
+              <w:top w:val="none" w:color="FFFFFF" w:sz="0"/>
+              <w:left w:val="none" w:color="FFFFFF" w:sz="0"/>
+              <w:bottom w:val="single" w:color="000000" w:sz="4"/>
+              <w:right w:val="none" w:color="FFFFFF" w:sz="0"/>
+            </w:tcBorders>
+            <w:tcMar>
+              <w:top w:type="dxa" w:w="20"/>
+              <w:left w:type="dxa" w:w="40"/>
+              <w:bottom w:type="dxa" w:w="20"/>
+              <w:right w:type="dxa" w:w="40"/>
+            </w:tcMar>
+          </w:tcPr>
+          <w:p>
+            <w:pPr>
+              <w:keepNext w:val="false"/>
+              <w:spacing w:line="200"/>
+              <w:jc w:val="center"/>
+            </w:pPr>
+            <w:r>
+              <w:rPr>
+                <w:rFonts w:ascii="Times New Roman" w:cs="Times New Roman" w:eastAsia="Times New Roman" w:hAnsi="Times New Roman"/>
+                <w:b w:val="false"/>
+                <w:bCs w:val="false"/>
+                <w:sz w:val="16"/>
+                <w:szCs w:val="16"/>
+              </w:rPr>
+              <w:t xml:space="preserve">890 / 840</w:t>
+            </w:r>
+          </w:p>
+        </w:tc>
+      </w:tr>
+    </w:tbl>
+    <w:p>
+      <w:pPr>
+        <w:spacing w:after="40" w:before="0" w:line="228"/>
+        <w:jc w:val="both"/>
+      </w:pPr>
+      <w:r>
+        <w:rPr>
+          <w:rFonts w:ascii="Times New Roman" w:cs="Times New Roman" w:eastAsia="Times New Roman" w:hAnsi="Times New Roman"/>
+          <w:sz w:val="20"/>
+          <w:szCs w:val="20"/>
+        </w:rPr>
+        <w:t xml:space="preserve"/>
+      </w:r>
+    </w:p>
+    <w:p>
+      <w:pPr>
         <w:keepNext/>
         <w:spacing w:after="40" w:before="60"/>
       </w:pPr>
@@ -12037,7 +13996,7 @@
           <w:sz w:val="20"/>
           <w:szCs w:val="20"/>
         </w:rPr>
-        <w:t xml:space="preserve">People who hear nothing never move, so the share evacuated is close to the phone share (Table VI): </w:t>
+        <w:t xml:space="preserve">People who hear nothing never move, so the share evacuated is close to the phone share (Table VII): </w:t>
       </w:r>
       <w:r>
         <w:rPr>
@@ -12069,7 +14028,7 @@
           <w:sz w:val="20"/>
           <w:szCs w:val="20"/>
         </w:rPr>
-        <w:t xml:space="preserve">% in Mangalagiri with 30% phone reach. Only those inside the blast circle are caught: on the campus the share caught rose from </w:t>
+        <w:t xml:space="preserve">% in Mangalagiri with 30% phone reach. With a phone for everyone the campus share caught is </w:t>
       </w:r>
       <w:r>
         <w:rPr>
@@ -12085,6 +14044,70 @@
           <w:sz w:val="20"/>
           <w:szCs w:val="20"/>
         </w:rPr>
+        <w:t xml:space="preserve">%, above the </w:t>
+      </w:r>
+      <w:r>
+        <w:rPr>
+          <w:rFonts w:ascii="Times New Roman" w:cs="Times New Roman" w:eastAsia="Times New Roman" w:hAnsi="Times New Roman"/>
+          <w:sz w:val="20"/>
+          <w:szCs w:val="20"/>
+        </w:rPr>
+        <w:t xml:space="preserve">6.5</w:t>
+      </w:r>
+      <w:r>
+        <w:rPr>
+          <w:rFonts w:ascii="Times New Roman" w:cs="Times New Roman" w:eastAsia="Times New Roman" w:hAnsi="Times New Roman"/>
+          <w:sz w:val="20"/>
+          <w:szCs w:val="20"/>
+        </w:rPr>
+        <w:t xml:space="preserve">% of S1 at the same lead, because a phone alert arrives up to 15 s late (Mangalagiri: </w:t>
+      </w:r>
+      <w:r>
+        <w:rPr>
+          <w:rFonts w:ascii="Times New Roman" w:cs="Times New Roman" w:eastAsia="Times New Roman" w:hAnsi="Times New Roman"/>
+          <w:sz w:val="20"/>
+          <w:szCs w:val="20"/>
+        </w:rPr>
+        <w:t xml:space="preserve">5.6</w:t>
+      </w:r>
+      <w:r>
+        <w:rPr>
+          <w:rFonts w:ascii="Times New Roman" w:cs="Times New Roman" w:eastAsia="Times New Roman" w:hAnsi="Times New Roman"/>
+          <w:sz w:val="20"/>
+          <w:szCs w:val="20"/>
+        </w:rPr>
+        <w:t xml:space="preserve">% against </w:t>
+      </w:r>
+      <w:r>
+        <w:rPr>
+          <w:rFonts w:ascii="Times New Roman" w:cs="Times New Roman" w:eastAsia="Times New Roman" w:hAnsi="Times New Roman"/>
+          <w:sz w:val="20"/>
+          <w:szCs w:val="20"/>
+        </w:rPr>
+        <w:t xml:space="preserve">5.2</w:t>
+      </w:r>
+      <w:r>
+        <w:rPr>
+          <w:rFonts w:ascii="Times New Roman" w:cs="Times New Roman" w:eastAsia="Times New Roman" w:hAnsi="Times New Roman"/>
+          <w:sz w:val="20"/>
+          <w:szCs w:val="20"/>
+        </w:rPr>
+        <w:t xml:space="preserve">%). Only people in the blast circle are caught, so the campus share rises from </w:t>
+      </w:r>
+      <w:r>
+        <w:rPr>
+          <w:rFonts w:ascii="Times New Roman" w:cs="Times New Roman" w:eastAsia="Times New Roman" w:hAnsi="Times New Roman"/>
+          <w:sz w:val="20"/>
+          <w:szCs w:val="20"/>
+        </w:rPr>
+        <w:t xml:space="preserve">7.5</w:t>
+      </w:r>
+      <w:r>
+        <w:rPr>
+          <w:rFonts w:ascii="Times New Roman" w:cs="Times New Roman" w:eastAsia="Times New Roman" w:hAnsi="Times New Roman"/>
+          <w:sz w:val="20"/>
+          <w:szCs w:val="20"/>
+        </w:rPr>
         <w:t xml:space="preserve">% to </w:t>
       </w:r>
       <w:r>
@@ -12101,7 +14124,7 @@
           <w:sz w:val="20"/>
           <w:szCs w:val="20"/>
         </w:rPr>
-        <w:t xml:space="preserve">%; in Mangalagiri it changed little (</w:t>
+        <w:t xml:space="preserve">% as phones fall from 100% to 30%, while Mangalagiri barely changes (</w:t>
       </w:r>
       <w:r>
         <w:rPr>
@@ -12133,7 +14156,7 @@
           <w:sz w:val="20"/>
           <w:szCs w:val="20"/>
         </w:rPr>
-        <w:t xml:space="preserve">%), since with a 60 s lead most people in the circle are caught even with a phone. Neighbours passing the word raised the share evacuated to </w:t>
+        <w:t xml:space="preserve">%). Neighbours passing the word raised the share evacuated to </w:t>
       </w:r>
       <w:r>
         <w:rPr>
@@ -12181,7 +14204,39 @@
           <w:sz w:val="20"/>
           <w:szCs w:val="20"/>
         </w:rPr>
-        <w:t xml:space="preserve">%; in Mangalagiri the relay was too slow for the 60 s lead. The rules differ by less than one point here.</w:t>
+        <w:t xml:space="preserve">%; in Mangalagiri the relay was too slow for the 60 s lead. The relay used start nodes, so about 7 people on the campus stood at one point; spreading each person at random up to 100 m from the node lowered the shares evacuated only to </w:t>
+      </w:r>
+      <w:r>
+        <w:rPr>
+          <w:rFonts w:ascii="Times New Roman" w:cs="Times New Roman" w:eastAsia="Times New Roman" w:hAnsi="Times New Roman"/>
+          <w:sz w:val="20"/>
+          <w:szCs w:val="20"/>
+        </w:rPr>
+        <w:t xml:space="preserve">83.6</w:t>
+      </w:r>
+      <w:r>
+        <w:rPr>
+          <w:rFonts w:ascii="Times New Roman" w:cs="Times New Roman" w:eastAsia="Times New Roman" w:hAnsi="Times New Roman"/>
+          <w:sz w:val="20"/>
+          <w:szCs w:val="20"/>
+        </w:rPr>
+        <w:t xml:space="preserve">% and </w:t>
+      </w:r>
+      <w:r>
+        <w:rPr>
+          <w:rFonts w:ascii="Times New Roman" w:cs="Times New Roman" w:eastAsia="Times New Roman" w:hAnsi="Times New Roman"/>
+          <w:sz w:val="20"/>
+          <w:szCs w:val="20"/>
+        </w:rPr>
+        <w:t xml:space="preserve">77.6</w:t>
+      </w:r>
+      <w:r>
+        <w:rPr>
+          <w:rFonts w:ascii="Times New Roman" w:cs="Times New Roman" w:eastAsia="Times New Roman" w:hAnsi="Times New Roman"/>
+          <w:sz w:val="20"/>
+          <w:szCs w:val="20"/>
+        </w:rPr>
+        <w:t xml:space="preserve">%, so stacking does not explain the relay effect. The rules differ by under one point.</w:t>
       </w:r>
     </w:p>
     <w:p>
@@ -12196,7 +14251,7 @@
           <w:sz w:val="16"/>
           <w:szCs w:val="16"/>
         </w:rPr>
-        <w:t xml:space="preserve">TABLE VI</w:t>
+        <w:t xml:space="preserve">TABLE VII</w:t>
       </w:r>
       <w:r>
         <w:br/>
@@ -12946,6 +15001,182 @@
             <w:tcBorders>
               <w:top w:val="none" w:color="FFFFFF" w:sz="0"/>
               <w:left w:val="none" w:color="FFFFFF" w:sz="0"/>
+              <w:bottom w:val="none" w:color="FFFFFF" w:sz="0"/>
+              <w:right w:val="none" w:color="FFFFFF" w:sz="0"/>
+            </w:tcBorders>
+            <w:tcMar>
+              <w:top w:type="dxa" w:w="20"/>
+              <w:left w:type="dxa" w:w="40"/>
+              <w:bottom w:type="dxa" w:w="20"/>
+              <w:right w:type="dxa" w:w="40"/>
+            </w:tcMar>
+          </w:tcPr>
+          <w:p>
+            <w:pPr>
+              <w:keepNext w:val="false"/>
+              <w:spacing w:line="200"/>
+              <w:jc w:val="left"/>
+            </w:pPr>
+            <w:r>
+              <w:rPr>
+                <w:rFonts w:ascii="Times New Roman" w:cs="Times New Roman" w:eastAsia="Times New Roman" w:hAnsi="Times New Roman"/>
+                <w:b w:val="false"/>
+                <w:bCs w:val="false"/>
+                <w:sz w:val="16"/>
+                <w:szCs w:val="16"/>
+              </w:rPr>
+              <w:t xml:space="preserve">30% + relay</w:t>
+            </w:r>
+          </w:p>
+        </w:tc>
+        <w:tc>
+          <w:tcPr>
+            <w:tcW w:type="dxa" w:w="915"/>
+            <w:tcBorders>
+              <w:top w:val="none" w:color="FFFFFF" w:sz="0"/>
+              <w:left w:val="none" w:color="FFFFFF" w:sz="0"/>
+              <w:bottom w:val="none" w:color="FFFFFF" w:sz="0"/>
+              <w:right w:val="none" w:color="FFFFFF" w:sz="0"/>
+            </w:tcBorders>
+            <w:tcMar>
+              <w:top w:type="dxa" w:w="20"/>
+              <w:left w:type="dxa" w:w="40"/>
+              <w:bottom w:type="dxa" w:w="20"/>
+              <w:right w:type="dxa" w:w="40"/>
+            </w:tcMar>
+          </w:tcPr>
+          <w:p>
+            <w:pPr>
+              <w:keepNext w:val="false"/>
+              <w:spacing w:line="200"/>
+              <w:jc w:val="center"/>
+            </w:pPr>
+            <w:r>
+              <w:rPr>
+                <w:rFonts w:ascii="Times New Roman" w:cs="Times New Roman" w:eastAsia="Times New Roman" w:hAnsi="Times New Roman"/>
+                <w:b w:val="false"/>
+                <w:bCs w:val="false"/>
+                <w:sz w:val="16"/>
+                <w:szCs w:val="16"/>
+              </w:rPr>
+              <w:t xml:space="preserve">8.6</w:t>
+            </w:r>
+          </w:p>
+        </w:tc>
+        <w:tc>
+          <w:tcPr>
+            <w:tcW w:type="dxa" w:w="915"/>
+            <w:tcBorders>
+              <w:top w:val="none" w:color="FFFFFF" w:sz="0"/>
+              <w:left w:val="none" w:color="FFFFFF" w:sz="0"/>
+              <w:bottom w:val="none" w:color="FFFFFF" w:sz="0"/>
+              <w:right w:val="none" w:color="FFFFFF" w:sz="0"/>
+            </w:tcBorders>
+            <w:tcMar>
+              <w:top w:type="dxa" w:w="20"/>
+              <w:left w:type="dxa" w:w="40"/>
+              <w:bottom w:type="dxa" w:w="20"/>
+              <w:right w:type="dxa" w:w="40"/>
+            </w:tcMar>
+          </w:tcPr>
+          <w:p>
+            <w:pPr>
+              <w:keepNext w:val="false"/>
+              <w:spacing w:line="200"/>
+              <w:jc w:val="center"/>
+            </w:pPr>
+            <w:r>
+              <w:rPr>
+                <w:rFonts w:ascii="Times New Roman" w:cs="Times New Roman" w:eastAsia="Times New Roman" w:hAnsi="Times New Roman"/>
+                <w:b w:val="false"/>
+                <w:bCs w:val="false"/>
+                <w:sz w:val="16"/>
+                <w:szCs w:val="16"/>
+              </w:rPr>
+              <w:t xml:space="preserve">85.8</w:t>
+            </w:r>
+          </w:p>
+        </w:tc>
+        <w:tc>
+          <w:tcPr>
+            <w:tcW w:type="dxa" w:w="915"/>
+            <w:tcBorders>
+              <w:top w:val="none" w:color="FFFFFF" w:sz="0"/>
+              <w:left w:val="none" w:color="FFFFFF" w:sz="0"/>
+              <w:bottom w:val="none" w:color="FFFFFF" w:sz="0"/>
+              <w:right w:val="none" w:color="FFFFFF" w:sz="0"/>
+            </w:tcBorders>
+            <w:tcMar>
+              <w:top w:type="dxa" w:w="20"/>
+              <w:left w:type="dxa" w:w="40"/>
+              <w:bottom w:type="dxa" w:w="20"/>
+              <w:right w:type="dxa" w:w="40"/>
+            </w:tcMar>
+          </w:tcPr>
+          <w:p>
+            <w:pPr>
+              <w:keepNext w:val="false"/>
+              <w:spacing w:line="200"/>
+              <w:jc w:val="center"/>
+            </w:pPr>
+            <w:r>
+              <w:rPr>
+                <w:rFonts w:ascii="Times New Roman" w:cs="Times New Roman" w:eastAsia="Times New Roman" w:hAnsi="Times New Roman"/>
+                <w:b w:val="false"/>
+                <w:bCs w:val="false"/>
+                <w:sz w:val="16"/>
+                <w:szCs w:val="16"/>
+              </w:rPr>
+              <w:t xml:space="preserve">6.2</w:t>
+            </w:r>
+          </w:p>
+        </w:tc>
+        <w:tc>
+          <w:tcPr>
+            <w:tcW w:type="dxa" w:w="915"/>
+            <w:tcBorders>
+              <w:top w:val="none" w:color="FFFFFF" w:sz="0"/>
+              <w:left w:val="none" w:color="FFFFFF" w:sz="0"/>
+              <w:bottom w:val="none" w:color="FFFFFF" w:sz="0"/>
+              <w:right w:val="none" w:color="FFFFFF" w:sz="0"/>
+            </w:tcBorders>
+            <w:tcMar>
+              <w:top w:type="dxa" w:w="20"/>
+              <w:left w:type="dxa" w:w="40"/>
+              <w:bottom w:type="dxa" w:w="20"/>
+              <w:right w:type="dxa" w:w="40"/>
+            </w:tcMar>
+          </w:tcPr>
+          <w:p>
+            <w:pPr>
+              <w:keepNext w:val="false"/>
+              <w:spacing w:line="200"/>
+              <w:jc w:val="center"/>
+            </w:pPr>
+            <w:r>
+              <w:rPr>
+                <w:rFonts w:ascii="Times New Roman" w:cs="Times New Roman" w:eastAsia="Times New Roman" w:hAnsi="Times New Roman"/>
+                <w:b w:val="false"/>
+                <w:bCs w:val="false"/>
+                <w:sz w:val="16"/>
+                <w:szCs w:val="16"/>
+              </w:rPr>
+              <w:t xml:space="preserve">80.8</w:t>
+            </w:r>
+          </w:p>
+        </w:tc>
+      </w:tr>
+      <w:tr>
+        <w:trPr>
+          <w:cantSplit/>
+          <w:tblHeader w:val="off"/>
+        </w:trPr>
+        <w:tc>
+          <w:tcPr>
+            <w:tcW w:type="dxa" w:w="1380"/>
+            <w:tcBorders>
+              <w:top w:val="none" w:color="FFFFFF" w:sz="0"/>
+              <w:left w:val="none" w:color="FFFFFF" w:sz="0"/>
               <w:bottom w:val="single" w:color="000000" w:sz="4"/>
               <w:right w:val="none" w:color="FFFFFF" w:sz="0"/>
             </w:tcBorders>
@@ -12970,7 +15201,7 @@
                 <w:sz w:val="16"/>
                 <w:szCs w:val="16"/>
               </w:rPr>
-              <w:t xml:space="preserve">30% + relay</w:t>
+              <w:t xml:space="preserve">30% + relay, spread</w:t>
             </w:r>
           </w:p>
         </w:tc>
@@ -13004,7 +15235,7 @@
                 <w:sz w:val="16"/>
                 <w:szCs w:val="16"/>
               </w:rPr>
-              <w:t xml:space="preserve">8.6</w:t>
+              <w:t xml:space="preserve">8.3</w:t>
             </w:r>
           </w:p>
         </w:tc>
@@ -13038,7 +15269,7 @@
                 <w:sz w:val="16"/>
                 <w:szCs w:val="16"/>
               </w:rPr>
-              <w:t xml:space="preserve">85.8</w:t>
+              <w:t xml:space="preserve">83.6</w:t>
             </w:r>
           </w:p>
         </w:tc>
@@ -13106,7 +15337,7 @@
                 <w:sz w:val="16"/>
                 <w:szCs w:val="16"/>
               </w:rPr>
-              <w:t xml:space="preserve">80.8</w:t>
+              <w:t xml:space="preserve">77.6</w:t>
             </w:r>
           </w:p>
         </w:tc>
@@ -13154,7 +15385,7 @@
           <w:sz w:val="20"/>
           <w:szCs w:val="20"/>
         </w:rPr>
-        <w:t xml:space="preserve">Table VII changes one factor at a time around the campus drill with a 180 s lead. Reaction delay, walking speed and blast radius move the outcome far more than the routing rule: with delays up to 30 s only </w:t>
+        <w:t xml:space="preserve">Table VIII changes one factor at a time around the campus drill with a 180 s lead, on stored crowds. Reaction delay, walking speed and blast radius move the outcome far more than the routing rule: with delays up to 30 s only </w:t>
       </w:r>
       <w:r>
         <w:rPr>
@@ -13250,7 +15481,23 @@
           <w:sz w:val="20"/>
           <w:szCs w:val="20"/>
         </w:rPr>
-        <w:t xml:space="preserve">%); these runs were saved without individual crowds, so no paired interval exists. In the stress test shortest path suffers most when crowding costs more or stops are smaller: </w:t>
+        <w:t xml:space="preserve">%; shortest path minus congestion-aware </w:t>
+      </w:r>
+      <w:r>
+        <w:rPr>
+          <w:rFonts w:ascii="Times New Roman" w:cs="Times New Roman" w:eastAsia="Times New Roman" w:hAnsi="Times New Roman"/>
+          <w:sz w:val="20"/>
+          <w:szCs w:val="20"/>
+        </w:rPr>
+        <w:t xml:space="preserve">−1.68 [−2.32, −1.04]</w:t>
+      </w:r>
+      <w:r>
+        <w:rPr>
+          <w:rFonts w:ascii="Times New Roman" w:cs="Times New Roman" w:eastAsia="Times New Roman" w:hAnsi="Times New Roman"/>
+          <w:sz w:val="20"/>
+          <w:szCs w:val="20"/>
+        </w:rPr>
+        <w:t xml:space="preserve"> points, unadjusted). In the stress test shortest path evacuated </w:t>
       </w:r>
       <w:r>
         <w:rPr>
@@ -13314,55 +15561,7 @@
           <w:sz w:val="20"/>
           <w:szCs w:val="20"/>
         </w:rPr>
-        <w:t xml:space="preserve">% at the base values), against </w:t>
-      </w:r>
-      <w:r>
-        <w:rPr>
-          <w:rFonts w:ascii="Times New Roman" w:cs="Times New Roman" w:eastAsia="Times New Roman" w:hAnsi="Times New Roman"/>
-          <w:sz w:val="20"/>
-          <w:szCs w:val="20"/>
-        </w:rPr>
-        <w:t xml:space="preserve">100.0</w:t>
-      </w:r>
-      <w:r>
-        <w:rPr>
-          <w:rFonts w:ascii="Times New Roman" w:cs="Times New Roman" w:eastAsia="Times New Roman" w:hAnsi="Times New Roman"/>
-          <w:sz w:val="20"/>
-          <w:szCs w:val="20"/>
-        </w:rPr>
-        <w:t xml:space="preserve">%, </w:t>
-      </w:r>
-      <w:r>
-        <w:rPr>
-          <w:rFonts w:ascii="Times New Roman" w:cs="Times New Roman" w:eastAsia="Times New Roman" w:hAnsi="Times New Roman"/>
-          <w:sz w:val="20"/>
-          <w:szCs w:val="20"/>
-        </w:rPr>
-        <w:t xml:space="preserve">100.0</w:t>
-      </w:r>
-      <w:r>
-        <w:rPr>
-          <w:rFonts w:ascii="Times New Roman" w:cs="Times New Roman" w:eastAsia="Times New Roman" w:hAnsi="Times New Roman"/>
-          <w:sz w:val="20"/>
-          <w:szCs w:val="20"/>
-        </w:rPr>
-        <w:t xml:space="preserve">% and </w:t>
-      </w:r>
-      <w:r>
-        <w:rPr>
-          <w:rFonts w:ascii="Times New Roman" w:cs="Times New Roman" w:eastAsia="Times New Roman" w:hAnsi="Times New Roman"/>
-          <w:sz w:val="20"/>
-          <w:szCs w:val="20"/>
-        </w:rPr>
-        <w:t xml:space="preserve">100.0</w:t>
-      </w:r>
-      <w:r>
-        <w:rPr>
-          <w:rFonts w:ascii="Times New Roman" w:cs="Times New Roman" w:eastAsia="Times New Roman" w:hAnsi="Times New Roman"/>
-          <w:sz w:val="20"/>
-          <w:szCs w:val="20"/>
-        </w:rPr>
-        <w:t xml:space="preserve">% for congestion-aware routing. Smarter routing helps across the range tried, but the benefit depends strongly on the assumed constants.</w:t>
+        <w:t xml:space="preserve">% at the base values), against 100% for congestion-aware routing in all three; as Table VI shows, these results depend strongly on the assumed path capacity.</w:t>
       </w:r>
     </w:p>
     <w:p>
@@ -13377,7 +15576,7 @@
           <w:sz w:val="16"/>
           <w:szCs w:val="16"/>
         </w:rPr>
-        <w:t xml:space="preserve">TABLE VII</w:t>
+        <w:t xml:space="preserve">TABLE VIII</w:t>
       </w:r>
       <w:r>
         <w:br/>
@@ -14069,7 +16268,7 @@
             <w:tcBorders>
               <w:top w:val="none" w:color="FFFFFF" w:sz="0"/>
               <w:left w:val="none" w:color="FFFFFF" w:sz="0"/>
-              <w:bottom w:val="none" w:color="FFFFFF" w:sz="0"/>
+              <w:bottom w:val="single" w:color="000000" w:sz="4"/>
               <w:right w:val="none" w:color="FFFFFF" w:sz="0"/>
             </w:tcBorders>
             <w:tcMar>
@@ -14093,7 +16292,7 @@
                 <w:sz w:val="16"/>
                 <w:szCs w:val="16"/>
               </w:rPr>
-              <w:t xml:space="preserve">Blast radius 100 m</w:t>
+              <w:t xml:space="preserve">Blast radius 200 m</w:t>
             </w:r>
           </w:p>
         </w:tc>
@@ -14103,7 +16302,7 @@
             <w:tcBorders>
               <w:top w:val="none" w:color="FFFFFF" w:sz="0"/>
               <w:left w:val="none" w:color="FFFFFF" w:sz="0"/>
-              <w:bottom w:val="none" w:color="FFFFFF" w:sz="0"/>
+              <w:bottom w:val="single" w:color="000000" w:sz="4"/>
               <w:right w:val="none" w:color="FFFFFF" w:sz="0"/>
             </w:tcBorders>
             <w:tcMar>
@@ -14127,7 +16326,7 @@
                 <w:sz w:val="16"/>
                 <w:szCs w:val="16"/>
               </w:rPr>
-              <w:t xml:space="preserve">1.0 ± 0.6</w:t>
+              <w:t xml:space="preserve">11.3 ± 2.8</w:t>
             </w:r>
           </w:p>
         </w:tc>
@@ -14137,7 +16336,7 @@
             <w:tcBorders>
               <w:top w:val="none" w:color="FFFFFF" w:sz="0"/>
               <w:left w:val="none" w:color="FFFFFF" w:sz="0"/>
-              <w:bottom w:val="none" w:color="FFFFFF" w:sz="0"/>
+              <w:bottom w:val="single" w:color="000000" w:sz="4"/>
               <w:right w:val="none" w:color="FFFFFF" w:sz="0"/>
             </w:tcBorders>
             <w:tcMar>
@@ -14161,223 +16360,7 @@
                 <w:sz w:val="16"/>
                 <w:szCs w:val="16"/>
               </w:rPr>
-              <w:t xml:space="preserve">1.0 ± 0.6</w:t>
-            </w:r>
-          </w:p>
-        </w:tc>
-      </w:tr>
-      <w:tr>
-        <w:trPr>
-          <w:cantSplit/>
-          <w:tblHeader w:val="off"/>
-        </w:trPr>
-        <w:tc>
-          <w:tcPr>
-            <w:tcW w:type="dxa" w:w="2040"/>
-            <w:tcBorders>
-              <w:top w:val="none" w:color="FFFFFF" w:sz="0"/>
-              <w:left w:val="none" w:color="FFFFFF" w:sz="0"/>
-              <w:bottom w:val="none" w:color="FFFFFF" w:sz="0"/>
-              <w:right w:val="none" w:color="FFFFFF" w:sz="0"/>
-            </w:tcBorders>
-            <w:tcMar>
-              <w:top w:type="dxa" w:w="20"/>
-              <w:left w:type="dxa" w:w="40"/>
-              <w:bottom w:type="dxa" w:w="20"/>
-              <w:right w:type="dxa" w:w="40"/>
-            </w:tcMar>
-          </w:tcPr>
-          <w:p>
-            <w:pPr>
-              <w:keepNext w:val="false"/>
-              <w:spacing w:line="200"/>
-              <w:jc w:val="left"/>
-            </w:pPr>
-            <w:r>
-              <w:rPr>
-                <w:rFonts w:ascii="Times New Roman" w:cs="Times New Roman" w:eastAsia="Times New Roman" w:hAnsi="Times New Roman"/>
-                <w:b w:val="false"/>
-                <w:bCs w:val="false"/>
-                <w:sz w:val="16"/>
-                <w:szCs w:val="16"/>
-              </w:rPr>
-              <w:t xml:space="preserve">Blast radius 200 m</w:t>
-            </w:r>
-          </w:p>
-        </w:tc>
-        <w:tc>
-          <w:tcPr>
-            <w:tcW w:type="dxa" w:w="1500"/>
-            <w:tcBorders>
-              <w:top w:val="none" w:color="FFFFFF" w:sz="0"/>
-              <w:left w:val="none" w:color="FFFFFF" w:sz="0"/>
-              <w:bottom w:val="none" w:color="FFFFFF" w:sz="0"/>
-              <w:right w:val="none" w:color="FFFFFF" w:sz="0"/>
-            </w:tcBorders>
-            <w:tcMar>
-              <w:top w:type="dxa" w:w="20"/>
-              <w:left w:type="dxa" w:w="40"/>
-              <w:bottom w:type="dxa" w:w="20"/>
-              <w:right w:type="dxa" w:w="40"/>
-            </w:tcMar>
-          </w:tcPr>
-          <w:p>
-            <w:pPr>
-              <w:keepNext w:val="false"/>
-              <w:spacing w:line="200"/>
-              <w:jc w:val="center"/>
-            </w:pPr>
-            <w:r>
-              <w:rPr>
-                <w:rFonts w:ascii="Times New Roman" w:cs="Times New Roman" w:eastAsia="Times New Roman" w:hAnsi="Times New Roman"/>
-                <w:b w:val="false"/>
-                <w:bCs w:val="false"/>
-                <w:sz w:val="16"/>
-                <w:szCs w:val="16"/>
-              </w:rPr>
-              <w:t xml:space="preserve">11.3 ± 2.8</w:t>
-            </w:r>
-          </w:p>
-        </w:tc>
-        <w:tc>
-          <w:tcPr>
-            <w:tcW w:type="dxa" w:w="1500"/>
-            <w:tcBorders>
-              <w:top w:val="none" w:color="FFFFFF" w:sz="0"/>
-              <w:left w:val="none" w:color="FFFFFF" w:sz="0"/>
-              <w:bottom w:val="none" w:color="FFFFFF" w:sz="0"/>
-              <w:right w:val="none" w:color="FFFFFF" w:sz="0"/>
-            </w:tcBorders>
-            <w:tcMar>
-              <w:top w:type="dxa" w:w="20"/>
-              <w:left w:type="dxa" w:w="40"/>
-              <w:bottom w:type="dxa" w:w="20"/>
-              <w:right w:type="dxa" w:w="40"/>
-            </w:tcMar>
-          </w:tcPr>
-          <w:p>
-            <w:pPr>
-              <w:keepNext w:val="false"/>
-              <w:spacing w:line="200"/>
-              <w:jc w:val="center"/>
-            </w:pPr>
-            <w:r>
-              <w:rPr>
-                <w:rFonts w:ascii="Times New Roman" w:cs="Times New Roman" w:eastAsia="Times New Roman" w:hAnsi="Times New Roman"/>
-                <w:b w:val="false"/>
-                <w:bCs w:val="false"/>
-                <w:sz w:val="16"/>
-                <w:szCs w:val="16"/>
-              </w:rPr>
               <w:t xml:space="preserve">13.0 ± 2.9</w:t>
-            </w:r>
-          </w:p>
-        </w:tc>
-      </w:tr>
-      <w:tr>
-        <w:trPr>
-          <w:cantSplit/>
-          <w:tblHeader w:val="off"/>
-        </w:trPr>
-        <w:tc>
-          <w:tcPr>
-            <w:tcW w:type="dxa" w:w="2040"/>
-            <w:tcBorders>
-              <w:top w:val="none" w:color="FFFFFF" w:sz="0"/>
-              <w:left w:val="none" w:color="FFFFFF" w:sz="0"/>
-              <w:bottom w:val="single" w:color="000000" w:sz="4"/>
-              <w:right w:val="none" w:color="FFFFFF" w:sz="0"/>
-            </w:tcBorders>
-            <w:tcMar>
-              <w:top w:type="dxa" w:w="20"/>
-              <w:left w:type="dxa" w:w="40"/>
-              <w:bottom w:type="dxa" w:w="20"/>
-              <w:right w:type="dxa" w:w="40"/>
-            </w:tcMar>
-          </w:tcPr>
-          <w:p>
-            <w:pPr>
-              <w:keepNext w:val="false"/>
-              <w:spacing w:line="200"/>
-              <w:jc w:val="left"/>
-            </w:pPr>
-            <w:r>
-              <w:rPr>
-                <w:rFonts w:ascii="Times New Roman" w:cs="Times New Roman" w:eastAsia="Times New Roman" w:hAnsi="Times New Roman"/>
-                <w:b w:val="false"/>
-                <w:bCs w:val="false"/>
-                <w:sz w:val="16"/>
-                <w:szCs w:val="16"/>
-              </w:rPr>
-              <w:t xml:space="preserve">400 people</w:t>
-            </w:r>
-          </w:p>
-        </w:tc>
-        <w:tc>
-          <w:tcPr>
-            <w:tcW w:type="dxa" w:w="1500"/>
-            <w:tcBorders>
-              <w:top w:val="none" w:color="FFFFFF" w:sz="0"/>
-              <w:left w:val="none" w:color="FFFFFF" w:sz="0"/>
-              <w:bottom w:val="single" w:color="000000" w:sz="4"/>
-              <w:right w:val="none" w:color="FFFFFF" w:sz="0"/>
-            </w:tcBorders>
-            <w:tcMar>
-              <w:top w:type="dxa" w:w="20"/>
-              <w:left w:type="dxa" w:w="40"/>
-              <w:bottom w:type="dxa" w:w="20"/>
-              <w:right w:type="dxa" w:w="40"/>
-            </w:tcMar>
-          </w:tcPr>
-          <w:p>
-            <w:pPr>
-              <w:keepNext w:val="false"/>
-              <w:spacing w:line="200"/>
-              <w:jc w:val="center"/>
-            </w:pPr>
-            <w:r>
-              <w:rPr>
-                <w:rFonts w:ascii="Times New Roman" w:cs="Times New Roman" w:eastAsia="Times New Roman" w:hAnsi="Times New Roman"/>
-                <w:b w:val="false"/>
-                <w:bCs w:val="false"/>
-                <w:sz w:val="16"/>
-                <w:szCs w:val="16"/>
-              </w:rPr>
-              <w:t xml:space="preserve">7.9 ± 1.3</w:t>
-            </w:r>
-          </w:p>
-        </w:tc>
-        <w:tc>
-          <w:tcPr>
-            <w:tcW w:type="dxa" w:w="1500"/>
-            <w:tcBorders>
-              <w:top w:val="none" w:color="FFFFFF" w:sz="0"/>
-              <w:left w:val="none" w:color="FFFFFF" w:sz="0"/>
-              <w:bottom w:val="single" w:color="000000" w:sz="4"/>
-              <w:right w:val="none" w:color="FFFFFF" w:sz="0"/>
-            </w:tcBorders>
-            <w:tcMar>
-              <w:top w:type="dxa" w:w="20"/>
-              <w:left w:type="dxa" w:w="40"/>
-              <w:bottom w:type="dxa" w:w="20"/>
-              <w:right w:type="dxa" w:w="40"/>
-            </w:tcMar>
-          </w:tcPr>
-          <w:p>
-            <w:pPr>
-              <w:keepNext w:val="false"/>
-              <w:spacing w:line="200"/>
-              <w:jc w:val="center"/>
-            </w:pPr>
-            <w:r>
-              <w:rPr>
-                <w:rFonts w:ascii="Times New Roman" w:cs="Times New Roman" w:eastAsia="Times New Roman" w:hAnsi="Times New Roman"/>
-                <w:b w:val="false"/>
-                <w:bCs w:val="false"/>
-                <w:sz w:val="16"/>
-                <w:szCs w:val="16"/>
-              </w:rPr>
-              <w:t xml:space="preserve">7.7 ± 1.4</w:t>
             </w:r>
           </w:p>
         </w:tc>
@@ -14425,7 +16408,7 @@
           <w:sz w:val="20"/>
           <w:szCs w:val="20"/>
         </w:rPr>
-        <w:t xml:space="preserve">The model has not been calibrated or validated against field data: we did not time real walks, observe a drill, or compare the output with another simulator. Verification shows that the code implements the equations, not that the equations describe real people. Capacities, admission rates, reaction delays and congestion constants are assumed (Table II), so absolute numbers should not be quoted as predictions for either place. Agents do not touch each other and a waiting person does not block the road behind, so gridlock is understated; time advances in 5 s steps; the crowd is synthetic (150 to 400 people) and the safe stops are hypothetical; the blast is a circle without shielding and no injury is modelled; people who hear no alert stay put and are counted neither as caught nor as evacuated outside the blast; OpenStreetMap may be incomplete for a new area [11]. Our alert is a single time and reach, whereas recent work reviews how communication and social behaviour are modelled in agent-based evacuation [5] and implements the notification procedures of emergency services in a large-scale model [12]. We study two places and one hazard type with the bomb at the map centre. Ten crowds give wide intervals for small effects, the intervals assume roughly normal differences, many comparisons are made without correction, and the sensitivity runs have no paired intervals.</w:t>
+        <w:t xml:space="preserve">The model has not been calibrated or validated against field data: we did not time real walks, observe a drill, or compare the output with another simulator. Verification shows that the code implements the equations, not that the equations describe real people. Capacities, admission rates, reaction delays and congestion constants are assumed (Table II), and the crowd-stress results depend strongly on the path capacity (Table VI), so absolute numbers should not be quoted as predictions for either place. Agents do not touch each other and a waiting person does not block the road behind, so gridlock is understated; every person in a run walks at the same speed, so slower walkers are only represented by a lower average speed; the crowd is synthetic (150 to 400 people) and the safe stops are hypothetical; the blast is a circle without shielding and no injury is modelled; people who hear no alert stay put and are counted neither as caught nor as evacuated outside the blast; OpenStreetMap may be incomplete for a new area [11]. Our alert is a single time and reach, whereas recent work reviews how communication and social behaviour are modelled in agent-based evacuation [5] and implements the notification procedures of emergency services in a large-scale model [12]. The two areas differ in road density, share of people in the blast circle, stop distance and map radius at once, so we cannot attribute differences between them to one cause. We study two places and one hazard type, with the bomb at the map centre. Only the nine bomb-drill comparisons of Section VIII-B are corrected for multiple testing; all other comparisons are exploratory.</w:t>
       </w:r>
     </w:p>
     <w:p>
@@ -14456,7 +16439,7 @@
           <w:sz w:val="20"/>
           <w:szCs w:val="20"/>
         </w:rPr>
-        <w:t xml:space="preserve">Panic Engine compares warning times, alert reach and routing rules on identical crowds. We formulated the model, derived a lower bound on the people caught and a discharge formula for a shared route, and checked both with the other equations against the simulator. On the Amrita campus and in Mangalagiri, a longer warning removed the simulated deaths on the campus (300 s) and almost removed them in Mangalagiri (180 s), a shorter reaction delay and faster walking reduced them sharply, and the alert reach decided how many people moved at all. The routing rule changed the number caught by about half a point on the campus and by nothing measurable in Mangalagiri, but decided whether a crowd got out in time when roads were loaded or closed. People who walk slowly need earlier help or nearer safe places. Future work includes calibration with timed walks and a drill, a comparison with SUMO or MATSim on the same network, spill-back, the official assembly points and the real population, and a test of alert wording with real students.</w:t>
+        <w:t xml:space="preserve">Panic Engine compares warning times, alert reach and routing rules on identical crowds. We wrote the model as equations, derived a lower bound on the people caught and a discharge time for a shared route, and checked both, with the other equations, against the simulator. On the Amrita campus and in Mangalagiri a warning longer than the longest reaction delay plus the walk out of the blast circle (about 220 s and 140 s) removed or almost removed the people caught, shorter reaction delays and faster average walking reduced them sharply, and the alert reach decided how many people moved at all. The routing rule changed the number caught by about half a point on the campus, which is not significant after correction, and by nothing measurable in Mangalagiri. It decided whether a crowd got out in time only when everybody started at one point on narrow paths or a closure sat on the shortest route; with wider paths or a spread-out crowd the differences were small. Future work includes calibration with timed walks and a drill, measured path capacities, individual walking speeds, a comparison with SUMO or MATSim on the same network, and the official assembly points.</w:t>
       </w:r>
     </w:p>
     <w:p>
@@ -14502,7 +16485,7 @@
           <w:sz w:val="20"/>
           <w:szCs w:val="20"/>
         </w:rPr>
-        <w:t xml:space="preserve">The authors thank their project guide, Ms. Lavanya Goura, for her guidance, and the OpenStreetMap contributors for the map data.</w:t>
+        <w:t xml:space="preserve">The authors thank the OpenStreetMap contributors for the map data.</w:t>
       </w:r>
     </w:p>
     <w:p>

</xml_diff>

<commit_message>
paper: reviewer pass (IEEE reference and equation style, notation fixes, plainer wording, no acknowledgment or top affiliation)
Co-Authored-By: Claude Sonnet 5.5 <noreply@anthropic.com>
</commit_message>
<xml_diff>
--- a/docs/PANIC_ENGINE_paper_IEEE.docx
+++ b/docs/PANIC_ENGINE_paper_IEEE.docx
@@ -200,19 +200,8 @@
     </w:tbl>
     <w:p>
       <w:pPr>
-        <w:spacing w:after="120" w:before="40"/>
-        <w:jc w:val="center"/>
+        <w:spacing w:after="100"/>
       </w:pPr>
-      <w:r>
-        <w:rPr>
-          <w:rFonts w:ascii="Times New Roman" w:cs="Times New Roman" w:eastAsia="Times New Roman" w:hAnsi="Times New Roman"/>
-          <w:i/>
-          <w:iCs/>
-          <w:sz w:val="18"/>
-          <w:szCs w:val="18"/>
-        </w:rPr>
-        <w:t xml:space="preserve">Amrita Vishwa Vidyapeetham, Amaravati, Andhra Pradesh, India</w:t>
-      </w:r>
     </w:p>
     <w:p>
       <w:pPr>
@@ -239,7 +228,7 @@
           <w:sz w:val="18"/>
           <w:szCs w:val="18"/>
         </w:rPr>
-        <w:t xml:space="preserve">How many people get out of danger when a sudden threat appears depends on how early they are warned, how many the warning reaches and which routes they walk. We present Panic Engine, an open agent-based simulator built on open map data, and apply it to the Amrita Vishwa Vidyapeetham campus at Amaravati and the town of Mangalagiri, 4.2 km away. The model is written as equations; a lower bound on the people caught by a hazard and a discharge time for a shared route serve as consistency checks of the simulator. Four scenarios (bomb drill with a warning time, crowd stress, road closure, partial alert reach) are run on identical crowds with three routing rules and ten random crowds per setting. On the campus the share caught fell from 21.3% at a 60 s warning to 6.5% at 180 s and 0% at 300 s; in Mangalagiri it fell from 6.2% at 30 s to 0.0% at 180 s, as the lead time needed to leave the blast circle (about 220 s and 140 s) predicts. Routing changed the number caught by about half a percentage point on the campus, which is not significant after correction for multiple comparisons. When everybody starts at one point and paths hold 0.25 persons per metre, shortest-path routing evacuated only 94.0% (campus) and 79.6% (Mangalagiri) of the crowd in 30 minutes, against 100% for the other rules; with 0.5 persons per metre, or with people spread over many start points, every rule evacuated everyone. With 30% of people holding a phone, 28.1% of the campus crowd evacuated, and neighbours passing the word raised this to 85.8%. The parameters are assumptions and the model is not calibrated with field data.</w:t>
+        <w:t xml:space="preserve">How many people get out of danger when a sudden threat appears depends on when they are warned, how many hear the warning and which routes they take. We present Panic Engine, an open agent-based simulator that runs on open map data, and apply it to the Amrita Vishwa Vidyapeetham campus at Amaravati and to Mangalagiri, 4.2 km away. Four scenarios run on identical crowds with three routing rules and ten random crowds per setting. On the campus the share caught fell from 21.3% at a 60 s warning to 6.5% at 180 s and 0% at 300 s; in Mangalagiri it fell from 6.2% at 30 s to 0.0% at 180 s. A lower bound from the model matches this: a warning must exceed the longest reaction delay plus the walk out of the blast circle, about 220 s on the campus and 140 s in Mangalagiri. Routing changed the number caught by about half a percentage point on the campus, which is not significant after correction. When everybody starts at one point and paths hold 0.25 persons per metre, shortest-path routing evacuated only 94.0% (campus) and 79.6% (Mangalagiri) of the crowd in 30 minutes, against 100% for the other rules; at 0.5 persons per metre, or with people spread over many start points, every rule evacuated everyone. With 30% of people holding a phone, 28.1% of the campus crowd evacuated, and neighbours passing the word raised this to 85.8%. The parameters are assumed and the model is uncalibrated.</w:t>
       </w:r>
     </w:p>
     <w:p>
@@ -365,7 +354,7 @@
           <w:sz w:val="20"/>
           <w:szCs w:val="20"/>
         </w:rPr>
-        <w:t xml:space="preserve">Detailed models of individual motion in continuous space suit a room or a bottleneck, and recent reviews cover, for example, how social groups change crowd dynamics and how this is modelled [4]. A systematic review of agent-based evacuation models [5] shows how many modelling choices exist. At the scale of a campus or a town, what limits people is the footpath network, the time a path takes to cross and the capacity of the safe places, so we model movement on a graph and ignore contact between individuals. Carles et al. studied how warning parameters change tsunami evacuation outcomes [3]; we vary one factor at a time in the same way for a point blast, and add alert channels and routing rules. The Bureau of Public Roads function relates link travel time to the ratio of load to capacity [6]; its constants for road traffic are 0.15 and 4, but footpaths differ, so we treat them as settings and vary them. Wardrop’s principle that travellers choose the cheapest route given what others do, reviewed in [7], underlies congestion-aware routing, and routes are found with Dijkstra’s algorithm [8].</w:t>
+        <w:t xml:space="preserve">Detailed models of individual motion in continuous space suit a room or a bottleneck, and recent reviews cover, for example, how social groups change crowd dynamics and how this is modelled [4]. A systematic review of agent-based evacuation models [5] shows how many modelling choices exist. At the scale of a campus or a town, what limits people is the footpath network, the time a path takes to cross and the capacity of the safe places, so we model movement on a graph and ignore contact between individuals. Carles et al. studied how warning parameters change tsunami evacuation outcomes [3]; we vary one factor at a time in the same way for a point blast, and add alert channels and routing rules. The Bureau of Public Roads (BPR) function relates link travel time to the ratio of load to capacity [6]; its constants for road traffic are 0.15 and 4, but footpaths differ, so we treat them as settings and vary them. Wardrop’s principle that travellers choose the cheapest route given what others do, reviewed in [7], underlies congestion-aware routing, and routes are found with Dijkstra’s algorithm [8].</w:t>
       </w:r>
     </w:p>
     <w:p>
@@ -396,7 +385,7 @@
           <w:sz w:val="20"/>
           <w:szCs w:val="20"/>
         </w:rPr>
-        <w:t xml:space="preserve">Both areas use the OpenStreetMap footpath network, downloaded with OSMnx [9] and held as a directed graph in the NetworkX library. The first is a 6 km radius around the Amrita campus (16.45606° N, 80.53816° E), the second a 3 km radius around the centre of Mangalagiri (16.43182° N, 80.56881° E); the centres are 4.24 km apart (Eq. 7). Table I gives their size. Over the whole map Mangalagiri has 126 nodes and 26.8 km of directed road per square kilometre and the campus 61 nodes and 14.9 km (Fig. 1). Inside the 525 m alert circle, where the residents live, the figures are 480 nodes/km² and 62.7 km/km² against 43 nodes/km² and 18.0 km/km², so the town is far denser near the bomb. A synthetic grid of 80 nodes serves only as a benchmark in the crowd-stress test.</w:t>
+        <w:t xml:space="preserve">Both areas use the OpenStreetMap footpath network (map data © OpenStreetMap contributors), downloaded with OSMnx [9] and held as a directed graph in the NetworkX library. The first is a 6 km radius around the Amrita campus (16.45606° N, 80.53816° E), the second a 3 km radius around the centre of Mangalagiri (16.43182° N, 80.56881° E); the centres are 4.24 km apart (7). Table I gives their size. Over the whole map Mangalagiri has 126 nodes and 26.8 km of directed road per square kilometre and the campus 61 nodes and 14.9 km (Fig. 1). Inside the 525 m alert circle, where the residents live, the figures are 480 nodes/km² and 62.7 km/km² against 43 nodes/km² and 18.0 km/km², so the town is far denser near the bomb. A synthetic grid of 80 nodes serves only as a benchmark in the crowd-stress test.</w:t>
       </w:r>
     </w:p>
     <w:p>
@@ -1303,7 +1292,7 @@
           <w:sz w:val="16"/>
           <w:szCs w:val="16"/>
         </w:rPr>
-        <w:t xml:space="preserve">Fig. 1. The two study areas around the bomb. Blue-grey lines are footpaths and roads from OpenStreetMap, the dashed orange circle is the 525 m alert radius, the red disc the 150 m blast radius, blue dots are the start points of the residents and green squares the three safe stops.</w:t>
+        <w:t xml:space="preserve">Fig. 1. The two study areas around the bomb. Map data © OpenStreetMap contributors. Blue-grey lines are footpaths and roads, the dashed orange circle is the 525 m alert radius, the red disc the 150 m blast radius, blue dots are the start points of the residents and green squares the three safe stops.</w:t>
       </w:r>
     </w:p>
     <w:p>
@@ -2434,7 +2423,114 @@
           <w:sz w:val="20"/>
           <w:szCs w:val="20"/>
         </w:rPr>
-        <w:t xml:space="preserve">An alerted person waits a reaction delay </w:t>
+        <w:t xml:space="preserve">Person </w:t>
+      </w:r>
+      <w:r>
+        <w:rPr>
+          <w:rFonts w:ascii="Times New Roman" w:cs="Times New Roman" w:eastAsia="Times New Roman" w:hAnsi="Times New Roman"/>
+          <w:i/>
+          <w:iCs/>
+          <w:sz w:val="20"/>
+          <w:szCs w:val="20"/>
+        </w:rPr>
+        <w:t xml:space="preserve">i</w:t>
+      </w:r>
+      <w:r>
+        <w:rPr>
+          <w:rFonts w:ascii="Times New Roman" w:cs="Times New Roman" w:eastAsia="Times New Roman" w:hAnsi="Times New Roman"/>
+          <w:sz w:val="20"/>
+          <w:szCs w:val="20"/>
+        </w:rPr>
+        <w:t xml:space="preserve"> hears the alert at time </w:t>
+      </w:r>
+      <w:r>
+        <w:rPr>
+          <w:rFonts w:ascii="Times New Roman" w:cs="Times New Roman" w:eastAsia="Times New Roman" w:hAnsi="Times New Roman"/>
+          <w:i/>
+          <w:iCs/>
+          <w:sz w:val="20"/>
+          <w:szCs w:val="20"/>
+        </w:rPr>
+        <w:t xml:space="preserve">a</w:t>
+      </w:r>
+      <w:r>
+        <w:rPr>
+          <w:rFonts w:ascii="Times New Roman" w:cs="Times New Roman" w:eastAsia="Times New Roman" w:hAnsi="Times New Roman"/>
+          <w:i/>
+          <w:iCs/>
+          <w:sz w:val="20"/>
+          <w:szCs w:val="20"/>
+          <w:vertAlign w:val="subscript"/>
+        </w:rPr>
+        <w:t xml:space="preserve">i</w:t>
+      </w:r>
+      <w:r>
+        <w:rPr>
+          <w:rFonts w:ascii="Times New Roman" w:cs="Times New Roman" w:eastAsia="Times New Roman" w:hAnsi="Times New Roman"/>
+          <w:sz w:val="20"/>
+          <w:szCs w:val="20"/>
+        </w:rPr>
+        <w:t xml:space="preserve"> (</w:t>
+      </w:r>
+      <w:r>
+        <w:rPr>
+          <w:rFonts w:ascii="Times New Roman" w:cs="Times New Roman" w:eastAsia="Times New Roman" w:hAnsi="Times New Roman"/>
+          <w:i/>
+          <w:iCs/>
+          <w:sz w:val="20"/>
+          <w:szCs w:val="20"/>
+        </w:rPr>
+        <w:t xml:space="preserve">a</w:t>
+      </w:r>
+      <w:r>
+        <w:rPr>
+          <w:rFonts w:ascii="Times New Roman" w:cs="Times New Roman" w:eastAsia="Times New Roman" w:hAnsi="Times New Roman"/>
+          <w:i/>
+          <w:iCs/>
+          <w:sz w:val="20"/>
+          <w:szCs w:val="20"/>
+          <w:vertAlign w:val="subscript"/>
+        </w:rPr>
+        <w:t xml:space="preserve">i</w:t>
+      </w:r>
+      <w:r>
+        <w:rPr>
+          <w:rFonts w:ascii="Times New Roman" w:cs="Times New Roman" w:eastAsia="Times New Roman" w:hAnsi="Times New Roman"/>
+          <w:i/>
+          <w:iCs/>
+          <w:sz w:val="20"/>
+          <w:szCs w:val="20"/>
+        </w:rPr>
+        <w:t xml:space="preserve"> = </w:t>
+      </w:r>
+      <w:r>
+        <w:rPr>
+          <w:rFonts w:ascii="Times New Roman" w:cs="Times New Roman" w:eastAsia="Times New Roman" w:hAnsi="Times New Roman"/>
+          <w:i/>
+          <w:iCs/>
+          <w:sz w:val="20"/>
+          <w:szCs w:val="20"/>
+        </w:rPr>
+        <w:t xml:space="preserve">τ</w:t>
+      </w:r>
+      <w:r>
+        <w:rPr>
+          <w:rFonts w:ascii="Times New Roman" w:cs="Times New Roman" w:eastAsia="Times New Roman" w:hAnsi="Times New Roman"/>
+          <w:i/>
+          <w:iCs/>
+          <w:sz w:val="20"/>
+          <w:szCs w:val="20"/>
+          <w:vertAlign w:val="subscript"/>
+        </w:rPr>
+        <w:t xml:space="preserve">a</w:t>
+      </w:r>
+      <w:r>
+        <w:rPr>
+          <w:rFonts w:ascii="Times New Roman" w:cs="Times New Roman" w:eastAsia="Times New Roman" w:hAnsi="Times New Roman"/>
+          <w:sz w:val="20"/>
+          <w:szCs w:val="20"/>
+        </w:rPr>
+        <w:t xml:space="preserve"> when everybody hears it at once, as in the bomb drills), waits a reaction delay </w:t>
       </w:r>
       <w:r>
         <w:rPr>
@@ -2553,12 +2649,12 @@
           <m:sSubPr/>
           <m:e>
             <m:r>
-              <m:t>τ</m:t>
+              <m:t>a</m:t>
             </m:r>
           </m:e>
           <m:sub>
             <m:r>
-              <m:t>a</m:t>
+              <m:t>i</m:t>
             </m:r>
           </m:sub>
         </m:sSub>
@@ -4258,7 +4354,7 @@
           <w:sz w:val="20"/>
           <w:szCs w:val="20"/>
         </w:rPr>
-        <w:t xml:space="preserve">a</w:t>
+        <w:t xml:space="preserve">m</w:t>
       </w:r>
       <w:r>
         <w:rPr>
@@ -4277,7 +4373,7 @@
           <w:sz w:val="20"/>
           <w:szCs w:val="20"/>
         </w:rPr>
-        <w:t xml:space="preserve"> people head for stop </w:t>
+        <w:t xml:space="preserve"> other people head for stop </w:t>
       </w:r>
       <w:r>
         <w:rPr>
@@ -4370,7 +4466,7 @@
               <m:sSubPr/>
               <m:e>
                 <m:r>
-                  <m:t>a</m:t>
+                  <m:t>m</m:t>
                 </m:r>
               </m:e>
               <m:sub>
@@ -4892,7 +4988,7 @@
                   <m:sSubPr/>
                   <m:e>
                     <m:r>
-                      <m:t>a</m:t>
+                      <m:t>m</m:t>
                     </m:r>
                   </m:e>
                   <m:sub>
@@ -4951,7 +5047,54 @@
           <w:sz w:val="20"/>
           <w:szCs w:val="20"/>
         </w:rPr>
-        <w:t xml:space="preserve">compared lexicographically, with </w:t>
+        <w:t xml:space="preserve">compared lexicographically, where </w:t>
+      </w:r>
+      <w:r>
+        <w:rPr>
+          <w:rFonts w:ascii="Times New Roman" w:cs="Times New Roman" w:eastAsia="Times New Roman" w:hAnsi="Times New Roman"/>
+          <w:i/>
+          <w:iCs/>
+          <w:sz w:val="20"/>
+          <w:szCs w:val="20"/>
+        </w:rPr>
+        <w:t xml:space="preserve">m</w:t>
+      </w:r>
+      <w:r>
+        <w:rPr>
+          <w:rFonts w:ascii="Times New Roman" w:cs="Times New Roman" w:eastAsia="Times New Roman" w:hAnsi="Times New Roman"/>
+          <w:i/>
+          <w:iCs/>
+          <w:sz w:val="20"/>
+          <w:szCs w:val="20"/>
+          <w:vertAlign w:val="subscript"/>
+        </w:rPr>
+        <w:t xml:space="preserve">j</w:t>
+      </w:r>
+      <w:r>
+        <w:rPr>
+          <w:rFonts w:ascii="Times New Roman" w:cs="Times New Roman" w:eastAsia="Times New Roman" w:hAnsi="Times New Roman"/>
+          <w:sz w:val="20"/>
+          <w:szCs w:val="20"/>
+        </w:rPr>
+        <w:t xml:space="preserve"> now counts the people already assigned to stop </w:t>
+      </w:r>
+      <w:r>
+        <w:rPr>
+          <w:rFonts w:ascii="Times New Roman" w:cs="Times New Roman" w:eastAsia="Times New Roman" w:hAnsi="Times New Roman"/>
+          <w:i/>
+          <w:iCs/>
+          <w:sz w:val="20"/>
+          <w:szCs w:val="20"/>
+        </w:rPr>
+        <w:t xml:space="preserve">j</w:t>
+      </w:r>
+      <w:r>
+        <w:rPr>
+          <w:rFonts w:ascii="Times New Roman" w:cs="Times New Roman" w:eastAsia="Times New Roman" w:hAnsi="Times New Roman"/>
+          <w:sz w:val="20"/>
+          <w:szCs w:val="20"/>
+        </w:rPr>
+        <w:t xml:space="preserve"> and </w:t>
       </w:r>
       <w:r>
         <w:rPr>
@@ -4990,15 +5133,26 @@
           <w:sz w:val="20"/>
           <w:szCs w:val="20"/>
         </w:rPr>
-        <w:t xml:space="preserve"> if stop </w:t>
-      </w:r>
-      <w:r>
-        <w:rPr>
-          <w:rFonts w:ascii="Times New Roman" w:cs="Times New Roman" w:eastAsia="Times New Roman" w:hAnsi="Times New Roman"/>
-          <w:i/>
-          <w:iCs/>
-          <w:sz w:val="20"/>
-          <w:szCs w:val="20"/>
+        <w:t xml:space="preserve"> if that count has reached </w:t>
+      </w:r>
+      <w:r>
+        <w:rPr>
+          <w:rFonts w:ascii="Times New Roman" w:cs="Times New Roman" w:eastAsia="Times New Roman" w:hAnsi="Times New Roman"/>
+          <w:i/>
+          <w:iCs/>
+          <w:sz w:val="20"/>
+          <w:szCs w:val="20"/>
+        </w:rPr>
+        <w:t xml:space="preserve">K</w:t>
+      </w:r>
+      <w:r>
+        <w:rPr>
+          <w:rFonts w:ascii="Times New Roman" w:cs="Times New Roman" w:eastAsia="Times New Roman" w:hAnsi="Times New Roman"/>
+          <w:i/>
+          <w:iCs/>
+          <w:sz w:val="20"/>
+          <w:szCs w:val="20"/>
+          <w:vertAlign w:val="subscript"/>
         </w:rPr>
         <w:t xml:space="preserve">j</w:t>
       </w:r>
@@ -5008,7 +5162,7 @@
           <w:sz w:val="20"/>
           <w:szCs w:val="20"/>
         </w:rPr>
-        <w:t xml:space="preserve"> is full and 0 otherwise. A stop admits 8 people per 5 s time step up to </w:t>
+        <w:t xml:space="preserve"> and 0 otherwise. A stop admits 8 people per 5 s time step up to </w:t>
       </w:r>
       <w:r>
         <w:rPr>
@@ -5757,7 +5911,7 @@
           <w:sz w:val="20"/>
           <w:szCs w:val="20"/>
         </w:rPr>
-        <w:t xml:space="preserve">, Eq. (3) gives </w:t>
+        <w:t xml:space="preserve">, the time in (3) satisfies </w:t>
       </w:r>
       <w:r>
         <w:rPr>
@@ -6082,7 +6236,36 @@
           <w:sz w:val="20"/>
           <w:szCs w:val="20"/>
         </w:rPr>
-        <w:t xml:space="preserve"> before reaching a boundary node, so for every rule</w:t>
+        <w:t xml:space="preserve"> before reaching a boundary node, so when everybody hears the alert at </w:t>
+      </w:r>
+      <w:r>
+        <w:rPr>
+          <w:rFonts w:ascii="Times New Roman" w:cs="Times New Roman" w:eastAsia="Times New Roman" w:hAnsi="Times New Roman"/>
+          <w:i/>
+          <w:iCs/>
+          <w:sz w:val="20"/>
+          <w:szCs w:val="20"/>
+        </w:rPr>
+        <w:t xml:space="preserve">τ</w:t>
+      </w:r>
+      <w:r>
+        <w:rPr>
+          <w:rFonts w:ascii="Times New Roman" w:cs="Times New Roman" w:eastAsia="Times New Roman" w:hAnsi="Times New Roman"/>
+          <w:i/>
+          <w:iCs/>
+          <w:sz w:val="20"/>
+          <w:szCs w:val="20"/>
+          <w:vertAlign w:val="subscript"/>
+        </w:rPr>
+        <w:t xml:space="preserve">a</w:t>
+      </w:r>
+      <w:r>
+        <w:rPr>
+          <w:rFonts w:ascii="Times New Roman" w:cs="Times New Roman" w:eastAsia="Times New Roman" w:hAnsi="Times New Roman"/>
+          <w:sz w:val="20"/>
+          <w:szCs w:val="20"/>
+        </w:rPr>
+        <w:t xml:space="preserve"> the bound holds for every rule:</w:t>
       </w:r>
     </w:p>
     <w:p>
@@ -8328,7 +8511,7 @@
                 <w:sz w:val="16"/>
                 <w:szCs w:val="16"/>
               </w:rPr>
-              <w:t xml:space="preserve">250 (300 grid); 150, 400 tested</w:t>
+              <w:t xml:space="preserve">250 (300 grid); 400 tested</w:t>
             </w:r>
           </w:p>
         </w:tc>
@@ -8639,7 +8822,7 @@
                 <w:sz w:val="16"/>
                 <w:szCs w:val="16"/>
               </w:rPr>
-              <w:t xml:space="preserve">V1 (Eqs. 1, 3)</w:t>
+              <w:t xml:space="preserve">V1 ((1), (3))</w:t>
             </w:r>
           </w:p>
         </w:tc>
@@ -8713,7 +8896,7 @@
                 <w:sz w:val="16"/>
                 <w:szCs w:val="16"/>
               </w:rPr>
-              <w:t xml:space="preserve">V2 (Eq. 7)</w:t>
+              <w:t xml:space="preserve">V2 ((7))</w:t>
             </w:r>
           </w:p>
         </w:tc>
@@ -8787,7 +8970,7 @@
                 <w:sz w:val="16"/>
                 <w:szCs w:val="16"/>
               </w:rPr>
-              <w:t xml:space="preserve">V3 (Eq. 5)</w:t>
+              <w:t xml:space="preserve">V3 ((5))</w:t>
             </w:r>
           </w:p>
         </w:tc>
@@ -8861,7 +9044,7 @@
                 <w:sz w:val="16"/>
                 <w:szCs w:val="16"/>
               </w:rPr>
-              <w:t xml:space="preserve">V4 (Eq. 18)</w:t>
+              <w:t xml:space="preserve">V4 ((18))</w:t>
             </w:r>
           </w:p>
         </w:tc>
@@ -8935,7 +9118,7 @@
                 <w:sz w:val="16"/>
                 <w:szCs w:val="16"/>
               </w:rPr>
-              <w:t xml:space="preserve">V5 (Eq. 19)</w:t>
+              <w:t xml:space="preserve">V5 ((19))</w:t>
             </w:r>
           </w:p>
         </w:tc>
@@ -9009,7 +9192,7 @@
                 <w:sz w:val="16"/>
                 <w:szCs w:val="16"/>
               </w:rPr>
-              <w:t xml:space="preserve">V6 (Eq. 20)</w:t>
+              <w:t xml:space="preserve">V6 ((20))</w:t>
             </w:r>
           </w:p>
         </w:tc>
@@ -9083,7 +9266,7 @@
                 <w:sz w:val="16"/>
                 <w:szCs w:val="16"/>
               </w:rPr>
-              <w:t xml:space="preserve">V7 (Eq. 21)</w:t>
+              <w:t xml:space="preserve">V7 ((21))</w:t>
             </w:r>
           </w:p>
         </w:tc>
@@ -9355,7 +9538,7 @@
           <w:sz w:val="20"/>
           <w:szCs w:val="20"/>
         </w:rPr>
-        <w:t xml:space="preserve">This result is largely fixed by two assumed values. By Eq. (19) the lower bound is zero once </w:t>
+        <w:t xml:space="preserve">This result is largely fixed by two assumed values. By (19) the lower bound is zero once </w:t>
       </w:r>
       <w:r>
         <w:rPr>
@@ -11130,7 +11313,7 @@
           <w:sz w:val="20"/>
           <w:szCs w:val="20"/>
         </w:rPr>
-        <w:t xml:space="preserve">The rules run on the same crowds, so we compare them by paired differences (Eq. 17). These comparisons are exploratory. On the campus shortest path caught </w:t>
+        <w:t xml:space="preserve">The rules run on the same crowds, so we compare them by paired differences (17). These comparisons are exploratory. On the campus shortest path caught </w:t>
       </w:r>
       <w:r>
         <w:rPr>
@@ -15449,7 +15632,23 @@
           <w:sz w:val="20"/>
           <w:szCs w:val="20"/>
         </w:rPr>
-        <w:t xml:space="preserve">% at 1.8 m/s. The ranking of the rules is not stable: with a 200 m blast radius congestion-aware routing caught more (</w:t>
+        <w:t xml:space="preserve">% at 1.8 m/s; a 100 m blast radius leaves </w:t>
+      </w:r>
+      <w:r>
+        <w:rPr>
+          <w:rFonts w:ascii="Times New Roman" w:cs="Times New Roman" w:eastAsia="Times New Roman" w:hAnsi="Times New Roman"/>
+          <w:sz w:val="20"/>
+          <w:szCs w:val="20"/>
+        </w:rPr>
+        <w:t xml:space="preserve">1.0</w:t>
+      </w:r>
+      <w:r>
+        <w:rPr>
+          <w:rFonts w:ascii="Times New Roman" w:cs="Times New Roman" w:eastAsia="Times New Roman" w:hAnsi="Times New Roman"/>
+          <w:sz w:val="20"/>
+          <w:szCs w:val="20"/>
+        </w:rPr>
+        <w:t xml:space="preserve">%. The ranking of the rules is not stable: with a 200 m blast radius congestion-aware routing caught more (</w:t>
       </w:r>
       <w:r>
         <w:rPr>
@@ -15588,7 +15787,7 @@
           <w:sz w:val="16"/>
           <w:szCs w:val="16"/>
         </w:rPr>
-        <w:t xml:space="preserve">PEOPLE CAUGHT ON THE CAMPUS, 180 S LEAD, ONE FACTOR CHANGED (%)</w:t>
+        <w:t xml:space="preserve">PEOPLE CAUGHT ON THE CAMPUS (%), LEAD TIME OF 180 SECONDS, ONE FACTOR CHANGED</w:t>
       </w:r>
     </w:p>
     <w:tbl>
@@ -16408,7 +16607,7 @@
           <w:sz w:val="20"/>
           <w:szCs w:val="20"/>
         </w:rPr>
-        <w:t xml:space="preserve">The model has not been calibrated or validated against field data: we did not time real walks, observe a drill, or compare the output with another simulator. Verification shows that the code implements the equations, not that the equations describe real people. Capacities, admission rates, reaction delays and congestion constants are assumed (Table II), and the crowd-stress results depend strongly on the path capacity (Table VI), so absolute numbers should not be quoted as predictions for either place. Agents do not touch each other and a waiting person does not block the road behind, so gridlock is understated; every person in a run walks at the same speed, so slower walkers are only represented by a lower average speed; the crowd is synthetic (150 to 400 people) and the safe stops are hypothetical; the blast is a circle without shielding and no injury is modelled; people who hear no alert stay put and are counted neither as caught nor as evacuated outside the blast; OpenStreetMap may be incomplete for a new area [11]. Our alert is a single time and reach, whereas recent work reviews how communication and social behaviour are modelled in agent-based evacuation [5] and implements the notification procedures of emergency services in a large-scale model [12]. The two areas differ in road density, share of people in the blast circle, stop distance and map radius at once, so we cannot attribute differences between them to one cause. We study two places and one hazard type, with the bomb at the map centre. Only the nine bomb-drill comparisons of Section VIII-B are corrected for multiple testing; all other comparisons are exploratory.</w:t>
+        <w:t xml:space="preserve">We have not calibrated or validated the model against field data. We did not time real walks, observe a drill or compare the output with another simulator, so verification only shows that the code implements the equations, not that the equations describe real people. Capacities, admission rates, reaction delays and congestion constants are assumed (Table II), and the crowd-stress results depend strongly on the path capacity (Table VI); absolute numbers should not be quoted as predictions for either place. Several simplifications matter. People do not touch each other, and a waiting person does not block the road behind, so gridlock is understated. Everybody in a run walks at the same speed, so slower walkers appear only as a lower average speed. The crowd is synthetic (250 to 400 people), the safe stops are hypothetical, the blast is a circle without shielding, and no injury is modelled. People who hear no alert stay where they are; they count as caught if they are inside the blast at the strike and otherwise as neither caught nor evacuated. OpenStreetMap may be incomplete in a new area [11]. The alert is a single time and reach per person, whereas recent work reviews how communication and social behaviour are modelled in agent-based evacuation [5] and implements the notification procedures of emergency services in a large-scale model [12]. The two areas differ at once in road density, share of people in the blast circle, stop distance and map radius, so differences between them cannot be tied to one cause. We study two places and one hazard type, with the bomb at the map centre. Only the nine bomb-drill comparisons of Section VIII-B are corrected for multiple testing; all other comparisons are exploratory.</w:t>
       </w:r>
     </w:p>
     <w:p>
@@ -16439,7 +16638,7 @@
           <w:sz w:val="20"/>
           <w:szCs w:val="20"/>
         </w:rPr>
-        <w:t xml:space="preserve">Panic Engine compares warning times, alert reach and routing rules on identical crowds. We wrote the model as equations, derived a lower bound on the people caught and a discharge time for a shared route, and checked both, with the other equations, against the simulator. On the Amrita campus and in Mangalagiri a warning longer than the longest reaction delay plus the walk out of the blast circle (about 220 s and 140 s) removed or almost removed the people caught, shorter reaction delays and faster average walking reduced them sharply, and the alert reach decided how many people moved at all. The routing rule changed the number caught by about half a point on the campus, which is not significant after correction, and by nothing measurable in Mangalagiri. It decided whether a crowd got out in time only when everybody started at one point on narrow paths or a closure sat on the shortest route; with wider paths or a spread-out crowd the differences were small. Future work includes calibration with timed walks and a drill, measured path capacities, individual walking speeds, a comparison with SUMO or MATSim on the same network, and the official assembly points.</w:t>
+        <w:t xml:space="preserve">Panic Engine lets us compare warning times, alert reach and routing rules on identical crowds. The model is written as equations, and a lower bound on the people caught and a discharge time for a shared route were checked, with the other equations, against the simulator. On the campus and in Mangalagiri, a warning longer than the longest reaction delay plus the walk out of the blast circle (about 220 s and 140 s) removed or nearly removed the people caught. Shorter reaction delays and faster average walking cut the number caught sharply, and the reach of the alert decided how many people moved at all. The routing rule changed the number caught by about half a point on the campus, which is not significant after correction, and by nothing measurable in Mangalagiri. It decided whether a crowd got out in time only when everybody started at one point on narrow paths or a closure sat on the shortest route. With wider paths or a spread-out crowd the differences were small. Next we would calibrate the model with timed walks and a drill, measure path capacities, give people individual walking speeds, compare with SUMO or MATSim on the same network, and use the official assembly points.</w:t>
       </w:r>
     </w:p>
     <w:p>
@@ -16470,37 +16669,6 @@
           <w:sz w:val="20"/>
           <w:szCs w:val="20"/>
         </w:rPr>
-        <w:t xml:space="preserve">Acknowledgment</w:t>
-      </w:r>
-    </w:p>
-    <w:p>
-      <w:pPr>
-        <w:spacing w:after="60" w:before="0" w:line="228"/>
-        <w:ind w:firstLine="245"/>
-        <w:jc w:val="both"/>
-      </w:pPr>
-      <w:r>
-        <w:rPr>
-          <w:rFonts w:ascii="Times New Roman" w:cs="Times New Roman" w:eastAsia="Times New Roman" w:hAnsi="Times New Roman"/>
-          <w:sz w:val="20"/>
-          <w:szCs w:val="20"/>
-        </w:rPr>
-        <w:t xml:space="preserve">The authors thank the OpenStreetMap contributors for the map data.</w:t>
-      </w:r>
-    </w:p>
-    <w:p>
-      <w:pPr>
-        <w:keepNext/>
-        <w:spacing w:after="60" w:before="120"/>
-        <w:jc w:val="center"/>
-      </w:pPr>
-      <w:r>
-        <w:rPr>
-          <w:rFonts w:ascii="Times New Roman" w:cs="Times New Roman" w:eastAsia="Times New Roman" w:hAnsi="Times New Roman"/>
-          <w:smallCaps/>
-          <w:sz w:val="20"/>
-          <w:szCs w:val="20"/>
-        </w:rPr>
         <w:t xml:space="preserve">References</w:t>
       </w:r>
     </w:p>
@@ -16508,180 +16676,444 @@
       <w:pPr>
         <w:spacing w:after="20" w:line="200"/>
         <w:ind w:left="300" w:hanging="300"/>
-        <w:jc w:val="both"/>
+        <w:jc w:val="left"/>
       </w:pPr>
       <w:r>
         <w:rPr>
           <w:rFonts w:ascii="Times New Roman" w:cs="Times New Roman" w:eastAsia="Times New Roman" w:hAnsi="Times New Roman"/>
+          <w:i w:val="false"/>
+          <w:iCs w:val="false"/>
           <w:sz w:val="16"/>
           <w:szCs w:val="16"/>
         </w:rPr>
-        <w:t xml:space="preserve">[1]  Y. Chen, S. Y. Shafi and Y.-f. Chen, “Simulation pipeline for traffic evacuation in urban areas and emergency traffic management policy improvements through case studies,” Transportation Research Interdisciplinary Perspectives, vol. 7, Art. no. 100210, Sep. 2020, doi: 10.1016/j.trip.2020.100210.</w:t>
+        <w:t xml:space="preserve">[1]  Y. Chen, S. Y. Shafi, and Y.-f. Chen, “Simulation pipeline for traffic evacuation in urban areas and emergency traffic management policy improvements through case studies,” </w:t>
+      </w:r>
+      <w:r>
+        <w:rPr>
+          <w:rFonts w:ascii="Times New Roman" w:cs="Times New Roman" w:eastAsia="Times New Roman" w:hAnsi="Times New Roman"/>
+          <w:i/>
+          <w:iCs/>
+          <w:sz w:val="16"/>
+          <w:szCs w:val="16"/>
+        </w:rPr>
+        <w:t xml:space="preserve">Transp. Res. Interdiscip. Perspect.</w:t>
+      </w:r>
+      <w:r>
+        <w:rPr>
+          <w:rFonts w:ascii="Times New Roman" w:cs="Times New Roman" w:eastAsia="Times New Roman" w:hAnsi="Times New Roman"/>
+          <w:i w:val="false"/>
+          <w:iCs w:val="false"/>
+          <w:sz w:val="16"/>
+          <w:szCs w:val="16"/>
+        </w:rPr>
+        <w:t xml:space="preserve">, vol. 7, Art. no. 100210, Sep. 2020, doi: 10.1016/j.trip.2020.100210.</w:t>
       </w:r>
     </w:p>
     <w:p>
       <w:pPr>
         <w:spacing w:after="20" w:line="200"/>
         <w:ind w:left="300" w:hanging="300"/>
-        <w:jc w:val="both"/>
+        <w:jc w:val="left"/>
       </w:pPr>
       <w:r>
         <w:rPr>
           <w:rFonts w:ascii="Times New Roman" w:cs="Times New Roman" w:eastAsia="Times New Roman" w:hAnsi="Times New Roman"/>
+          <w:i w:val="false"/>
+          <w:iCs w:val="false"/>
           <w:sz w:val="16"/>
           <w:szCs w:val="16"/>
         </w:rPr>
-        <w:t xml:space="preserve">[2]  D. Singh, L. Padgham and K. Nagel, “Using MATSim as a component in dynamic agent-based micro-simulations,” in Engineering Multi-Agent Systems, Lecture Notes in Computer Science. Cham, Switzerland: Springer, 2020, pp. 85–105, doi: 10.1007/978-3-030-51417-4_5.</w:t>
+        <w:t xml:space="preserve">[2]  D. Singh, L. Padgham, and K. Nagel, “Using MATSim as a component in dynamic agent-based micro-simulations,” in </w:t>
+      </w:r>
+      <w:r>
+        <w:rPr>
+          <w:rFonts w:ascii="Times New Roman" w:cs="Times New Roman" w:eastAsia="Times New Roman" w:hAnsi="Times New Roman"/>
+          <w:i/>
+          <w:iCs/>
+          <w:sz w:val="16"/>
+          <w:szCs w:val="16"/>
+        </w:rPr>
+        <w:t xml:space="preserve">Engineering Multi-Agent Systems</w:t>
+      </w:r>
+      <w:r>
+        <w:rPr>
+          <w:rFonts w:ascii="Times New Roman" w:cs="Times New Roman" w:eastAsia="Times New Roman" w:hAnsi="Times New Roman"/>
+          <w:i w:val="false"/>
+          <w:iCs w:val="false"/>
+          <w:sz w:val="16"/>
+          <w:szCs w:val="16"/>
+        </w:rPr>
+        <w:t xml:space="preserve"> (Lecture Notes in Computer Science). Cham, Switzerland: Springer, 2020, pp. 85–105, doi: 10.1007/978-3-030-51417-4_5.</w:t>
       </w:r>
     </w:p>
     <w:p>
       <w:pPr>
         <w:spacing w:after="20" w:line="200"/>
         <w:ind w:left="300" w:hanging="300"/>
-        <w:jc w:val="both"/>
+        <w:jc w:val="left"/>
       </w:pPr>
       <w:r>
         <w:rPr>
           <w:rFonts w:ascii="Times New Roman" w:cs="Times New Roman" w:eastAsia="Times New Roman" w:hAnsi="Times New Roman"/>
+          <w:i w:val="false"/>
+          <w:iCs w:val="false"/>
           <w:sz w:val="16"/>
           <w:szCs w:val="16"/>
         </w:rPr>
-        <w:t xml:space="preserve">[3]  N. Carles, K. Chapuis, J. Douvinet, M. Péroche and E. Bopp, “An agent-based model to simulate the effects of tsunami warnings on pedestrian evacuation: Sensitivity analysis and early findings,” in PRIMA 2024: Principles and Practice of Multi-Agent Systems, R. Arisaka, V. Sanchez-Anguix, S. Stein, R. Aydoğan, L. van der Torre and T. Ito, Eds., Lecture Notes in Computer Science, vol. 15395. Cham, Switzerland: Springer Nature, 2025, pp. 369–384, doi: 10.1007/978-3-031-77367-9_28.</w:t>
+        <w:t xml:space="preserve">[3]  N. Carles, K. Chapuis, J. Douvinet, M. Péroche, and E. Bopp, “An agent-based model to simulate the effects of tsunami warnings on pedestrian evacuation: Sensitivity analysis and early findings,” in </w:t>
+      </w:r>
+      <w:r>
+        <w:rPr>
+          <w:rFonts w:ascii="Times New Roman" w:cs="Times New Roman" w:eastAsia="Times New Roman" w:hAnsi="Times New Roman"/>
+          <w:i/>
+          <w:iCs/>
+          <w:sz w:val="16"/>
+          <w:szCs w:val="16"/>
+        </w:rPr>
+        <w:t xml:space="preserve">PRIMA 2024: Principles and Practice of Multi-Agent Systems</w:t>
+      </w:r>
+      <w:r>
+        <w:rPr>
+          <w:rFonts w:ascii="Times New Roman" w:cs="Times New Roman" w:eastAsia="Times New Roman" w:hAnsi="Times New Roman"/>
+          <w:i w:val="false"/>
+          <w:iCs w:val="false"/>
+          <w:sz w:val="16"/>
+          <w:szCs w:val="16"/>
+        </w:rPr>
+        <w:t xml:space="preserve"> (Lecture Notes in Computer Science, vol. 15395), R. Arisaka, V. Sanchez-Anguix, S. Stein, R. Aydoğan, L. van der Torre, and T. Ito, Eds. Cham, Switzerland: Springer Nature Switzerland, 2025, pp. 369–384, doi: 10.1007/978-3-031-77367-9_28.</w:t>
       </w:r>
     </w:p>
     <w:p>
       <w:pPr>
         <w:spacing w:after="20" w:line="200"/>
         <w:ind w:left="300" w:hanging="300"/>
-        <w:jc w:val="both"/>
+        <w:jc w:val="left"/>
       </w:pPr>
       <w:r>
         <w:rPr>
           <w:rFonts w:ascii="Times New Roman" w:cs="Times New Roman" w:eastAsia="Times New Roman" w:hAnsi="Times New Roman"/>
+          <w:i w:val="false"/>
+          <w:iCs w:val="false"/>
           <w:sz w:val="16"/>
           <w:szCs w:val="16"/>
         </w:rPr>
-        <w:t xml:space="preserve">[4]  A. Nicolas and F. H. Hassan, “Social groups in pedestrian crowds: Review of their influence on the dynamics and their modelling,” Transportmetrica A: Transport Science, vol. 19, no. 1, Art. no. 1970651, 2023, doi: 10.1080/23249935.2021.1970651.</w:t>
+        <w:t xml:space="preserve">[4]  A. Nicolas and F. H. Hassan, “Social groups in pedestrian crowds: Review of their influence on the dynamics and their modelling,” </w:t>
+      </w:r>
+      <w:r>
+        <w:rPr>
+          <w:rFonts w:ascii="Times New Roman" w:cs="Times New Roman" w:eastAsia="Times New Roman" w:hAnsi="Times New Roman"/>
+          <w:i/>
+          <w:iCs/>
+          <w:sz w:val="16"/>
+          <w:szCs w:val="16"/>
+        </w:rPr>
+        <w:t xml:space="preserve">Transportmetrica A, Transp. Sci.</w:t>
+      </w:r>
+      <w:r>
+        <w:rPr>
+          <w:rFonts w:ascii="Times New Roman" w:cs="Times New Roman" w:eastAsia="Times New Roman" w:hAnsi="Times New Roman"/>
+          <w:i w:val="false"/>
+          <w:iCs w:val="false"/>
+          <w:sz w:val="16"/>
+          <w:szCs w:val="16"/>
+        </w:rPr>
+        <w:t xml:space="preserve">, vol. 19, no. 1, Art. no. 1970651, Jan. 2023, doi: 10.1080/23249935.2021.1970651.</w:t>
       </w:r>
     </w:p>
     <w:p>
       <w:pPr>
         <w:spacing w:after="20" w:line="200"/>
         <w:ind w:left="300" w:hanging="300"/>
-        <w:jc w:val="both"/>
+        <w:jc w:val="left"/>
       </w:pPr>
       <w:r>
         <w:rPr>
           <w:rFonts w:ascii="Times New Roman" w:cs="Times New Roman" w:eastAsia="Times New Roman" w:hAnsi="Times New Roman"/>
+          <w:i w:val="false"/>
+          <w:iCs w:val="false"/>
           <w:sz w:val="16"/>
           <w:szCs w:val="16"/>
         </w:rPr>
-        <w:t xml:space="preserve">[5]  A. Templeton, H. Xie, S. Gwynne, A. Hunt, P. Thompson and G. Köster, “Agent-based models of social behaviour and communication in evacuations: A systematic review,” Safety Science, vol. 176, Art. no. 106520, Aug. 2024, doi: 10.1016/j.ssci.2024.106520.</w:t>
+        <w:t xml:space="preserve">[5]  A. Templeton, H. Xie, S. Gwynne, A. Hunt, P. Thompson, and G. Köster, “Agent-based models of social behaviour and communication in evacuations: A systematic review,” </w:t>
+      </w:r>
+      <w:r>
+        <w:rPr>
+          <w:rFonts w:ascii="Times New Roman" w:cs="Times New Roman" w:eastAsia="Times New Roman" w:hAnsi="Times New Roman"/>
+          <w:i/>
+          <w:iCs/>
+          <w:sz w:val="16"/>
+          <w:szCs w:val="16"/>
+        </w:rPr>
+        <w:t xml:space="preserve">Saf. Sci.</w:t>
+      </w:r>
+      <w:r>
+        <w:rPr>
+          <w:rFonts w:ascii="Times New Roman" w:cs="Times New Roman" w:eastAsia="Times New Roman" w:hAnsi="Times New Roman"/>
+          <w:i w:val="false"/>
+          <w:iCs w:val="false"/>
+          <w:sz w:val="16"/>
+          <w:szCs w:val="16"/>
+        </w:rPr>
+        <w:t xml:space="preserve">, vol. 176, Art. no. 106520, Aug. 2024, doi: 10.1016/j.ssci.2024.106520.</w:t>
       </w:r>
     </w:p>
     <w:p>
       <w:pPr>
         <w:spacing w:after="20" w:line="200"/>
         <w:ind w:left="300" w:hanging="300"/>
-        <w:jc w:val="both"/>
+        <w:jc w:val="left"/>
       </w:pPr>
       <w:r>
         <w:rPr>
           <w:rFonts w:ascii="Times New Roman" w:cs="Times New Roman" w:eastAsia="Times New Roman" w:hAnsi="Times New Roman"/>
+          <w:i w:val="false"/>
+          <w:iCs w:val="false"/>
           <w:sz w:val="16"/>
           <w:szCs w:val="16"/>
         </w:rPr>
-        <w:t xml:space="preserve">[6]  N. Gore, S. Arkatkar, G. Joshi and C. Antoniou, “Modified Bureau of Public Roads link function,” Transportation Research Record, vol. 2677, no. 5, pp. 966–990, 2023, doi: 10.1177/03611981221138511.</w:t>
+        <w:t xml:space="preserve">[6]  N. Gore, S. Arkatkar, G. Joshi, and C. Antoniou, “Modified Bureau of Public Roads link function,” </w:t>
+      </w:r>
+      <w:r>
+        <w:rPr>
+          <w:rFonts w:ascii="Times New Roman" w:cs="Times New Roman" w:eastAsia="Times New Roman" w:hAnsi="Times New Roman"/>
+          <w:i/>
+          <w:iCs/>
+          <w:sz w:val="16"/>
+          <w:szCs w:val="16"/>
+        </w:rPr>
+        <w:t xml:space="preserve">Transp. Res. Rec.</w:t>
+      </w:r>
+      <w:r>
+        <w:rPr>
+          <w:rFonts w:ascii="Times New Roman" w:cs="Times New Roman" w:eastAsia="Times New Roman" w:hAnsi="Times New Roman"/>
+          <w:i w:val="false"/>
+          <w:iCs w:val="false"/>
+          <w:sz w:val="16"/>
+          <w:szCs w:val="16"/>
+        </w:rPr>
+        <w:t xml:space="preserve">, vol. 2677, no. 5, pp. 966–990, May 2023, doi: 10.1177/03611981221138511.</w:t>
       </w:r>
     </w:p>
     <w:p>
       <w:pPr>
         <w:spacing w:after="20" w:line="200"/>
         <w:ind w:left="300" w:hanging="300"/>
-        <w:jc w:val="both"/>
+        <w:jc w:val="left"/>
       </w:pPr>
       <w:r>
         <w:rPr>
           <w:rFonts w:ascii="Times New Roman" w:cs="Times New Roman" w:eastAsia="Times New Roman" w:hAnsi="Times New Roman"/>
+          <w:i w:val="false"/>
+          <w:iCs w:val="false"/>
           <w:sz w:val="16"/>
           <w:szCs w:val="16"/>
         </w:rPr>
-        <w:t xml:space="preserve">[7]  V. Morandi, “Bridging the user equilibrium and the system optimum in static traffic assignment: A review,” 4OR, vol. 22, no. 1, pp. 89–119, Mar. 2024, doi: 10.1007/s10288-023-00540-w.</w:t>
+        <w:t xml:space="preserve">[7]  V. Morandi, “Bridging the user equilibrium and the system optimum in static traffic assignment: A review,” </w:t>
+      </w:r>
+      <w:r>
+        <w:rPr>
+          <w:rFonts w:ascii="Times New Roman" w:cs="Times New Roman" w:eastAsia="Times New Roman" w:hAnsi="Times New Roman"/>
+          <w:i/>
+          <w:iCs/>
+          <w:sz w:val="16"/>
+          <w:szCs w:val="16"/>
+        </w:rPr>
+        <w:t xml:space="preserve">4OR</w:t>
+      </w:r>
+      <w:r>
+        <w:rPr>
+          <w:rFonts w:ascii="Times New Roman" w:cs="Times New Roman" w:eastAsia="Times New Roman" w:hAnsi="Times New Roman"/>
+          <w:i w:val="false"/>
+          <w:iCs w:val="false"/>
+          <w:sz w:val="16"/>
+          <w:szCs w:val="16"/>
+        </w:rPr>
+        <w:t xml:space="preserve">, vol. 22, no. 1, pp. 89–119, Mar. 2024, doi: 10.1007/s10288-023-00540-w.</w:t>
       </w:r>
     </w:p>
     <w:p>
       <w:pPr>
         <w:spacing w:after="20" w:line="200"/>
         <w:ind w:left="300" w:hanging="300"/>
-        <w:jc w:val="both"/>
+        <w:jc w:val="left"/>
       </w:pPr>
       <w:r>
         <w:rPr>
           <w:rFonts w:ascii="Times New Roman" w:cs="Times New Roman" w:eastAsia="Times New Roman" w:hAnsi="Times New Roman"/>
+          <w:i w:val="false"/>
+          <w:iCs w:val="false"/>
           <w:sz w:val="16"/>
           <w:szCs w:val="16"/>
         </w:rPr>
-        <w:t xml:space="preserve">[8]  M. Thorup, “Dijkstra’s single source shortest path algorithm,” in Edsger Wybe Dijkstra: His Life, Work, and Legacy, K. R. Apt and T. Hoare, Eds. New York, NY, USA: ACM, 2022, pp. 21–26, doi: 10.1145/3544585.3544589.</w:t>
+        <w:t xml:space="preserve">[8]  M. Thorup, “Dijkstra’s single source shortest path algorithm,” in </w:t>
+      </w:r>
+      <w:r>
+        <w:rPr>
+          <w:rFonts w:ascii="Times New Roman" w:cs="Times New Roman" w:eastAsia="Times New Roman" w:hAnsi="Times New Roman"/>
+          <w:i/>
+          <w:iCs/>
+          <w:sz w:val="16"/>
+          <w:szCs w:val="16"/>
+        </w:rPr>
+        <w:t xml:space="preserve">Edsger Wybe Dijkstra: His Life, Work, and Legacy</w:t>
+      </w:r>
+      <w:r>
+        <w:rPr>
+          <w:rFonts w:ascii="Times New Roman" w:cs="Times New Roman" w:eastAsia="Times New Roman" w:hAnsi="Times New Roman"/>
+          <w:i w:val="false"/>
+          <w:iCs w:val="false"/>
+          <w:sz w:val="16"/>
+          <w:szCs w:val="16"/>
+        </w:rPr>
+        <w:t xml:space="preserve">, K. R. Apt and T. Hoare, Eds. New York, NY, USA: ACM, 2022, pp. 21–26, doi: 10.1145/3544585.3544589.</w:t>
       </w:r>
     </w:p>
     <w:p>
       <w:pPr>
         <w:spacing w:after="20" w:line="200"/>
         <w:ind w:left="300" w:hanging="300"/>
-        <w:jc w:val="both"/>
+        <w:jc w:val="left"/>
       </w:pPr>
       <w:r>
         <w:rPr>
           <w:rFonts w:ascii="Times New Roman" w:cs="Times New Roman" w:eastAsia="Times New Roman" w:hAnsi="Times New Roman"/>
+          <w:i w:val="false"/>
+          <w:iCs w:val="false"/>
           <w:sz w:val="16"/>
           <w:szCs w:val="16"/>
         </w:rPr>
-        <w:t xml:space="preserve">[9]  G. Boeing, “Modeling and analyzing urban networks and amenities with OSMnx,” Geographical Analysis, vol. 57, no. 4, pp. 567–577, Oct. 2025, doi: 10.1111/gean.70009.</w:t>
+        <w:t xml:space="preserve">[9]  G. Boeing, “Modeling and analyzing urban networks and amenities with OSMnx,” </w:t>
+      </w:r>
+      <w:r>
+        <w:rPr>
+          <w:rFonts w:ascii="Times New Roman" w:cs="Times New Roman" w:eastAsia="Times New Roman" w:hAnsi="Times New Roman"/>
+          <w:i/>
+          <w:iCs/>
+          <w:sz w:val="16"/>
+          <w:szCs w:val="16"/>
+        </w:rPr>
+        <w:t xml:space="preserve">Geogr. Anal.</w:t>
+      </w:r>
+      <w:r>
+        <w:rPr>
+          <w:rFonts w:ascii="Times New Roman" w:cs="Times New Roman" w:eastAsia="Times New Roman" w:hAnsi="Times New Roman"/>
+          <w:i w:val="false"/>
+          <w:iCs w:val="false"/>
+          <w:sz w:val="16"/>
+          <w:szCs w:val="16"/>
+        </w:rPr>
+        <w:t xml:space="preserve">, vol. 57, no. 4, pp. 567–577, Oct. 2025, doi: 10.1111/gean.70009.</w:t>
       </w:r>
     </w:p>
     <w:p>
       <w:pPr>
         <w:spacing w:after="20" w:line="200"/>
         <w:ind w:left="300" w:hanging="300"/>
-        <w:jc w:val="both"/>
+        <w:jc w:val="left"/>
       </w:pPr>
       <w:r>
         <w:rPr>
           <w:rFonts w:ascii="Times New Roman" w:cs="Times New Roman" w:eastAsia="Times New Roman" w:hAnsi="Times New Roman"/>
+          <w:i w:val="false"/>
+          <w:iCs w:val="false"/>
           <w:sz w:val="16"/>
           <w:szCs w:val="16"/>
         </w:rPr>
-        <w:t xml:space="preserve">[10]  M. Giannoulaki and Z. Christoforou, “Pedestrian walking speed analysis: A systematic review,” Sustainability, vol. 16, no. 11, Art. no. 4813, Jun. 2024, doi: 10.3390/su16114813.</w:t>
+        <w:t xml:space="preserve">[10]  M. Giannoulaki and Z. Christoforou, “Pedestrian walking speed analysis: A systematic review,” </w:t>
+      </w:r>
+      <w:r>
+        <w:rPr>
+          <w:rFonts w:ascii="Times New Roman" w:cs="Times New Roman" w:eastAsia="Times New Roman" w:hAnsi="Times New Roman"/>
+          <w:i/>
+          <w:iCs/>
+          <w:sz w:val="16"/>
+          <w:szCs w:val="16"/>
+        </w:rPr>
+        <w:t xml:space="preserve">Sustainability</w:t>
+      </w:r>
+      <w:r>
+        <w:rPr>
+          <w:rFonts w:ascii="Times New Roman" w:cs="Times New Roman" w:eastAsia="Times New Roman" w:hAnsi="Times New Roman"/>
+          <w:i w:val="false"/>
+          <w:iCs w:val="false"/>
+          <w:sz w:val="16"/>
+          <w:szCs w:val="16"/>
+        </w:rPr>
+        <w:t xml:space="preserve">, vol. 16, no. 11, Art. no. 4813, Jun. 2024, doi: 10.3390/su16114813.</w:t>
       </w:r>
     </w:p>
     <w:p>
       <w:pPr>
         <w:spacing w:after="20" w:line="200"/>
         <w:ind w:left="300" w:hanging="300"/>
-        <w:jc w:val="both"/>
+        <w:jc w:val="left"/>
       </w:pPr>
       <w:r>
         <w:rPr>
           <w:rFonts w:ascii="Times New Roman" w:cs="Times New Roman" w:eastAsia="Times New Roman" w:hAnsi="Times New Roman"/>
+          <w:i w:val="false"/>
+          <w:iCs w:val="false"/>
           <w:sz w:val="16"/>
           <w:szCs w:val="16"/>
         </w:rPr>
-        <w:t xml:space="preserve">[11]  M. Moradi, S. Roche and M. A. Mostafavi, “Exploring five indicators for the quality of OpenStreetMap road networks: A case study of Québec, Canada,” Geomatica, vol. 75, no. 4, Dec. 2021, doi: 10.1139/geomat-2021-0012.</w:t>
+        <w:t xml:space="preserve">[11]  M. Moradi, S. Roche, and M. A. Mostafavi, “Exploring five indicators for the quality of OpenStreetMap road networks: A case study of Québec, Canada,” </w:t>
+      </w:r>
+      <w:r>
+        <w:rPr>
+          <w:rFonts w:ascii="Times New Roman" w:cs="Times New Roman" w:eastAsia="Times New Roman" w:hAnsi="Times New Roman"/>
+          <w:i/>
+          <w:iCs/>
+          <w:sz w:val="16"/>
+          <w:szCs w:val="16"/>
+        </w:rPr>
+        <w:t xml:space="preserve">Geomatica</w:t>
+      </w:r>
+      <w:r>
+        <w:rPr>
+          <w:rFonts w:ascii="Times New Roman" w:cs="Times New Roman" w:eastAsia="Times New Roman" w:hAnsi="Times New Roman"/>
+          <w:i w:val="false"/>
+          <w:iCs w:val="false"/>
+          <w:sz w:val="16"/>
+          <w:szCs w:val="16"/>
+        </w:rPr>
+        <w:t xml:space="preserve">, vol. 75, no. 4, pp. 1–31, Dec. 2021, doi: 10.1139/geomat-2021-0012.</w:t>
       </w:r>
     </w:p>
     <w:p>
       <w:pPr>
         <w:spacing w:after="20" w:line="200"/>
         <w:ind w:left="300" w:hanging="300"/>
-        <w:jc w:val="both"/>
+        <w:jc w:val="left"/>
       </w:pPr>
       <w:r>
         <w:rPr>
           <w:rFonts w:ascii="Times New Roman" w:cs="Times New Roman" w:eastAsia="Times New Roman" w:hAnsi="Times New Roman"/>
+          <w:i w:val="false"/>
+          <w:iCs w:val="false"/>
           <w:sz w:val="16"/>
           <w:szCs w:val="16"/>
         </w:rPr>
-        <w:t xml:space="preserve">[12]  P. J. Lawrence, L. Filippidis, A. Veeraswamy, D. Blackshields, M. Marzoli and S. Marsella, “Implementing notification strategies in the urbanEXODUS large-scale evacuation model,” Safety Science, vol. 187, Art. no. 106854, Jul. 2025, doi: 10.1016/j.ssci.2025.106854.</w:t>
+        <w:t xml:space="preserve">[12]  P. J. Lawrence, L. Filippidis, A. Veeraswamy, D. Blackshields, M. Marzoli, and S. Marsella, “Implementing notification strategies in the urbanEXODUS large-scale evacuation model,” </w:t>
+      </w:r>
+      <w:r>
+        <w:rPr>
+          <w:rFonts w:ascii="Times New Roman" w:cs="Times New Roman" w:eastAsia="Times New Roman" w:hAnsi="Times New Roman"/>
+          <w:i/>
+          <w:iCs/>
+          <w:sz w:val="16"/>
+          <w:szCs w:val="16"/>
+        </w:rPr>
+        <w:t xml:space="preserve">Saf. Sci.</w:t>
+      </w:r>
+      <w:r>
+        <w:rPr>
+          <w:rFonts w:ascii="Times New Roman" w:cs="Times New Roman" w:eastAsia="Times New Roman" w:hAnsi="Times New Roman"/>
+          <w:i w:val="false"/>
+          <w:iCs w:val="false"/>
+          <w:sz w:val="16"/>
+          <w:szCs w:val="16"/>
+        </w:rPr>
+        <w:t xml:space="preserve">, vol. 187, Art. no. 106854, Jul. 2025, doi: 10.1016/j.ssci.2025.106854.</w:t>
       </w:r>
     </w:p>
     <w:sectPr>

</xml_diff>

<commit_message>
paper: add author Prasad Goura and per-author affiliations
Co-Authored-By: Claude Sonnet 5.5 <noreply@anthropic.com>
</commit_message>
<xml_diff>
--- a/docs/PANIC_ENGINE_paper_IEEE.docx
+++ b/docs/PANIC_ENGINE_paper_IEEE.docx
@@ -38,15 +38,18 @@
         </w:tblBorders>
       </w:tblPr>
       <w:tblGrid>
-        <w:gridCol w:w="2610"/>
-        <w:gridCol w:w="2610"/>
-        <w:gridCol w:w="2610"/>
-        <w:gridCol w:w="2610"/>
+        <w:gridCol w:w="1740"/>
+        <w:gridCol w:w="1740"/>
+        <w:gridCol w:w="1740"/>
+        <w:gridCol w:w="1740"/>
+        <w:gridCol w:w="1740"/>
+        <w:gridCol w:w="1740"/>
       </w:tblGrid>
       <w:tr>
         <w:tc>
           <w:tcPr>
-            <w:tcW w:type="dxa" w:w="2610"/>
+            <w:tcW w:type="dxa" w:w="3480"/>
+            <w:gridSpan w:val="2"/>
             <w:tcBorders>
               <w:top w:val="none" w:color="FFFFFF" w:sz="0"/>
               <w:left w:val="none" w:color="FFFFFF" w:sz="0"/>
@@ -70,21 +73,55 @@
           </w:p>
           <w:p>
             <w:pPr>
+              <w:spacing w:line="200"/>
               <w:jc w:val="center"/>
             </w:pPr>
             <w:r>
               <w:rPr>
                 <w:rFonts w:ascii="Times New Roman" w:cs="Times New Roman" w:eastAsia="Times New Roman" w:hAnsi="Times New Roman"/>
+                <w:i/>
+                <w:iCs/>
                 <w:sz w:val="17"/>
                 <w:szCs w:val="17"/>
               </w:rPr>
+              <w:t xml:space="preserve">Amrita Vishwa Vidyapeetham</w:t>
+            </w:r>
+          </w:p>
+          <w:p>
+            <w:pPr>
+              <w:spacing w:line="200"/>
+              <w:jc w:val="center"/>
+            </w:pPr>
+            <w:r>
+              <w:rPr>
+                <w:rFonts w:ascii="Times New Roman" w:cs="Times New Roman" w:eastAsia="Times New Roman" w:hAnsi="Times New Roman"/>
+                <w:i w:val="false"/>
+                <w:iCs w:val="false"/>
+                <w:sz w:val="17"/>
+                <w:szCs w:val="17"/>
+              </w:rPr>
+              <w:t xml:space="preserve">Amaravati, Andhra Pradesh, India</w:t>
+            </w:r>
+          </w:p>
+          <w:p>
+            <w:pPr>
+              <w:spacing w:line="200"/>
+              <w:jc w:val="center"/>
+            </w:pPr>
+            <w:r>
+              <w:rPr>
+                <w:rFonts w:ascii="Times New Roman" w:cs="Times New Roman" w:eastAsia="Times New Roman" w:hAnsi="Times New Roman"/>
+                <w:sz w:val="17"/>
+                <w:szCs w:val="17"/>
+              </w:rPr>
               <w:t xml:space="preserve">aasritha.dakshinyam@gmail.com</w:t>
             </w:r>
           </w:p>
         </w:tc>
         <w:tc>
           <w:tcPr>
-            <w:tcW w:type="dxa" w:w="2610"/>
+            <w:tcW w:type="dxa" w:w="3480"/>
+            <w:gridSpan w:val="2"/>
             <w:tcBorders>
               <w:top w:val="none" w:color="FFFFFF" w:sz="0"/>
               <w:left w:val="none" w:color="FFFFFF" w:sz="0"/>
@@ -108,21 +145,55 @@
           </w:p>
           <w:p>
             <w:pPr>
+              <w:spacing w:line="200"/>
               <w:jc w:val="center"/>
             </w:pPr>
             <w:r>
               <w:rPr>
                 <w:rFonts w:ascii="Times New Roman" w:cs="Times New Roman" w:eastAsia="Times New Roman" w:hAnsi="Times New Roman"/>
+                <w:i/>
+                <w:iCs/>
                 <w:sz w:val="17"/>
                 <w:szCs w:val="17"/>
               </w:rPr>
+              <w:t xml:space="preserve">Amrita Vishwa Vidyapeetham</w:t>
+            </w:r>
+          </w:p>
+          <w:p>
+            <w:pPr>
+              <w:spacing w:line="200"/>
+              <w:jc w:val="center"/>
+            </w:pPr>
+            <w:r>
+              <w:rPr>
+                <w:rFonts w:ascii="Times New Roman" w:cs="Times New Roman" w:eastAsia="Times New Roman" w:hAnsi="Times New Roman"/>
+                <w:i w:val="false"/>
+                <w:iCs w:val="false"/>
+                <w:sz w:val="17"/>
+                <w:szCs w:val="17"/>
+              </w:rPr>
+              <w:t xml:space="preserve">Amaravati, Andhra Pradesh, India</w:t>
+            </w:r>
+          </w:p>
+          <w:p>
+            <w:pPr>
+              <w:spacing w:line="200"/>
+              <w:jc w:val="center"/>
+            </w:pPr>
+            <w:r>
+              <w:rPr>
+                <w:rFonts w:ascii="Times New Roman" w:cs="Times New Roman" w:eastAsia="Times New Roman" w:hAnsi="Times New Roman"/>
+                <w:sz w:val="17"/>
+                <w:szCs w:val="17"/>
+              </w:rPr>
               <w:t xml:space="preserve">jagruthibachuwar@gmail.com</w:t>
             </w:r>
           </w:p>
         </w:tc>
         <w:tc>
           <w:tcPr>
-            <w:tcW w:type="dxa" w:w="2610"/>
+            <w:tcW w:type="dxa" w:w="3480"/>
+            <w:gridSpan w:val="2"/>
             <w:tcBorders>
               <w:top w:val="none" w:color="FFFFFF" w:sz="0"/>
               <w:left w:val="none" w:color="FFFFFF" w:sz="0"/>
@@ -146,21 +217,57 @@
           </w:p>
           <w:p>
             <w:pPr>
+              <w:spacing w:line="200"/>
               <w:jc w:val="center"/>
             </w:pPr>
             <w:r>
               <w:rPr>
                 <w:rFonts w:ascii="Times New Roman" w:cs="Times New Roman" w:eastAsia="Times New Roman" w:hAnsi="Times New Roman"/>
+                <w:i/>
+                <w:iCs/>
                 <w:sz w:val="17"/>
                 <w:szCs w:val="17"/>
               </w:rPr>
+              <w:t xml:space="preserve">Amrita Vishwa Vidyapeetham</w:t>
+            </w:r>
+          </w:p>
+          <w:p>
+            <w:pPr>
+              <w:spacing w:line="200"/>
+              <w:jc w:val="center"/>
+            </w:pPr>
+            <w:r>
+              <w:rPr>
+                <w:rFonts w:ascii="Times New Roman" w:cs="Times New Roman" w:eastAsia="Times New Roman" w:hAnsi="Times New Roman"/>
+                <w:i w:val="false"/>
+                <w:iCs w:val="false"/>
+                <w:sz w:val="17"/>
+                <w:szCs w:val="17"/>
+              </w:rPr>
+              <w:t xml:space="preserve">Amaravati, Andhra Pradesh, India</w:t>
+            </w:r>
+          </w:p>
+          <w:p>
+            <w:pPr>
+              <w:spacing w:line="200"/>
+              <w:jc w:val="center"/>
+            </w:pPr>
+            <w:r>
+              <w:rPr>
+                <w:rFonts w:ascii="Times New Roman" w:cs="Times New Roman" w:eastAsia="Times New Roman" w:hAnsi="Times New Roman"/>
+                <w:sz w:val="17"/>
+                <w:szCs w:val="17"/>
+              </w:rPr>
               <w:t xml:space="preserve">jashdev26@gmail.com</w:t>
             </w:r>
           </w:p>
         </w:tc>
-        <w:tc>
-          <w:tcPr>
-            <w:tcW w:type="dxa" w:w="2610"/>
+      </w:tr>
+      <w:tr>
+        <w:tc>
+          <w:tcPr>
+            <w:tcW w:type="dxa" w:w="5220"/>
+            <w:gridSpan w:val="3"/>
             <w:tcBorders>
               <w:top w:val="none" w:color="FFFFFF" w:sz="0"/>
               <w:left w:val="none" w:color="FFFFFF" w:sz="0"/>
@@ -184,15 +291,152 @@
           </w:p>
           <w:p>
             <w:pPr>
+              <w:spacing w:line="200"/>
               <w:jc w:val="center"/>
             </w:pPr>
             <w:r>
               <w:rPr>
                 <w:rFonts w:ascii="Times New Roman" w:cs="Times New Roman" w:eastAsia="Times New Roman" w:hAnsi="Times New Roman"/>
+                <w:i/>
+                <w:iCs/>
                 <w:sz w:val="17"/>
                 <w:szCs w:val="17"/>
               </w:rPr>
+              <w:t xml:space="preserve">Department of Computer Science and Engineering,</w:t>
+            </w:r>
+          </w:p>
+          <w:p>
+            <w:pPr>
+              <w:spacing w:line="200"/>
+              <w:jc w:val="center"/>
+            </w:pPr>
+            <w:r>
+              <w:rPr>
+                <w:rFonts w:ascii="Times New Roman" w:cs="Times New Roman" w:eastAsia="Times New Roman" w:hAnsi="Times New Roman"/>
+                <w:i w:val="false"/>
+                <w:iCs w:val="false"/>
+                <w:sz w:val="17"/>
+                <w:szCs w:val="17"/>
+              </w:rPr>
+              <w:t xml:space="preserve">School of Computing, Amrita Vishwa Vidyapeetham,</w:t>
+            </w:r>
+          </w:p>
+          <w:p>
+            <w:pPr>
+              <w:spacing w:line="200"/>
+              <w:jc w:val="center"/>
+            </w:pPr>
+            <w:r>
+              <w:rPr>
+                <w:rFonts w:ascii="Times New Roman" w:cs="Times New Roman" w:eastAsia="Times New Roman" w:hAnsi="Times New Roman"/>
+                <w:i w:val="false"/>
+                <w:iCs w:val="false"/>
+                <w:sz w:val="17"/>
+                <w:szCs w:val="17"/>
+              </w:rPr>
+              <w:t xml:space="preserve">Amaravati, Andhra Pradesh, India</w:t>
+            </w:r>
+          </w:p>
+          <w:p>
+            <w:pPr>
+              <w:spacing w:line="200"/>
+              <w:jc w:val="center"/>
+            </w:pPr>
+            <w:r>
+              <w:rPr>
+                <w:rFonts w:ascii="Times New Roman" w:cs="Times New Roman" w:eastAsia="Times New Roman" w:hAnsi="Times New Roman"/>
+                <w:sz w:val="17"/>
+                <w:szCs w:val="17"/>
+              </w:rPr>
               <w:t xml:space="preserve">g_lavanya@av.amrita.edu</w:t>
+            </w:r>
+          </w:p>
+        </w:tc>
+        <w:tc>
+          <w:tcPr>
+            <w:tcW w:type="dxa" w:w="5220"/>
+            <w:gridSpan w:val="3"/>
+            <w:tcBorders>
+              <w:top w:val="none" w:color="FFFFFF" w:sz="0"/>
+              <w:left w:val="none" w:color="FFFFFF" w:sz="0"/>
+              <w:bottom w:val="none" w:color="FFFFFF" w:sz="0"/>
+              <w:right w:val="none" w:color="FFFFFF" w:sz="0"/>
+            </w:tcBorders>
+          </w:tcPr>
+          <w:p>
+            <w:pPr>
+              <w:spacing w:line="240"/>
+              <w:jc w:val="center"/>
+            </w:pPr>
+            <w:r>
+              <w:rPr>
+                <w:rFonts w:ascii="Times New Roman" w:cs="Times New Roman" w:eastAsia="Times New Roman" w:hAnsi="Times New Roman"/>
+                <w:sz w:val="22"/>
+                <w:szCs w:val="22"/>
+              </w:rPr>
+              <w:t xml:space="preserve">Prasad Goura</w:t>
+            </w:r>
+          </w:p>
+          <w:p>
+            <w:pPr>
+              <w:spacing w:line="200"/>
+              <w:jc w:val="center"/>
+            </w:pPr>
+            <w:r>
+              <w:rPr>
+                <w:rFonts w:ascii="Times New Roman" w:cs="Times New Roman" w:eastAsia="Times New Roman" w:hAnsi="Times New Roman"/>
+                <w:i/>
+                <w:iCs/>
+                <w:sz w:val="17"/>
+                <w:szCs w:val="17"/>
+              </w:rPr>
+              <w:t xml:space="preserve">Department of Mathematics,</w:t>
+            </w:r>
+          </w:p>
+          <w:p>
+            <w:pPr>
+              <w:spacing w:line="200"/>
+              <w:jc w:val="center"/>
+            </w:pPr>
+            <w:r>
+              <w:rPr>
+                <w:rFonts w:ascii="Times New Roman" w:cs="Times New Roman" w:eastAsia="Times New Roman" w:hAnsi="Times New Roman"/>
+                <w:i w:val="false"/>
+                <w:iCs w:val="false"/>
+                <w:sz w:val="17"/>
+                <w:szCs w:val="17"/>
+              </w:rPr>
+              <w:t xml:space="preserve">School of Computing, Amrita Vishwa Vidyapeetham,</w:t>
+            </w:r>
+          </w:p>
+          <w:p>
+            <w:pPr>
+              <w:spacing w:line="200"/>
+              <w:jc w:val="center"/>
+            </w:pPr>
+            <w:r>
+              <w:rPr>
+                <w:rFonts w:ascii="Times New Roman" w:cs="Times New Roman" w:eastAsia="Times New Roman" w:hAnsi="Times New Roman"/>
+                <w:i w:val="false"/>
+                <w:iCs w:val="false"/>
+                <w:sz w:val="17"/>
+                <w:szCs w:val="17"/>
+              </w:rPr>
+              <w:t xml:space="preserve">Amaravati, Andhra Pradesh, India</w:t>
+            </w:r>
+          </w:p>
+          <w:p>
+            <w:pPr>
+              <w:spacing w:line="200"/>
+              <w:jc w:val="center"/>
+            </w:pPr>
+            <w:r>
+              <w:rPr>
+                <w:rFonts w:ascii="Times New Roman" w:cs="Times New Roman" w:eastAsia="Times New Roman" w:hAnsi="Times New Roman"/>
+                <w:sz w:val="17"/>
+                <w:szCs w:val="17"/>
+              </w:rPr>
+              <w:t xml:space="preserve">g_vmkprasad@av.amrita.edu</w:t>
             </w:r>
           </w:p>
         </w:tc>
@@ -8579,7 +8823,7 @@
       <w:r>
         <w:drawing>
           <wp:inline distT="0" distB="0" distL="0" distR="0">
-            <wp:extent cx="5667375" cy="2266950"/>
+            <wp:extent cx="5124450" cy="2047875"/>
             <wp:effectExtent t="0" r="0" b="0" l="0"/>
             <wp:docPr id="2" name="fig2" descr="Dashboard quick controls and three moments of the 3-D replay" title="fig2"/>
             <wp:cNvGraphicFramePr>
@@ -8604,7 +8848,7 @@
                   <pic:spPr bwMode="auto">
                     <a:xfrm>
                       <a:off x="0" y="0"/>
-                      <a:ext cx="5667375" cy="2266950"/>
+                      <a:ext cx="5124450" cy="2047875"/>
                     </a:xfrm>
                     <a:prstGeom prst="rect">
                       <a:avLst/>
@@ -8822,7 +9066,7 @@
                 <w:sz w:val="16"/>
                 <w:szCs w:val="16"/>
               </w:rPr>
-              <w:t xml:space="preserve">V1 ((1), (3))</w:t>
+              <w:t xml:space="preserve">V1: (1), (3)</w:t>
             </w:r>
           </w:p>
         </w:tc>
@@ -8896,7 +9140,7 @@
                 <w:sz w:val="16"/>
                 <w:szCs w:val="16"/>
               </w:rPr>
-              <w:t xml:space="preserve">V2 ((7))</w:t>
+              <w:t xml:space="preserve">V2: (7)</w:t>
             </w:r>
           </w:p>
         </w:tc>
@@ -8970,7 +9214,7 @@
                 <w:sz w:val="16"/>
                 <w:szCs w:val="16"/>
               </w:rPr>
-              <w:t xml:space="preserve">V3 ((5))</w:t>
+              <w:t xml:space="preserve">V3: (5)</w:t>
             </w:r>
           </w:p>
         </w:tc>
@@ -9044,7 +9288,7 @@
                 <w:sz w:val="16"/>
                 <w:szCs w:val="16"/>
               </w:rPr>
-              <w:t xml:space="preserve">V4 ((18))</w:t>
+              <w:t xml:space="preserve">V4: (18)</w:t>
             </w:r>
           </w:p>
         </w:tc>
@@ -9118,7 +9362,7 @@
                 <w:sz w:val="16"/>
                 <w:szCs w:val="16"/>
               </w:rPr>
-              <w:t xml:space="preserve">V5 ((19))</w:t>
+              <w:t xml:space="preserve">V5: (19)</w:t>
             </w:r>
           </w:p>
         </w:tc>
@@ -9192,7 +9436,7 @@
                 <w:sz w:val="16"/>
                 <w:szCs w:val="16"/>
               </w:rPr>
-              <w:t xml:space="preserve">V6 ((20))</w:t>
+              <w:t xml:space="preserve">V6: (20)</w:t>
             </w:r>
           </w:p>
         </w:tc>
@@ -9266,7 +9510,7 @@
                 <w:sz w:val="16"/>
                 <w:szCs w:val="16"/>
               </w:rPr>
-              <w:t xml:space="preserve">V7 ((21))</w:t>
+              <w:t xml:space="preserve">V7: (21)</w:t>
             </w:r>
           </w:p>
         </w:tc>
@@ -16607,7 +16851,7 @@
           <w:sz w:val="20"/>
           <w:szCs w:val="20"/>
         </w:rPr>
-        <w:t xml:space="preserve">We have not calibrated or validated the model against field data. We did not time real walks, observe a drill or compare the output with another simulator, so verification only shows that the code implements the equations, not that the equations describe real people. Capacities, admission rates, reaction delays and congestion constants are assumed (Table II), and the crowd-stress results depend strongly on the path capacity (Table VI); absolute numbers should not be quoted as predictions for either place. Several simplifications matter. People do not touch each other, and a waiting person does not block the road behind, so gridlock is understated. Everybody in a run walks at the same speed, so slower walkers appear only as a lower average speed. The crowd is synthetic (250 to 400 people), the safe stops are hypothetical, the blast is a circle without shielding, and no injury is modelled. People who hear no alert stay where they are; they count as caught if they are inside the blast at the strike and otherwise as neither caught nor evacuated. OpenStreetMap may be incomplete in a new area [11]. The alert is a single time and reach per person, whereas recent work reviews how communication and social behaviour are modelled in agent-based evacuation [5] and implements the notification procedures of emergency services in a large-scale model [12]. The two areas differ at once in road density, share of people in the blast circle, stop distance and map radius, so differences between them cannot be tied to one cause. We study two places and one hazard type, with the bomb at the map centre. Only the nine bomb-drill comparisons of Section VIII-B are corrected for multiple testing; all other comparisons are exploratory.</w:t>
+        <w:t xml:space="preserve">We have not calibrated or validated the model against field data. We did not time real walks, observe a drill or compare the output with another simulator, so verification only shows that the code implements the equations, not that the equations describe real people. Capacities, admission rates, reaction delays and congestion constants are assumed (Table II), and the crowd-stress results depend strongly on the path capacity (Table VI); absolute numbers should not be quoted as predictions for either place. Several simplifications matter. People do not touch each other, and a waiting person does not block the road behind, so gridlock is understated. Everybody in a run walks at the same speed, so slower walkers appear only as a lower average speed. The crowd is synthetic (250 to 400 people), the safe stops are hypothetical, the blast is a circle without shielding, and no injury is modelled. People who hear no alert stay where they are; they count as caught if they are inside the blast at the strike and otherwise as neither caught nor evacuated. OpenStreetMap may be incomplete in a new area [11]. The alert is a single time and reach per person, whereas recent work reviews how communication and social behaviour are modelled in agent-based evacuation [5] and implements the notification procedures of emergency services in a large-scale model [12]. The two areas differ at once in road density, share of people in the blast circle, stop distance and map radius, so differences between them cannot be tied to one cause. Only the nine bomb-drill comparisons of Section VIII-B are corrected for multiple testing; all other comparisons are exploratory.</w:t>
       </w:r>
     </w:p>
     <w:p>
@@ -16638,7 +16882,7 @@
           <w:sz w:val="20"/>
           <w:szCs w:val="20"/>
         </w:rPr>
-        <w:t xml:space="preserve">Panic Engine lets us compare warning times, alert reach and routing rules on identical crowds. The model is written as equations, and a lower bound on the people caught and a discharge time for a shared route were checked, with the other equations, against the simulator. On the campus and in Mangalagiri, a warning longer than the longest reaction delay plus the walk out of the blast circle (about 220 s and 140 s) removed or nearly removed the people caught. Shorter reaction delays and faster average walking cut the number caught sharply, and the reach of the alert decided how many people moved at all. The routing rule changed the number caught by about half a point on the campus, which is not significant after correction, and by nothing measurable in Mangalagiri. It decided whether a crowd got out in time only when everybody started at one point on narrow paths or a closure sat on the shortest route. With wider paths or a spread-out crowd the differences were small. Next we would calibrate the model with timed walks and a drill, measure path capacities, give people individual walking speeds, compare with SUMO or MATSim on the same network, and use the official assembly points.</w:t>
+        <w:t xml:space="preserve">Panic Engine lets us compare warning times, alert reach and routing rules on identical crowds. The model is written as equations, and a lower bound on the people caught and a discharge time for a shared route were checked, with the other equations, against the simulator. On the campus and in Mangalagiri, a warning longer than the longest reaction delay plus the walk out of the blast circle (about 220 s and 140 s) removed or nearly removed the people caught. Shorter reaction delays and faster average walking cut the number caught sharply, and the reach of the alert decided how many people moved at all. The routing rule changed the number caught by about half a point on the campus, which is not significant after correction, and by nothing measurable in Mangalagiri. It decided whether a crowd got out in time only when everybody started at one point on narrow paths or a closure sat on the shortest route. With wider paths or a spread-out crowd the differences were small. Next we would calibrate the model with timed walks and a drill, measure path capacities, and compare it with SUMO or MATSim on the same network.</w:t>
       </w:r>
     </w:p>
     <w:p>

</xml_diff>